<commit_message>
Make (b) and (d) the primary RQ1 specifications in manuscript and script
Co-Authored-By: Claude Sonnet 5.5 <noreply@anthropic.com>
Claude-Session: https://claude.ai/code/session_01TRgf3y9VxaCYQ3g7Rgi1uE
</commit_message>
<xml_diff>
--- a/revised/Manuscript_ISR_MISQ_Revised.docx
+++ b/revised/Manuscript_ISR_MISQ_Revised.docx
@@ -467,7 +467,7 @@
         <w:pStyle w:val="BodyText"/>
       </w:pPr>
       <w:r>
-        <w:t xml:space="preserve">For software that sits between users and models, drift is the widening gap between the software and its environment of upstream model versions, provider APIs, and dependencies, which is the maintenance counterpart of the continuing change that Lehman (1980) argued every system in use must undergo. Equation (2) concerns the number of errors and not their share of all user reports, and Section 4.3 therefore treats the count, adjusted for attention, as the primary object and the share as a check.</w:t>
+        <w:t xml:space="preserve">For software that sits between users and models, drift is the widening gap between the software and its environment of upstream model versions, provider APIs, and dependencies, which is the maintenance counterpart of the continuing change that Lehman (1980) argued every system in use must undergo. Equation (2) concerns the number of errors and not their share of all user reports, and Section 4.3 therefore treats the count as the primary object and compares several ways of handling the attention that inflates all issue counts after a release.</w:t>
       </w:r>
     </w:p>
     <w:p>
@@ -5241,7 +5241,7 @@
         <w:t xml:space="preserve">Error signature (RQ1).</w:t>
       </w:r>
       <w:r>
-        <w:t xml:space="preserve"> Equation (2) concerns the number of errors, so the object of interest is the weekly bug count. Its age profile is confounded by attention, because issue filing of every kind bursts right after a release. Total issues cannot simply serve as an offset or control, however, because bug reports are part of total issues: if errors truly rise with age, total issues rise too, and the age slope is pushed toward zero. For each repository we therefore fit three Poisson regressions of weekly bug counts on the weeks since release, each with a linear time trend. (a) No adjustment for issue volume, the direct counterpart of (2), which absorbs the post-release burst of attention. (b) An offset equal to the log of total weekly issues, which asks whether bug reports become a larger share of issues but is biased toward zero if errors rise. (c) The log of weekly non-bug issues (total issues minus bug reports) as a control, which captures attention and general activity without containing the outcome. Specification (c) is our primary test of H1, because it neither discards attention nor mechanically absorbs the signal; (a) and (b) bracket it. In each, the sign of the coefficient on age is the sign of </w:t>
+        <w:t xml:space="preserve"> Equation (2) concerns the number of errors, so the object of interest is the weekly bug count. Its age profile is confounded by attention, because issue filing of every kind bursts right after a release, and each way of handling that burst has a cost. For each repository we therefore fit four Poisson regressions of weekly bug counts on the weeks since release, each with a linear time trend. (a) No adjustment for issue volume, the direct counterpart of (2), which leaves the post-release burst of attention in the age slope. (b) An offset equal to the log of total weekly issues, which asks whether bug reports become a larger share of issues; because bug reports are part of total issues, it is biased toward zero if errors rise. (c) The log of weekly non-bug issues as a control, which does not contain the outcome but is a noisy proxy for attention and may leave part of the burst in the age slope. (d) Specification (c) plus indicators for ages of one to three weeks, which absorb the burst flexibly so that the age slope is identified from later weeks. We checked the four specifications on synthetic panels in which bug reports rise with age at a known rate and a release-week burst raises all issue counts (code in the replication package). Specifications (b) and (d) detected the planted rise, in attenuated form, whereas (a) and (c) did not, because the leftover burst biases the age slope downward. We therefore treat (b) and (d) as the primary tests of H1 and report (a) and (c) for completeness; a null result in (a) or (c) alone is not informative. In each, the sign of the coefficient on age is the sign of </w:t>
       </w:r>
       <w:r>
         <w:rPr>
@@ -5375,7 +5375,7 @@
         <w:t xml:space="preserve">τ²</w:t>
       </w:r>
       <w:r>
-        <w:t xml:space="preserve"> = 0). The estimate is precise enough to rule out, for instance, a 1 percent weekly increase in the bug rate. Eight of the 19 repository-level slopes are positive and 11 are negative. None is significantly positive at the 5 percent level and one (semantic-kernel) is significantly negative, about what chance alone would produce among 19 tests. Negative binomial estimates give a pooled slope of −0.0013 (95% CI −0.0092 to 0.0067), nearly identical to the Poisson estimate because dispersion is close to one in most repositories, so the result does not depend on the Poisson variance assumption. Because bug reports enter the offset, this specification alone cannot settle H1, and the other two follow.</w:t>
+        <w:t xml:space="preserve"> = 0). The estimate is precise enough to rule out, for instance, a 1 percent weekly increase in the bug rate. Eight of the 19 repository-level slopes are positive and 11 are negative. None is significantly positive at the 5 percent level and one (semantic-kernel) is significantly negative, about what chance alone would produce among 19 tests. Negative binomial estimates give a pooled slope of −0.0013 (95% CI −0.0092 to 0.0067), nearly identical to the Poisson estimate because dispersion is close to one in most repositories, so the result does not depend on the Poisson variance assumption. Because bug reports enter the offset, this estimate is biased toward zero if errors rise, but in our synthetic checks (Section 4.3) the bias was not large enough to hide a planted rise. It is one of the two primary tests of H1.</w:t>
       </w:r>
     </w:p>
     <w:p>
@@ -5383,7 +5383,7 @@
         <w:pStyle w:val="BodyText"/>
       </w:pPr>
       <w:r>
-        <w:t xml:space="preserve">Under specification (a), raw bug counts do fall with age. Without any adjustment for total issue volume the pooled slope is −0.032 (95% CI −0.054 to −0.010), and in Transformers, bug counts fell from 22.1 per week in the first week after a release to 11.5 after five weeks. Once we account for the total number of issues filed, however, the decline disappears. The early surge appears to be a general burst of issue-filing right after a release, driven by attention, announcements, and defects together, and not a change in the share of reports that concern bugs. In the terms of Section 3, specifications (a) and (b) show no sign of an accumulating error state.</w:t>
+        <w:t xml:space="preserve">Under specification (a), raw bug counts do fall with age. Without any adjustment for total issue volume the pooled slope is −0.032 (95% CI −0.054 to −0.010), and in Transformers, bug counts fell from 22.1 per week in the first week after a release to 11.5 after five weeks. Once we account for the total number of issues filed, however, the decline disappears. The early surge appears to be a general burst of issue-filing right after a release, driven by attention, announcements, and defects together, and not a change in the share of reports that concern bugs. In the terms of Section 3, specification (a) is uninformative about the error state because of this burst, and specification (b) shows no sign of an accumulating error state.</w:t>
       </w:r>
     </w:p>
     <w:p>
@@ -5391,16 +5391,16 @@
         <w:pStyle w:val="BodyText"/>
       </w:pPr>
       <w:r>
-        <w:t xml:space="preserve">Specification (c), which controls for the log of weekly non-bug issues instead of using an offset, is the primary test of H1. </w:t>
+        <w:t xml:space="preserve">Specification (d), which adds indicators for the first three weeks after a release to the non-bug-issue control of specification (c), is the second primary test of H1, and (c) is reported for completeness. </w:t>
       </w:r>
       <w:r>
         <w:rPr>
           <w:highlight w:val="yellow"/>
         </w:rPr>
-        <w:t xml:space="preserve">[TO BE REPORTED BEFORE SUBMISSION: pooled age slope with 95% CI, the number of positive and significantly positive repository-level slopes, and the weekly increase in the bug rate that the interval rules out.]</w:t>
-      </w:r>
-      <w:r>
-        <w:t xml:space="preserve"> H1 is supported only if this slope is positive. If it is flat or negative, as (a) and (b) are, the conclusion that there is no accumulating error state does not depend on how issue volume is handled.</w:t>
+        <w:t xml:space="preserve">[TO BE REPORTED BEFORE SUBMISSION: pooled age slopes with 95% CIs under specifications (c) and (d), the number of positive and significantly positive repository-level slopes under (d), and the weekly increase in the bug rate that the (d) interval rules out.]</w:t>
+      </w:r>
+      <w:r>
+        <w:t xml:space="preserve"> H1 is supported only if the slope under (b) or (d) is positive. If (d) is flat or negative, as (b) is, the conclusion that there is no accumulating error state does not depend on how issue volume is handled.</w:t>
       </w:r>
     </w:p>
     <w:p>
@@ -5786,7 +5786,7 @@
         <w:t xml:space="preserve">Identification and power.</w:t>
       </w:r>
       <w:r>
-        <w:t xml:space="preserve"> Age, calendar time, and project growth move together, and we report results with and without a time trend. Controls for issue volume are also delicate, because total issues contain the outcome; this is why Section 4.3 reports three specifications, and the choice among them matters for what a null result means. Several repository-level intervals are wide, and the absence of a significant result is not evidence of absence. We therefore say that the evidence does not support the hypotheses, give interval estimates, and avoid claiming that the effects are zero.</w:t>
+        <w:t xml:space="preserve"> Age, calendar time, and project growth move together, and we report results with and without a time trend. Controls for issue volume are also delicate, because total issues contain the outcome; this is why Section 4.3 reports four specifications, and the choice among them matters for what a null result means. Several repository-level intervals are wide, and the absence of a significant result is not evidence of absence. We therefore say that the evidence does not support the hypotheses, give interval estimates, and avoid claiming that the effects are zero.</w:t>
       </w:r>
     </w:p>
     <w:p>

</xml_diff>

<commit_message>
Fix related-work citations: add Chen 2026 and Song 2026, drop unverified Huang 2026
Co-Authored-By: Claude Sonnet 5.5 <noreply@anthropic.com>
Claude-Session: https://claude.ai/code/session_01TRgf3y9VxaCYQ3g7Rgi1uE
</commit_message>
<xml_diff>
--- a/revised/Manuscript_ISR_MISQ_Revised.docx
+++ b/revised/Manuscript_ISR_MISQ_Revised.docx
@@ -226,7 +226,7 @@
         <w:pStyle w:val="FirstParagraph"/>
       </w:pPr>
       <w:r>
-        <w:t xml:space="preserve">The economics of open source has focused mainly on why developers contribute and how projects are organized (Lerner and Tirole 2002; von Hippel and von Krogh 2003), and less on the timing of maintenance. In software engineering, rapid-release practice has been studied extensively. Khomh et al. (2012), for example, compared Firefox versions built on shorter and traditional release cycles and found that the shorter cycles did not produce significantly more post-release bugs. Studies of industrial machine-learning practice describe maintenance burdens that traditional software does not have (Sculley et al. 2015; Amershi et al. 2019), and the concept-drift literature documents declining predictive performance when the data distribution shifts (Gama et al. 2014). For language models, performance is worse on text from after the training period (Lazaridou et al. 2021; Luu et al. 2022), and the behavior of hosted models can change substantially within a few months (Chen et al. 2024). These studies measure how performance changes. They do not ask how, or whether, maintainers respond to it, which is the question this paper takes up. Recent work in Information Systems Research has advanced our understanding of OSS release strategies (Chen et al. 2026), the differential effects of workflow automation on maintenance versus new development (Huang et al. 2026), and the impact of generative AI tools on contribution volume and coordination costs (Song et al. 2026). We complement this literature by examining whether the timing of releases responds to signals of system degradation—an aspect that remains untested even as AI systems are increasingly deployed in production.</w:t>
+        <w:t xml:space="preserve">The economics of open source has focused mainly on why developers contribute and how projects are organized (Lerner and Tirole 2002; von Hippel and von Krogh 2003), and less on the timing of maintenance. In software engineering, rapid-release practice has been studied extensively. Khomh et al. (2012), for example, compared Firefox versions built on shorter and traditional release cycles and found that the shorter cycles did not produce significantly more post-release bugs. Studies of industrial machine-learning practice describe maintenance burdens that traditional software does not have (Sculley et al. 2015; Amershi et al. 2019), and the concept-drift literature documents declining predictive performance when the data distribution shifts (Gama et al. 2014). For language models, performance is worse on text from after the training period (Lazaridou et al. 2021; Luu et al. 2022), and the behavior of hosted models can change substantially within a few months (Chen et al. 2024). These studies measure how performance changes. They do not ask how, or whether, maintainers respond to it, which is the question this paper takes up. Recent work in Information Systems Research is the closest to ours. Chen et al. (2026) study release timing in open-source projects as a strategic choice that competes with community co-creation for scarce team resources, and examine how release and co-creation decisions shape community interest. Their question is how maintainers allocate effort between releasing and engaging contributors. Ours is whether the timing of releases responds to observable signals of system degradation, which to our knowledge that work does not address. Song et al. (2026) show how generative AI coding tools change contribution and coordination in open-source projects. We complement this literature by examining whether the timing of releases responds to signals of system degradation—an aspect that remains untested even as AI systems are increasingly deployed in production.</w:t>
       </w:r>
     </w:p>
     <w:p>
@@ -7237,6 +7237,14 @@
         <w:pStyle w:val="Bibliography"/>
       </w:pPr>
       <w:r>
+        <w:t xml:space="preserve">Chen, W., Liu, X., Krishnan, V., and Zhu, K. (2026). Strategic release and co-creation: Empirical insights for managing open-source software. Information Systems Research, articles in advance. https://doi.org/10.1287/isre.2021.0601</w:t>
+      </w:r>
+    </w:p>
+    <w:p>
+      <w:pPr>
+        <w:pStyle w:val="Bibliography"/>
+      </w:pPr>
+      <w:r>
         <w:t xml:space="preserve">DerSimonian, R., and Laird, N. (1986). Meta-analysis in clinical trials. </w:t>
       </w:r>
       <w:r>
@@ -7588,6 +7596,14 @@
       </w:r>
       <w:r>
         <w:t xml:space="preserve">, 50(3), 665–690.</w:t>
+      </w:r>
+    </w:p>
+    <w:p>
+      <w:pPr>
+        <w:pStyle w:val="Bibliography"/>
+      </w:pPr>
+      <w:r>
+        <w:t xml:space="preserve">Song, F., Agarwal, A., and Wen, W. (2026). The impact of generative AI on collaborative open-source software development: Evidence from GitHub Copilot. Information Systems Research, articles in advance. https://doi.org/10.1287/isre.2024.1361</w:t>
       </w:r>
     </w:p>
     <w:p>

</xml_diff>

<commit_message>
Reframe as signal validity; add methods and placeholders for content, equivalence, heterogeneity
Co-Authored-By: Claude Sonnet 5.5 <noreply@anthropic.com>
Claude-Session: https://claude.ai/code/session_01TRgf3y9VxaCYQ3g7Rgi1uE
</commit_message>
<xml_diff>
--- a/revised/Manuscript_ISR_MISQ_Revised.docx
+++ b/revised/Manuscript_ISR_MISQ_Revised.docx
@@ -38,7 +38,7 @@
         <w:t xml:space="preserve">Keywords:</w:t>
       </w:r>
       <w:r>
-        <w:t xml:space="preserve"> open-source software; artificial intelligence; software maintenance; state-dependent adjustment; time-dependent adjustment; hazard models</w:t>
+        <w:t xml:space="preserve"> open-source software; artificial intelligence; software maintenance; state-dependent adjustment; time-dependent adjustment; hazard models; signaling theory</w:t>
       </w:r>
     </w:p>
     <w:p>
@@ -63,6 +63,14 @@
       </w:pPr>
       <w:r>
         <w:t xml:space="preserve">Economics offers two broad classes of rules for when an agent adjusts a costly choice variable. Under a state-dependent rule, the agent adjusts when the gap between the current and the desired state becomes large enough, as in menu-cost models of pricing (Sheshinski and Weiss 1977). Under a time-dependent rule, the agent adjusts on a schedule, or at a constant random rate, that does not depend on the state, as in the staggered-contract models of Taylor (1980) and Calvo (1983). Which class better describes behavior has been a central empirical question in the study of price setting (Klenow and Kryvtsov 2008; Nakamura and Steinsson 2008), because the two classes imply different speeds of response to shocks. The same question arises for AI systems. If maintainers follow state-dependent rules, degradation triggers a refresh and is corrected. If they follow time-dependent rules, a system can degrade for as long as the calendar allows. A high release frequency is routinely treated by practitioners, buyers, and regulators as evidence that a project is actively maintained and that degradation is being managed. Our results give no support to this inference in the open-source LLM tooling ecosystem. Bug reports do not accumulate with release age, whether or not we account for overall issue volume, and releases show no significant response to observable signals of degradation (bug surges or upstream model launches). Release timing instead tends to track the accumulation of merged work. Release cadence therefore looks more like a signal of development activity than of responsiveness to system deterioration—a distinction that matters for the design of monitoring and governance of deployed AI systems.</w:t>
+      </w:r>
+    </w:p>
+    <w:p>
+      <w:pPr>
+        <w:pStyle w:val="BodyText"/>
+      </w:pPr>
+      <w:r>
+        <w:t xml:space="preserve">We frame the question as one of signal validity. Release frequency is an observable signal that buyers, auditors, and regulators read as a sign of an unobservable quality, namely how responsively a system is maintained (Spence 1973; Connelly et al. 2011). A signal is informative about that quality only if it differs systematically between responsive and unresponsive maintainers. If release timing responds to degradation, cadence carries information about responsiveness. If release timing follows accumulated work or the calendar, a high cadence is as likely among unresponsive maintainers as among responsive ones, and reading it as evidence of maintenance quality is an error of inference. The distinction between state-dependent and time-dependent adjustment gives this question testable content: state dependence in errors is the condition under which cadence is a valid signal of responsiveness.</w:t>
       </w:r>
     </w:p>
     <w:p>
@@ -227,6 +235,22 @@
       </w:pPr>
       <w:r>
         <w:t xml:space="preserve">The economics of open source has focused mainly on why developers contribute and how projects are organized (Lerner and Tirole 2002; von Hippel and von Krogh 2003), and less on the timing of maintenance. In software engineering, rapid-release practice has been studied extensively. Khomh et al. (2012), for example, compared Firefox versions built on shorter and traditional release cycles and found that the shorter cycles did not produce significantly more post-release bugs. Studies of industrial machine-learning practice describe maintenance burdens that traditional software does not have (Sculley et al. 2015; Amershi et al. 2019), and the concept-drift literature documents declining predictive performance when the data distribution shifts (Gama et al. 2014). For language models, performance is worse on text from after the training period (Lazaridou et al. 2021; Luu et al. 2022), and the behavior of hosted models can change substantially within a few months (Chen et al. 2024). These studies measure how performance changes. They do not ask how, or whether, maintainers respond to it, which is the question this paper takes up. Recent work in Information Systems Research is the closest to ours. Chen et al. (2026) study release timing in open-source projects as a strategic choice that competes with community co-creation for scarce team resources, and examine how release and co-creation decisions shape community interest. Their question is how maintainers allocate effort between releasing and engaging contributors. Ours is whether the timing of releases responds to observable signals of system degradation, which to our knowledge that work does not address. Song et al. (2026) show how generative AI coding tools change contribution and coordination in open-source projects. We complement this literature by examining whether the timing of releases responds to signals of system degradation—an aspect that remains untested even as AI systems are increasingly deployed in production.</w:t>
+      </w:r>
+    </w:p>
+    <w:p>
+      <w:pPr>
+        <w:pStyle w:val="Heading3"/>
+      </w:pPr>
+      <w:r>
+        <w:t xml:space="preserve">2.4 Release cadence as a signal of maintenance quality</w:t>
+      </w:r>
+    </w:p>
+    <w:p>
+      <w:pPr>
+        <w:pStyle w:val="BodyText"/>
+      </w:pPr>
+      <w:r>
+        <w:t xml:space="preserve">Signaling theory studies how an observable action conveys information about an unobservable quality when the receiver cannot assess the quality directly (Spence 1973; Connelly et al. 2011). Two conditions make a signal informative: it must be correlated with the quality it is meant to indicate, and it must be costly enough that low-quality senders cannot mimic it. In software markets, buyers, auditors, and regulators routinely use update frequency as a signal of maintenance quality, because how responsively a maintainer deals with problems is hard to observe. For AI components the signal is relied on more heavily still, because degradation is itself hard to observe (Section 3.3). Release frequency is cheap in one important respect: an automated pipeline can publish a release every week whatever the system needs, as the documented procedures of two of our repositories show (Section 5.2). A cheap signal can be informative only if its timing is tied to the quality it is meant to indicate. We therefore test the correlation condition directly, asking whether release timing responds to accumulating errors, bug surges, or upstream shocks. The state-dependent rule of Section 3.2 is the case in which cadence is a valid signal of responsiveness, and the time-dependent rule is the case in which it is not.</w:t>
       </w:r>
     </w:p>
     <w:p>
@@ -5346,6 +5370,51 @@
     </w:p>
     <w:p>
       <w:pPr>
+        <w:pStyle w:val="BodyText"/>
+      </w:pPr>
+      <w:r>
+        <w:rPr>
+          <w:b/>
+          <w:bCs/>
+        </w:rPr>
+        <w:t xml:space="preserve">Release content (additional analysis).</w:t>
+      </w:r>
+      <w:r>
+        <w:t xml:space="preserve"> Timing and content can differ: a maintainer may ship fixes in releases that were scheduled for other reasons. We code each itemised entry of a release note as a fix if it sits under a heading that contains “fix”, “bug”, or “patch”, or if it contains a fix keyword (fix, bugfix, hotfix, regression, crash, resolve, workaround, patch). We keep releases with at least three itemised entries and regress the share of fix entries on the standardized logarithm of bug reports in the preceding four weeks, controlling for the standardized logarithm of non-bug issues over the same weeks, the logarithm of the weeks since the previous release, a linear trend, and repository fixed effects, with repository-clustered standard errors and wild cluster bootstrap p-values. The classification is by keyword, and Section 5.6 reports a hand check of a random sample.</w:t>
+      </w:r>
+    </w:p>
+    <w:p>
+      <w:pPr>
+        <w:pStyle w:val="BodyText"/>
+      </w:pPr>
+      <w:r>
+        <w:rPr>
+          <w:b/>
+          <w:bCs/>
+        </w:rPr>
+        <w:t xml:space="preserve">Equivalence tests (additional analysis).</w:t>
+      </w:r>
+      <w:r>
+        <w:t xml:space="preserve"> Because several of our results are null, for each of them we report a two one-sided test (TOST) p-value against a smallest effect of interest, the smallest bound at which equivalence would hold at the 5 percent level (the absolute estimate plus 1.645 standard errors), and the minimum detectable effect at 80 percent power (2.8 standard errors). The smallest effects of interest are a 2 percent weekly increase in the bug rate (RQ1); a log-odds of 0.25 per standard deviation of bug reports (RQ3), which is the size of the response of release timing to total issue volume that the data do detect (Section 5.3); and 5 percentage points for upstream launches, about one eighth of the pre-launch release rate. These bounds are anchored to the data and are not independent of them, which is why the smallest bound for equivalence is reported as well and readers can apply their own.</w:t>
+      </w:r>
+    </w:p>
+    <w:p>
+      <w:pPr>
+        <w:pStyle w:val="BodyText"/>
+      </w:pPr>
+      <w:r>
+        <w:rPr>
+          <w:b/>
+          <w:bCs/>
+        </w:rPr>
+        <w:t xml:space="preserve">Heterogeneity (additional analysis).</w:t>
+      </w:r>
+      <w:r>
+        <w:t xml:space="preserve"> We repeat the RQ1 and RQ3 analyses (i) excluding the two repositories whose release pipelines are automated (anthropic-sdk-python and openai-python), (ii) separately for the seven repositories with a median release cycle of one week and for the others, and (iii) by repository category where at least three repositories share a category.</w:t>
+      </w:r>
+    </w:p>
+    <w:p>
+      <w:pPr>
         <w:pStyle w:val="Heading2"/>
       </w:pPr>
       <w:r>
@@ -5646,6 +5715,71 @@
     </w:p>
     <w:p>
       <w:pPr>
+        <w:pStyle w:val="Heading3"/>
+      </w:pPr>
+      <w:r>
+        <w:t xml:space="preserve">5.6 Additional analyses: release content, equivalence, and heterogeneity</w:t>
+      </w:r>
+    </w:p>
+    <w:p>
+      <w:pPr>
+        <w:pStyle w:val="BodyText"/>
+      </w:pPr>
+      <w:r>
+        <w:rPr>
+          <w:b/>
+          <w:bCs/>
+        </w:rPr>
+        <w:t xml:space="preserve">Release content. </w:t>
+      </w:r>
+      <w:r>
+        <w:rPr>
+          <w:highlight w:val="yellow"/>
+        </w:rPr>
+        <w:t xml:space="preserve">[TO BE REPORTED BEFORE SUBMISSION: number of releases and repositories with itemised notes; coefficient of the fix share on bug reports in the preceding four weeks with standard error, cluster-robust p and wild cluster bootstrap p; result of the hand check of 12 randomly drawn items.]</w:t>
+      </w:r>
+      <w:r>
+        <w:t xml:space="preserve"> If the coefficient is positive, the content of releases responds to bug reports while their timing does not, which is the pattern of a maintainer who ships fixes when they are ready, rather than one who schedules releases around degradation. If it is zero, neither timing nor content responds.</w:t>
+      </w:r>
+    </w:p>
+    <w:p>
+      <w:pPr>
+        <w:pStyle w:val="BodyText"/>
+      </w:pPr>
+      <w:r>
+        <w:rPr>
+          <w:b/>
+          <w:bCs/>
+        </w:rPr>
+        <w:t xml:space="preserve">Equivalence. </w:t>
+      </w:r>
+      <w:r>
+        <w:rPr>
+          <w:highlight w:val="yellow"/>
+        </w:rPr>
+        <w:t xml:space="preserve">[TO BE REPORTED BEFORE SUBMISSION: table of TOST p-values, smallest bounds for equivalence, and minimum detectable effects for RQ1 (specifications b and d), RQ3 (both controls), and the launch event study.]</w:t>
+      </w:r>
+    </w:p>
+    <w:p>
+      <w:pPr>
+        <w:pStyle w:val="BodyText"/>
+      </w:pPr>
+      <w:r>
+        <w:rPr>
+          <w:b/>
+          <w:bCs/>
+        </w:rPr>
+        <w:t xml:space="preserve">Heterogeneity. </w:t>
+      </w:r>
+      <w:r>
+        <w:rPr>
+          <w:highlight w:val="yellow"/>
+        </w:rPr>
+        <w:t xml:space="preserve">[TO BE REPORTED BEFORE SUBMISSION: pooled RQ1 slopes and the RQ3 coefficient by subgroup, and whether the conclusions change when the automated-release repositories are excluded.]</w:t>
+      </w:r>
+    </w:p>
+    <w:p>
+      <w:pPr>
         <w:pStyle w:val="Heading2"/>
       </w:pPr>
       <w:r>
@@ -5665,7 +5799,7 @@
         <w:pStyle w:val="FirstParagraph"/>
       </w:pPr>
       <w:r>
-        <w:t xml:space="preserve">Releases in these repositories show no detectable relationship to the observable error state. Bug reports do not accumulate with the age of a release, releases show no significant response to surges in bug reports or to upstream model launches, and the release hazard tends to rise with the stock of merged changes. These findings suggest that the observable timing of maintenance need not form a feedback loop with system deterioration, which qualifies models that treat maintenance as a responsive control process. The evidence is consistent with release activity in this ecosystem mainly reflecting the accumulation of development work, although our intervals do not exclude modest responses to bug surges. This distinction has implications for how information systems researchers conceptualize monitoring, feedback, and control in AI-enabled systems. The repositories therefore resemble firms whose adjustment depends on an accumulating state, as in Sheshinski and Weiss (1977), but the state is accumulated work and not accumulated errors. A calendar cadence, as in Taylor (1980), cannot be excluded, because work and calendar time are correlated. Because bug reports do not build up either, these data cannot distinguish a maintainer who ignores an accumulating error state from one who has none to respond to. Both readings carry the same practical message. In this ecosystem, we find no evidence that release timing is a mechanism through which degradation, if it occurs, would be corrected.</w:t>
+        <w:t xml:space="preserve">Releases in these repositories show no detectable relationship to the observable error state. Bug reports do not accumulate with the age of a release, releases show no significant response to surges in bug reports or to upstream model launches, and the release hazard tends to rise with the stock of merged changes. These findings suggest that the observable timing of maintenance need not form a feedback loop with system deterioration, which qualifies models that treat maintenance as a responsive control process. The evidence is consistent with release activity in this ecosystem mainly reflecting the accumulation of development work, although our intervals do not exclude modest responses to bug surges. This distinction has implications for how information systems researchers conceptualize monitoring, feedback, and control in AI-enabled systems. The repositories therefore resemble firms whose adjustment depends on an accumulating state, as in Sheshinski and Weiss (1977), but the state is accumulated work and not accumulated errors. A calendar cadence, as in Taylor (1980), cannot be excluded, because work and calendar time are correlated. Because bug reports do not build up either, these data cannot distinguish a maintainer who ignores an accumulating error state from one who has none to respond to. Both readings carry the same practical message. In this ecosystem, we find no evidence that release timing is a mechanism through which degradation, if it occurs, would be corrected. In the language of signaling theory, release cadence in this ecosystem shows no sign of being a valid signal of responsiveness, because it does not covary with the condition it is read as indicating.</w:t>
       </w:r>
     </w:p>
     <w:p>
@@ -7245,6 +7379,14 @@
         <w:pStyle w:val="Bibliography"/>
       </w:pPr>
       <w:r>
+        <w:t xml:space="preserve">Connelly, B. L., Certo, S. T., Ireland, R. D., and Reutzel, C. R. (2011). Signaling theory: A review and assessment. Journal of Management, 37(1), 39–67.</w:t>
+      </w:r>
+    </w:p>
+    <w:p>
+      <w:pPr>
+        <w:pStyle w:val="Bibliography"/>
+      </w:pPr>
+      <w:r>
         <w:t xml:space="preserve">DerSimonian, R., and Laird, N. (1986). Meta-analysis in clinical trials. </w:t>
       </w:r>
       <w:r>
@@ -7604,6 +7746,14 @@
       </w:pPr>
       <w:r>
         <w:t xml:space="preserve">Song, F., Agarwal, A., and Wen, W. (2026). The impact of generative AI on collaborative open-source software development: Evidence from GitHub Copilot. Information Systems Research, articles in advance. https://doi.org/10.1287/isre.2024.1361</w:t>
+      </w:r>
+    </w:p>
+    <w:p>
+      <w:pPr>
+        <w:pStyle w:val="Bibliography"/>
+      </w:pPr>
+      <w:r>
+        <w:t xml:space="preserve">Spence, M. (1973). Job market signaling. Quarterly Journal of Economics, 87(3), 355–374.</w:t>
       </w:r>
     </w:p>
     <w:p>

</xml_diff>

<commit_message>
Update manuscript with reproducible RQ1-RQ3 estimates and revised narrative
Co-Authored-By: Claude Sonnet 5.5 <noreply@anthropic.com>
Claude-Session: https://claude.ai/code/session_01TRgf3y9VxaCYQ3g7Rgi1uE
</commit_message>
<xml_diff>
--- a/revised/Manuscript_ISR_MISQ_Revised.docx
+++ b/revised/Manuscript_ISR_MISQ_Revised.docx
@@ -23,7 +23,7 @@
         <w:pStyle w:val="FirstParagraph"/>
       </w:pPr>
       <w:r>
-        <w:t xml:space="preserve">Organizations increasingly deploy systems built on large language models and are expected to refresh them as the world drifts away from their training data, yet little is known about what triggers a refresh. Borrowing the distinction between state-dependent and time-dependent adjustment from the economics of price setting, we derive from a Poisson model of accumulating errors what each kind of refresh rule implies, and we test those implications on weekly issue, release, pull-request, and commit histories for 19 widely used open-source repositories in the LLM tooling ecosystem (3,432 repository-weeks; 2,456 releases). Bug reports do not rise with the time since the last release, whether counted in raw terms or relative to total issue volume, release probabilities show no significant response to surges in bug reports, and they show no detectable response to 38 upstream model launches. The intervals exclude large effects of release age on bug reports and of launches on release timing, but not modest responses to bug surges, so the evidence gives no support to the common reading of release frequency—a widely used signal of project health and maintenance quality—as an indicator of responsiveness to degradation. The release hazard instead tends to rise with the stock of merged changes since the last regular release, although the data cannot cleanly separate that stock from calendar time (median within-repository correlation 0.74). Releases therefore appear to follow accumulating work and not accumulating errors. For the open-source tooling layer of LLM applications, the findings suggest that release cadence should not be relied on as a monitoring signal; detecting degradation requires performance data that public repositories do not contain.</w:t>
+        <w:t xml:space="preserve">Organizations increasingly deploy systems built on large language models and are expected to refresh them as the world drifts away from their training data, yet little is known about what triggers a refresh. Release frequency is widely read as a signal of project health and responsive maintenance. Drawing on signaling theory and on the distinction between state-dependent and time-dependent adjustment in the economics of price setting, we derive from a Poisson model of accumulating errors when cadence would be a valid signal of responsiveness, and we test the implications on weekly issue, release, pull-request, and commit histories for 19 widely used open-source repositories in the LLM tooling ecosystem (3,432 repository-weeks; 2,456 releases). Bug reports show no measurable rise with the time since the last release when they are measured relative to total issues, although a modest accumulation of up to about 3.5 percent per week cannot be excluded once the post-release burst of attention is absorbed. Release probabilities rise with the volume of user issues in the preceding weeks, but we find no significant additional response to bug reports at a given volume and no detectable response to 38 upstream model launches. The release hazard also tends to rise with the stock of merged changes since the last regular release, although the data cannot cleanly separate that stock from calendar time (median within-repository correlation 0.74). Release cadence therefore reflects user activity and accumulated work more clearly than responsiveness to degradation, and it should not be read as a validated signal of it. Detecting degradation requires performance data that public repositories do not contain.</w:t>
       </w:r>
     </w:p>
     <w:p>
@@ -62,7 +62,7 @@
         <w:pStyle w:val="BodyText"/>
       </w:pPr>
       <w:r>
-        <w:t xml:space="preserve">Economics offers two broad classes of rules for when an agent adjusts a costly choice variable. Under a state-dependent rule, the agent adjusts when the gap between the current and the desired state becomes large enough, as in menu-cost models of pricing (Sheshinski and Weiss 1977). Under a time-dependent rule, the agent adjusts on a schedule, or at a constant random rate, that does not depend on the state, as in the staggered-contract models of Taylor (1980) and Calvo (1983). Which class better describes behavior has been a central empirical question in the study of price setting (Klenow and Kryvtsov 2008; Nakamura and Steinsson 2008), because the two classes imply different speeds of response to shocks. The same question arises for AI systems. If maintainers follow state-dependent rules, degradation triggers a refresh and is corrected. If they follow time-dependent rules, a system can degrade for as long as the calendar allows. A high release frequency is routinely treated by practitioners, buyers, and regulators as evidence that a project is actively maintained and that degradation is being managed. Our results give no support to this inference in the open-source LLM tooling ecosystem. Bug reports do not accumulate with release age, whether or not we account for overall issue volume, and releases show no significant response to observable signals of degradation (bug surges or upstream model launches). Release timing instead tends to track the accumulation of merged work. Release cadence therefore looks more like a signal of development activity than of responsiveness to system deterioration—a distinction that matters for the design of monitoring and governance of deployed AI systems.</w:t>
+        <w:t xml:space="preserve">Economics offers two broad classes of rules for when an agent adjusts a costly choice variable. Under a state-dependent rule, the agent adjusts when the gap between the current and the desired state becomes large enough, as in menu-cost models of pricing (Sheshinski and Weiss 1977). Under a time-dependent rule, the agent adjusts on a schedule, or at a constant random rate, that does not depend on the state, as in the staggered-contract models of Taylor (1980) and Calvo (1983). Which class better describes behavior has been a central empirical question in the study of price setting (Klenow and Kryvtsov 2008; Nakamura and Steinsson 2008), because the two classes imply different speeds of response to shocks. The same question arises for AI systems. If maintainers follow state-dependent rules, degradation triggers a refresh and is corrected. If they follow time-dependent rules, a system can degrade for as long as the calendar allows. A high release frequency is routinely treated by practitioners, buyers, and regulators as evidence that a project is actively maintained and that degradation is being managed. Our results give no support to this inference in the open-source LLM tooling ecosystem. Bug reports show no measurable rise with release age relative to total issues, releases respond to the volume of user issues but not distinguishably to bug reports as such, and they show no detectable response to upstream model launches. Release timing also tends to track the accumulation of merged work. Release cadence therefore looks more like a signal of user activity and development activity than of responsiveness to system deterioration—a distinction that matters for the design of monitoring and governance of deployed AI systems.</w:t>
       </w:r>
     </w:p>
     <w:p>
@@ -146,7 +146,7 @@
         <w:pStyle w:val="BodyText"/>
       </w:pPr>
       <w:r>
-        <w:t xml:space="preserve">The answer to RQ1 is no. Bug reports do not rise with the age of a release, either in raw counts or relative to total issue volume, and the pooled estimate relative to issue volume is precise enough to rule out a 1 percent weekly increase. The answer to RQ3 is also no, with a qualification: releases show no significant response to surges in bug reports (although the data cannot rule out a modest one) and no detectable response to 38 upstream model launches, although release notes often mention a new model after its launch, which suggests that the content of releases responds while their timing does not. The answer to RQ2 is that the age profile of the release hazard is not what a response to errors would produce. Only one repository (vLLM) has a hazard that rises significantly with age, the pooled slope is not distinguishable from zero, and the raw hazard is highest in the week after a release, when hot-fixes are issued. The answer to RQ4 is that the release hazard tends to rise with the stock of merged changes. When work age and calendar age are entered together, the pooled coefficient on work age is positive and that on calendar age is not, but the two are correlated (0.74), and a linear model with repository fixed effects and a wild cluster bootstrap gives p = 0.09 for work age and p = 0.18 for calendar age, so we read the result as suggestive. Release timing in this ecosystem therefore looks driven by accumulating work, not by accumulating errors and not clearly by the calendar. The price literature has met a similar pattern in raw hazards. Pooling units that adjust at different frequencies yields a declining hazard even when each one’s own hazard is flat (Heckman and Singer 1984), and temporary price changes such as sales dominate raw adjustment frequencies (Nakamura and Steinsson 2008). Hot-fixes play the role of sales in our data.</w:t>
+        <w:t xml:space="preserve">The answer to RQ1 is that bug reports do not rise measurably with the age of a release. The pooled slope is close to zero when bug reports are measured relative to total issues (−0.004 per week; 95% CI −0.017 to 0.009), but once the post-release burst of attention is absorbed the interval allows an accumulation of up to about 3.5 percent per week (+0.016; −0.003 to 0.035), so we read the result as weak evidence against an accumulating error state and not as proof of its absence. The answer to RQ3 is that release probabilities respond to the volume of user issues but not distinguishably to bug reports as such. With non-bug issues held fixed, one standard deviation more bug reports in the previous week raises the log-odds of a release by 0.26 (wild cluster bootstrap p = 0.01), a response of about the same size as that to non-bug issues (0.22), and the additional response to bug reports at a given total volume is positive but not significant (0.19; wild cluster bootstrap p = 0.20). Releases show no detectable response to 38 upstream model launches, although release notes often mention a new model after its launch, which suggests that the content of releases responds while their timing does not. The answer to RQ2 is that the age profile of the release hazard is not what a response to errors would produce. Only one repository (vLLM) has a hazard that rises significantly with age, the pooled slope is not distinguishable from zero (−0.09; 95% CI −0.21 to 0.03), and the raw hazard is highest in the week after a release, when hot-fixes are issued. The answer to RQ4 is that the release hazard tends to rise with the stock of merged changes. When work age and calendar age are entered together, the pooled coefficient on work age is positive and that on calendar age is not, but the two are correlated (0.74), and a linear model with repository fixed effects and a wild cluster bootstrap gives p = 0.09 for work age and p = 0.18 for calendar age, so we read the result as suggestive. Release timing in this ecosystem therefore looks driven by user activity and accumulating work, with no clear sign of accumulating errors and no clear role for the calendar. The price literature has met a similar pattern in raw hazards. Pooling units that adjust at different frequencies yields a declining hazard even when each one’s own hazard is flat (Heckman and Singer 1984), and temporary price changes such as sales dominate raw adjustment frequencies (Nakamura and Steinsson 2008). Hot-fixes play the role of sales in our data.</w:t>
       </w:r>
     </w:p>
     <w:p>
@@ -154,7 +154,7 @@
         <w:pStyle w:val="BodyText"/>
       </w:pPr>
       <w:r>
-        <w:t xml:space="preserve">The paper makes four contributions. First, it brings the distinction between state-dependent and time-dependent adjustment to the maintenance of AI software and derives, from a simple Poisson model of accumulating errors, what each class of rule implies for observable data (Section 3). Second, it connects that distinction to the information systems literature on maintenance, which describes what maintenance consists of and what drives its cost but has not tested whether the timing of maintenance responds to measured deterioration (Section 2.2). Third, it provides evidence from 19 repositories that releases show no detectable relationship to accumulating errors, that they show no significant response to bug surges or detectable response to upstream launches, and that they tend to follow accumulating work (Section 5). Fourth, it draws out implications for the design of monitoring and governance of deployed AI. Release cadence is not by itself evidence that degradation is being managed, and detecting degradation requires data that public repositories do not contain (Section 6). A replication package accompanies the paper.</w:t>
+        <w:t xml:space="preserve">The paper makes four contributions. First, it brings the distinction between state-dependent and time-dependent adjustment to the maintenance of AI software and derives, from a simple Poisson model of accumulating errors, what each class of rule implies for observable data (Section 3). Second, it connects that distinction to the information systems literature on maintenance, which describes what maintenance consists of and what drives its cost but has not tested whether the timing of maintenance responds to measured deterioration (Section 2.2). Third, it provides evidence from 19 repositories that releases show no clear relationship to accumulating errors, that they respond to the volume of user issues but not distinguishably to bug reports as such or to upstream launches, and that they tend to follow accumulating work (Section 5). Fourth, it draws out implications for the design of monitoring and governance of deployed AI. Release cadence is not by itself evidence that degradation is being managed, and detecting degradation requires data that public repositories do not contain (Section 6). A replication package accompanies the paper.</w:t>
       </w:r>
     </w:p>
     <w:p>
@@ -898,7 +898,7 @@
         <w:t xml:space="preserve">H4 (signal response).</w:t>
       </w:r>
       <w:r>
-        <w:t xml:space="preserve"> Within a repository, the probability of a release rises after a signal of degradation: a recent surge in bug reports (controlling for total issue volume and the age of the release) or the launch of an upstream model to which the repository is exposed. Under state dependence in errors or in the environment, maintainers respond to the signal; under time dependence they do not.</w:t>
+        <w:t xml:space="preserve"> Within a repository, the probability of a release rises after a signal of degradation: a recent surge in bug reports (controlling for the age of the release and for either total or non-bug issue volume, which separates a response to defects from a response to user activity in general) or the launch of an upstream model to which the repository is exposed. Under state dependence in errors or in the environment, maintainers respond to the signal; under time dependence they do not.</w:t>
       </w:r>
     </w:p>
     <w:p>
@@ -1276,7 +1276,7 @@
                 <w:szCs w:val="20"/>
                 <w:lang w:val="en-US" w:eastAsia="en-US" w:bidi="ar-SA"/>
               </w:rPr>
-              <w:t>Bug log-rate slope (SE)</w:t>
+              <w:t>Bug log-rate slope, specification (b) (SE)</w:t>
             </w:r>
           </w:p>
         </w:tc>
@@ -1483,41 +1483,41 @@
                 <w:szCs w:val="20"/>
                 <w:lang w:val="en-US" w:eastAsia="en-US" w:bidi="ar-SA"/>
               </w:rPr>
-              <w:t>−0.005 (0.083)</w:t>
-            </w:r>
-          </w:p>
-        </w:tc>
-        <w:tc>
-          <w:tcPr>
-            <w:tcW w:w="1504" w:type="dxa"/>
-            <w:tcBorders>
-              <w:top w:val="single" w:sz="4" w:space="0" w:color="BBBBBB"/>
-              <w:bottom w:val="single" w:sz="4" w:space="0" w:color="BBBBBB"/>
-            </w:tcBorders>
-          </w:tcPr>
-          <w:p>
-            <w:pPr>
-              <w:pStyle w:val="Compact"/>
-              <w:widowControl/>
-              <w:spacing w:before="20" w:after="20"/>
-              <w:jc w:val="left"/>
-              <w:rPr>
-                <w:rFonts w:ascii="Times New Roman" w:hAnsi="Times New Roman" w:eastAsia="Times New Roman" w:cs="Times New Roman"/>
-                <w:kern w:val="0"/>
-                <w:sz w:val="20"/>
-                <w:szCs w:val="20"/>
-                <w:lang w:val="en-US" w:eastAsia="en-US" w:bidi="ar-SA"/>
-              </w:rPr>
-            </w:pPr>
-            <w:r>
-              <w:rPr>
-                <w:rFonts w:eastAsia="Times New Roman" w:cs="Times New Roman"/>
-                <w:kern w:val="0"/>
-                <w:sz w:val="20"/>
-                <w:szCs w:val="20"/>
-                <w:lang w:val="en-US" w:eastAsia="en-US" w:bidi="ar-SA"/>
-              </w:rPr>
-              <w:t>−0.255 (0.098)</w:t>
+              <w:t>−0.023 (0.080)</w:t>
+            </w:r>
+          </w:p>
+        </w:tc>
+        <w:tc>
+          <w:tcPr>
+            <w:tcW w:w="1504" w:type="dxa"/>
+            <w:tcBorders>
+              <w:top w:val="single" w:sz="4" w:space="0" w:color="BBBBBB"/>
+              <w:bottom w:val="single" w:sz="4" w:space="0" w:color="BBBBBB"/>
+            </w:tcBorders>
+          </w:tcPr>
+          <w:p>
+            <w:pPr>
+              <w:pStyle w:val="Compact"/>
+              <w:widowControl/>
+              <w:spacing w:before="20" w:after="20"/>
+              <w:jc w:val="left"/>
+              <w:rPr>
+                <w:rFonts w:ascii="Times New Roman" w:hAnsi="Times New Roman" w:eastAsia="Times New Roman" w:cs="Times New Roman"/>
+                <w:kern w:val="0"/>
+                <w:sz w:val="20"/>
+                <w:szCs w:val="20"/>
+                <w:lang w:val="en-US" w:eastAsia="en-US" w:bidi="ar-SA"/>
+              </w:rPr>
+            </w:pPr>
+            <w:r>
+              <w:rPr>
+                <w:rFonts w:eastAsia="Times New Roman" w:cs="Times New Roman"/>
+                <w:kern w:val="0"/>
+                <w:sz w:val="20"/>
+                <w:szCs w:val="20"/>
+                <w:lang w:val="en-US" w:eastAsia="en-US" w:bidi="ar-SA"/>
+              </w:rPr>
+              <w:t>−0.255 (0.094)</w:t>
             </w:r>
           </w:p>
         </w:tc>
@@ -1690,41 +1690,41 @@
                 <w:szCs w:val="20"/>
                 <w:lang w:val="en-US" w:eastAsia="en-US" w:bidi="ar-SA"/>
               </w:rPr>
-              <w:t>−0.007 (0.011)</w:t>
-            </w:r>
-          </w:p>
-        </w:tc>
-        <w:tc>
-          <w:tcPr>
-            <w:tcW w:w="1504" w:type="dxa"/>
-            <w:tcBorders>
-              <w:top w:val="single" w:sz="4" w:space="0" w:color="BBBBBB"/>
-              <w:bottom w:val="single" w:sz="4" w:space="0" w:color="BBBBBB"/>
-            </w:tcBorders>
-          </w:tcPr>
-          <w:p>
-            <w:pPr>
-              <w:pStyle w:val="Compact"/>
-              <w:widowControl/>
-              <w:spacing w:before="20" w:after="20"/>
-              <w:jc w:val="left"/>
-              <w:rPr>
-                <w:rFonts w:ascii="Times New Roman" w:hAnsi="Times New Roman" w:eastAsia="Times New Roman" w:cs="Times New Roman"/>
-                <w:kern w:val="0"/>
-                <w:sz w:val="20"/>
-                <w:szCs w:val="20"/>
-                <w:lang w:val="en-US" w:eastAsia="en-US" w:bidi="ar-SA"/>
-              </w:rPr>
-            </w:pPr>
-            <w:r>
-              <w:rPr>
-                <w:rFonts w:eastAsia="Times New Roman" w:cs="Times New Roman"/>
-                <w:kern w:val="0"/>
-                <w:sz w:val="20"/>
-                <w:szCs w:val="20"/>
-                <w:lang w:val="en-US" w:eastAsia="en-US" w:bidi="ar-SA"/>
-              </w:rPr>
-              <w:t>−0.272 (0.063)</w:t>
+              <w:t>−0.005 (0.013)</w:t>
+            </w:r>
+          </w:p>
+        </w:tc>
+        <w:tc>
+          <w:tcPr>
+            <w:tcW w:w="1504" w:type="dxa"/>
+            <w:tcBorders>
+              <w:top w:val="single" w:sz="4" w:space="0" w:color="BBBBBB"/>
+              <w:bottom w:val="single" w:sz="4" w:space="0" w:color="BBBBBB"/>
+            </w:tcBorders>
+          </w:tcPr>
+          <w:p>
+            <w:pPr>
+              <w:pStyle w:val="Compact"/>
+              <w:widowControl/>
+              <w:spacing w:before="20" w:after="20"/>
+              <w:jc w:val="left"/>
+              <w:rPr>
+                <w:rFonts w:ascii="Times New Roman" w:hAnsi="Times New Roman" w:eastAsia="Times New Roman" w:cs="Times New Roman"/>
+                <w:kern w:val="0"/>
+                <w:sz w:val="20"/>
+                <w:szCs w:val="20"/>
+                <w:lang w:val="en-US" w:eastAsia="en-US" w:bidi="ar-SA"/>
+              </w:rPr>
+            </w:pPr>
+            <w:r>
+              <w:rPr>
+                <w:rFonts w:eastAsia="Times New Roman" w:cs="Times New Roman"/>
+                <w:kern w:val="0"/>
+                <w:sz w:val="20"/>
+                <w:szCs w:val="20"/>
+                <w:lang w:val="en-US" w:eastAsia="en-US" w:bidi="ar-SA"/>
+              </w:rPr>
+              <w:t>−0.272 (0.064)</w:t>
             </w:r>
           </w:p>
         </w:tc>
@@ -1897,41 +1897,41 @@
                 <w:szCs w:val="20"/>
                 <w:lang w:val="en-US" w:eastAsia="en-US" w:bidi="ar-SA"/>
               </w:rPr>
-              <w:t>0.010 (0.010)</w:t>
-            </w:r>
-          </w:p>
-        </w:tc>
-        <w:tc>
-          <w:tcPr>
-            <w:tcW w:w="1504" w:type="dxa"/>
-            <w:tcBorders>
-              <w:top w:val="single" w:sz="4" w:space="0" w:color="BBBBBB"/>
-              <w:bottom w:val="single" w:sz="4" w:space="0" w:color="BBBBBB"/>
-            </w:tcBorders>
-          </w:tcPr>
-          <w:p>
-            <w:pPr>
-              <w:pStyle w:val="Compact"/>
-              <w:widowControl/>
-              <w:spacing w:before="20" w:after="20"/>
-              <w:jc w:val="left"/>
-              <w:rPr>
-                <w:rFonts w:ascii="Times New Roman" w:hAnsi="Times New Roman" w:eastAsia="Times New Roman" w:cs="Times New Roman"/>
-                <w:kern w:val="0"/>
-                <w:sz w:val="20"/>
-                <w:szCs w:val="20"/>
-                <w:lang w:val="en-US" w:eastAsia="en-US" w:bidi="ar-SA"/>
-              </w:rPr>
-            </w:pPr>
-            <w:r>
-              <w:rPr>
-                <w:rFonts w:eastAsia="Times New Roman" w:cs="Times New Roman"/>
-                <w:kern w:val="0"/>
-                <w:sz w:val="20"/>
-                <w:szCs w:val="20"/>
-                <w:lang w:val="en-US" w:eastAsia="en-US" w:bidi="ar-SA"/>
-              </w:rPr>
-              <w:t>0.365 (0.205)</w:t>
+              <w:t>0.013 (0.019)</w:t>
+            </w:r>
+          </w:p>
+        </w:tc>
+        <w:tc>
+          <w:tcPr>
+            <w:tcW w:w="1504" w:type="dxa"/>
+            <w:tcBorders>
+              <w:top w:val="single" w:sz="4" w:space="0" w:color="BBBBBB"/>
+              <w:bottom w:val="single" w:sz="4" w:space="0" w:color="BBBBBB"/>
+            </w:tcBorders>
+          </w:tcPr>
+          <w:p>
+            <w:pPr>
+              <w:pStyle w:val="Compact"/>
+              <w:widowControl/>
+              <w:spacing w:before="20" w:after="20"/>
+              <w:jc w:val="left"/>
+              <w:rPr>
+                <w:rFonts w:ascii="Times New Roman" w:hAnsi="Times New Roman" w:eastAsia="Times New Roman" w:cs="Times New Roman"/>
+                <w:kern w:val="0"/>
+                <w:sz w:val="20"/>
+                <w:szCs w:val="20"/>
+                <w:lang w:val="en-US" w:eastAsia="en-US" w:bidi="ar-SA"/>
+              </w:rPr>
+            </w:pPr>
+            <w:r>
+              <w:rPr>
+                <w:rFonts w:eastAsia="Times New Roman" w:cs="Times New Roman"/>
+                <w:kern w:val="0"/>
+                <w:sz w:val="20"/>
+                <w:szCs w:val="20"/>
+                <w:lang w:val="en-US" w:eastAsia="en-US" w:bidi="ar-SA"/>
+              </w:rPr>
+              <w:t>0.365 (0.203)</w:t>
             </w:r>
           </w:p>
         </w:tc>
@@ -2104,41 +2104,41 @@
                 <w:szCs w:val="20"/>
                 <w:lang w:val="en-US" w:eastAsia="en-US" w:bidi="ar-SA"/>
               </w:rPr>
-              <w:t>0.007 (0.013)</w:t>
-            </w:r>
-          </w:p>
-        </w:tc>
-        <w:tc>
-          <w:tcPr>
-            <w:tcW w:w="1504" w:type="dxa"/>
-            <w:tcBorders>
-              <w:top w:val="single" w:sz="4" w:space="0" w:color="BBBBBB"/>
-              <w:bottom w:val="single" w:sz="4" w:space="0" w:color="BBBBBB"/>
-            </w:tcBorders>
-          </w:tcPr>
-          <w:p>
-            <w:pPr>
-              <w:pStyle w:val="Compact"/>
-              <w:widowControl/>
-              <w:spacing w:before="20" w:after="20"/>
-              <w:jc w:val="left"/>
-              <w:rPr>
-                <w:rFonts w:ascii="Times New Roman" w:hAnsi="Times New Roman" w:eastAsia="Times New Roman" w:cs="Times New Roman"/>
-                <w:kern w:val="0"/>
-                <w:sz w:val="20"/>
-                <w:szCs w:val="20"/>
-                <w:lang w:val="en-US" w:eastAsia="en-US" w:bidi="ar-SA"/>
-              </w:rPr>
-            </w:pPr>
-            <w:r>
-              <w:rPr>
-                <w:rFonts w:eastAsia="Times New Roman" w:cs="Times New Roman"/>
-                <w:kern w:val="0"/>
-                <w:sz w:val="20"/>
-                <w:szCs w:val="20"/>
-                <w:lang w:val="en-US" w:eastAsia="en-US" w:bidi="ar-SA"/>
-              </w:rPr>
-              <w:t>−0.103 (0.065)</w:t>
+              <w:t>0.008 (0.011)</w:t>
+            </w:r>
+          </w:p>
+        </w:tc>
+        <w:tc>
+          <w:tcPr>
+            <w:tcW w:w="1504" w:type="dxa"/>
+            <w:tcBorders>
+              <w:top w:val="single" w:sz="4" w:space="0" w:color="BBBBBB"/>
+              <w:bottom w:val="single" w:sz="4" w:space="0" w:color="BBBBBB"/>
+            </w:tcBorders>
+          </w:tcPr>
+          <w:p>
+            <w:pPr>
+              <w:pStyle w:val="Compact"/>
+              <w:widowControl/>
+              <w:spacing w:before="20" w:after="20"/>
+              <w:jc w:val="left"/>
+              <w:rPr>
+                <w:rFonts w:ascii="Times New Roman" w:hAnsi="Times New Roman" w:eastAsia="Times New Roman" w:cs="Times New Roman"/>
+                <w:kern w:val="0"/>
+                <w:sz w:val="20"/>
+                <w:szCs w:val="20"/>
+                <w:lang w:val="en-US" w:eastAsia="en-US" w:bidi="ar-SA"/>
+              </w:rPr>
+            </w:pPr>
+            <w:r>
+              <w:rPr>
+                <w:rFonts w:eastAsia="Times New Roman" w:cs="Times New Roman"/>
+                <w:kern w:val="0"/>
+                <w:sz w:val="20"/>
+                <w:szCs w:val="20"/>
+                <w:lang w:val="en-US" w:eastAsia="en-US" w:bidi="ar-SA"/>
+              </w:rPr>
+              <w:t>−0.103 (0.068)</w:t>
             </w:r>
           </w:p>
         </w:tc>
@@ -2311,41 +2311,41 @@
                 <w:szCs w:val="20"/>
                 <w:lang w:val="en-US" w:eastAsia="en-US" w:bidi="ar-SA"/>
               </w:rPr>
-              <w:t>−0.020 (0.021)</w:t>
-            </w:r>
-          </w:p>
-        </w:tc>
-        <w:tc>
-          <w:tcPr>
-            <w:tcW w:w="1504" w:type="dxa"/>
-            <w:tcBorders>
-              <w:top w:val="single" w:sz="4" w:space="0" w:color="BBBBBB"/>
-              <w:bottom w:val="single" w:sz="4" w:space="0" w:color="BBBBBB"/>
-            </w:tcBorders>
-          </w:tcPr>
-          <w:p>
-            <w:pPr>
-              <w:pStyle w:val="Compact"/>
-              <w:widowControl/>
-              <w:spacing w:before="20" w:after="20"/>
-              <w:jc w:val="left"/>
-              <w:rPr>
-                <w:rFonts w:ascii="Times New Roman" w:hAnsi="Times New Roman" w:eastAsia="Times New Roman" w:cs="Times New Roman"/>
-                <w:kern w:val="0"/>
-                <w:sz w:val="20"/>
-                <w:szCs w:val="20"/>
-                <w:lang w:val="en-US" w:eastAsia="en-US" w:bidi="ar-SA"/>
-              </w:rPr>
-            </w:pPr>
-            <w:r>
-              <w:rPr>
-                <w:rFonts w:eastAsia="Times New Roman" w:cs="Times New Roman"/>
-                <w:kern w:val="0"/>
-                <w:sz w:val="20"/>
-                <w:szCs w:val="20"/>
-                <w:lang w:val="en-US" w:eastAsia="en-US" w:bidi="ar-SA"/>
-              </w:rPr>
-              <w:t>−0.031 (0.102)</w:t>
+              <w:t>0.000 (0.027)</w:t>
+            </w:r>
+          </w:p>
+        </w:tc>
+        <w:tc>
+          <w:tcPr>
+            <w:tcW w:w="1504" w:type="dxa"/>
+            <w:tcBorders>
+              <w:top w:val="single" w:sz="4" w:space="0" w:color="BBBBBB"/>
+              <w:bottom w:val="single" w:sz="4" w:space="0" w:color="BBBBBB"/>
+            </w:tcBorders>
+          </w:tcPr>
+          <w:p>
+            <w:pPr>
+              <w:pStyle w:val="Compact"/>
+              <w:widowControl/>
+              <w:spacing w:before="20" w:after="20"/>
+              <w:jc w:val="left"/>
+              <w:rPr>
+                <w:rFonts w:ascii="Times New Roman" w:hAnsi="Times New Roman" w:eastAsia="Times New Roman" w:cs="Times New Roman"/>
+                <w:kern w:val="0"/>
+                <w:sz w:val="20"/>
+                <w:szCs w:val="20"/>
+                <w:lang w:val="en-US" w:eastAsia="en-US" w:bidi="ar-SA"/>
+              </w:rPr>
+            </w:pPr>
+            <w:r>
+              <w:rPr>
+                <w:rFonts w:eastAsia="Times New Roman" w:cs="Times New Roman"/>
+                <w:kern w:val="0"/>
+                <w:sz w:val="20"/>
+                <w:szCs w:val="20"/>
+                <w:lang w:val="en-US" w:eastAsia="en-US" w:bidi="ar-SA"/>
+              </w:rPr>
+              <w:t>−0.031 (0.094)</w:t>
             </w:r>
           </w:p>
         </w:tc>
@@ -2518,41 +2518,41 @@
                 <w:szCs w:val="20"/>
                 <w:lang w:val="en-US" w:eastAsia="en-US" w:bidi="ar-SA"/>
               </w:rPr>
-              <w:t>−0.007 (0.020)</w:t>
-            </w:r>
-          </w:p>
-        </w:tc>
-        <w:tc>
-          <w:tcPr>
-            <w:tcW w:w="1504" w:type="dxa"/>
-            <w:tcBorders>
-              <w:top w:val="single" w:sz="4" w:space="0" w:color="BBBBBB"/>
-              <w:bottom w:val="single" w:sz="4" w:space="0" w:color="BBBBBB"/>
-            </w:tcBorders>
-          </w:tcPr>
-          <w:p>
-            <w:pPr>
-              <w:pStyle w:val="Compact"/>
-              <w:widowControl/>
-              <w:spacing w:before="20" w:after="20"/>
-              <w:jc w:val="left"/>
-              <w:rPr>
-                <w:rFonts w:ascii="Times New Roman" w:hAnsi="Times New Roman" w:eastAsia="Times New Roman" w:cs="Times New Roman"/>
-                <w:kern w:val="0"/>
-                <w:sz w:val="20"/>
-                <w:szCs w:val="20"/>
-                <w:lang w:val="en-US" w:eastAsia="en-US" w:bidi="ar-SA"/>
-              </w:rPr>
-            </w:pPr>
-            <w:r>
-              <w:rPr>
-                <w:rFonts w:eastAsia="Times New Roman" w:cs="Times New Roman"/>
-                <w:kern w:val="0"/>
-                <w:sz w:val="20"/>
-                <w:szCs w:val="20"/>
-                <w:lang w:val="en-US" w:eastAsia="en-US" w:bidi="ar-SA"/>
-              </w:rPr>
-              <w:t>0.168 (0.132)</w:t>
+              <w:t>−0.021 (0.032)</w:t>
+            </w:r>
+          </w:p>
+        </w:tc>
+        <w:tc>
+          <w:tcPr>
+            <w:tcW w:w="1504" w:type="dxa"/>
+            <w:tcBorders>
+              <w:top w:val="single" w:sz="4" w:space="0" w:color="BBBBBB"/>
+              <w:bottom w:val="single" w:sz="4" w:space="0" w:color="BBBBBB"/>
+            </w:tcBorders>
+          </w:tcPr>
+          <w:p>
+            <w:pPr>
+              <w:pStyle w:val="Compact"/>
+              <w:widowControl/>
+              <w:spacing w:before="20" w:after="20"/>
+              <w:jc w:val="left"/>
+              <w:rPr>
+                <w:rFonts w:ascii="Times New Roman" w:hAnsi="Times New Roman" w:eastAsia="Times New Roman" w:cs="Times New Roman"/>
+                <w:kern w:val="0"/>
+                <w:sz w:val="20"/>
+                <w:szCs w:val="20"/>
+                <w:lang w:val="en-US" w:eastAsia="en-US" w:bidi="ar-SA"/>
+              </w:rPr>
+            </w:pPr>
+            <w:r>
+              <w:rPr>
+                <w:rFonts w:eastAsia="Times New Roman" w:cs="Times New Roman"/>
+                <w:kern w:val="0"/>
+                <w:sz w:val="20"/>
+                <w:szCs w:val="20"/>
+                <w:lang w:val="en-US" w:eastAsia="en-US" w:bidi="ar-SA"/>
+              </w:rPr>
+              <w:t>0.168 (0.105)</w:t>
             </w:r>
           </w:p>
         </w:tc>
@@ -2725,41 +2725,41 @@
                 <w:szCs w:val="20"/>
                 <w:lang w:val="en-US" w:eastAsia="en-US" w:bidi="ar-SA"/>
               </w:rPr>
-              <w:t>0.017 (0.015)</w:t>
-            </w:r>
-          </w:p>
-        </w:tc>
-        <w:tc>
-          <w:tcPr>
-            <w:tcW w:w="1504" w:type="dxa"/>
-            <w:tcBorders>
-              <w:top w:val="single" w:sz="4" w:space="0" w:color="BBBBBB"/>
-              <w:bottom w:val="single" w:sz="4" w:space="0" w:color="BBBBBB"/>
-            </w:tcBorders>
-          </w:tcPr>
-          <w:p>
-            <w:pPr>
-              <w:pStyle w:val="Compact"/>
-              <w:widowControl/>
-              <w:spacing w:before="20" w:after="20"/>
-              <w:jc w:val="left"/>
-              <w:rPr>
-                <w:rFonts w:ascii="Times New Roman" w:hAnsi="Times New Roman" w:eastAsia="Times New Roman" w:cs="Times New Roman"/>
-                <w:kern w:val="0"/>
-                <w:sz w:val="20"/>
-                <w:szCs w:val="20"/>
-                <w:lang w:val="en-US" w:eastAsia="en-US" w:bidi="ar-SA"/>
-              </w:rPr>
-            </w:pPr>
-            <w:r>
-              <w:rPr>
-                <w:rFonts w:eastAsia="Times New Roman" w:cs="Times New Roman"/>
-                <w:kern w:val="0"/>
-                <w:sz w:val="20"/>
-                <w:szCs w:val="20"/>
-                <w:lang w:val="en-US" w:eastAsia="en-US" w:bidi="ar-SA"/>
-              </w:rPr>
-              <w:t>0.002 (0.060)</w:t>
+              <w:t>0.004 (0.011)</w:t>
+            </w:r>
+          </w:p>
+        </w:tc>
+        <w:tc>
+          <w:tcPr>
+            <w:tcW w:w="1504" w:type="dxa"/>
+            <w:tcBorders>
+              <w:top w:val="single" w:sz="4" w:space="0" w:color="BBBBBB"/>
+              <w:bottom w:val="single" w:sz="4" w:space="0" w:color="BBBBBB"/>
+            </w:tcBorders>
+          </w:tcPr>
+          <w:p>
+            <w:pPr>
+              <w:pStyle w:val="Compact"/>
+              <w:widowControl/>
+              <w:spacing w:before="20" w:after="20"/>
+              <w:jc w:val="left"/>
+              <w:rPr>
+                <w:rFonts w:ascii="Times New Roman" w:hAnsi="Times New Roman" w:eastAsia="Times New Roman" w:cs="Times New Roman"/>
+                <w:kern w:val="0"/>
+                <w:sz w:val="20"/>
+                <w:szCs w:val="20"/>
+                <w:lang w:val="en-US" w:eastAsia="en-US" w:bidi="ar-SA"/>
+              </w:rPr>
+            </w:pPr>
+            <w:r>
+              <w:rPr>
+                <w:rFonts w:eastAsia="Times New Roman" w:cs="Times New Roman"/>
+                <w:kern w:val="0"/>
+                <w:sz w:val="20"/>
+                <w:szCs w:val="20"/>
+                <w:lang w:val="en-US" w:eastAsia="en-US" w:bidi="ar-SA"/>
+              </w:rPr>
+              <w:t>0.002 (0.064)</w:t>
             </w:r>
           </w:p>
         </w:tc>
@@ -2932,41 +2932,41 @@
                 <w:szCs w:val="20"/>
                 <w:lang w:val="en-US" w:eastAsia="en-US" w:bidi="ar-SA"/>
               </w:rPr>
-              <w:t>−0.023 (0.016)</w:t>
-            </w:r>
-          </w:p>
-        </w:tc>
-        <w:tc>
-          <w:tcPr>
-            <w:tcW w:w="1504" w:type="dxa"/>
-            <w:tcBorders>
-              <w:top w:val="single" w:sz="4" w:space="0" w:color="BBBBBB"/>
-              <w:bottom w:val="single" w:sz="4" w:space="0" w:color="BBBBBB"/>
-            </w:tcBorders>
-          </w:tcPr>
-          <w:p>
-            <w:pPr>
-              <w:pStyle w:val="Compact"/>
-              <w:widowControl/>
-              <w:spacing w:before="20" w:after="20"/>
-              <w:jc w:val="left"/>
-              <w:rPr>
-                <w:rFonts w:ascii="Times New Roman" w:hAnsi="Times New Roman" w:eastAsia="Times New Roman" w:cs="Times New Roman"/>
-                <w:kern w:val="0"/>
-                <w:sz w:val="20"/>
-                <w:szCs w:val="20"/>
-                <w:lang w:val="en-US" w:eastAsia="en-US" w:bidi="ar-SA"/>
-              </w:rPr>
-            </w:pPr>
-            <w:r>
-              <w:rPr>
-                <w:rFonts w:eastAsia="Times New Roman" w:cs="Times New Roman"/>
-                <w:kern w:val="0"/>
-                <w:sz w:val="20"/>
-                <w:szCs w:val="20"/>
-                <w:lang w:val="en-US" w:eastAsia="en-US" w:bidi="ar-SA"/>
-              </w:rPr>
-              <w:t>0.127 (0.078)</w:t>
+              <w:t>−0.016 (0.019)</w:t>
+            </w:r>
+          </w:p>
+        </w:tc>
+        <w:tc>
+          <w:tcPr>
+            <w:tcW w:w="1504" w:type="dxa"/>
+            <w:tcBorders>
+              <w:top w:val="single" w:sz="4" w:space="0" w:color="BBBBBB"/>
+              <w:bottom w:val="single" w:sz="4" w:space="0" w:color="BBBBBB"/>
+            </w:tcBorders>
+          </w:tcPr>
+          <w:p>
+            <w:pPr>
+              <w:pStyle w:val="Compact"/>
+              <w:widowControl/>
+              <w:spacing w:before="20" w:after="20"/>
+              <w:jc w:val="left"/>
+              <w:rPr>
+                <w:rFonts w:ascii="Times New Roman" w:hAnsi="Times New Roman" w:eastAsia="Times New Roman" w:cs="Times New Roman"/>
+                <w:kern w:val="0"/>
+                <w:sz w:val="20"/>
+                <w:szCs w:val="20"/>
+                <w:lang w:val="en-US" w:eastAsia="en-US" w:bidi="ar-SA"/>
+              </w:rPr>
+            </w:pPr>
+            <w:r>
+              <w:rPr>
+                <w:rFonts w:eastAsia="Times New Roman" w:cs="Times New Roman"/>
+                <w:kern w:val="0"/>
+                <w:sz w:val="20"/>
+                <w:szCs w:val="20"/>
+                <w:lang w:val="en-US" w:eastAsia="en-US" w:bidi="ar-SA"/>
+              </w:rPr>
+              <w:t>0.127 (0.082)</w:t>
             </w:r>
           </w:p>
         </w:tc>
@@ -3139,41 +3139,41 @@
                 <w:szCs w:val="20"/>
                 <w:lang w:val="en-US" w:eastAsia="en-US" w:bidi="ar-SA"/>
               </w:rPr>
-              <w:t>−0.045 (0.034)</w:t>
-            </w:r>
-          </w:p>
-        </w:tc>
-        <w:tc>
-          <w:tcPr>
-            <w:tcW w:w="1504" w:type="dxa"/>
-            <w:tcBorders>
-              <w:top w:val="single" w:sz="4" w:space="0" w:color="BBBBBB"/>
-              <w:bottom w:val="single" w:sz="4" w:space="0" w:color="BBBBBB"/>
-            </w:tcBorders>
-          </w:tcPr>
-          <w:p>
-            <w:pPr>
-              <w:pStyle w:val="Compact"/>
-              <w:widowControl/>
-              <w:spacing w:before="20" w:after="20"/>
-              <w:jc w:val="left"/>
-              <w:rPr>
-                <w:rFonts w:ascii="Times New Roman" w:hAnsi="Times New Roman" w:eastAsia="Times New Roman" w:cs="Times New Roman"/>
-                <w:kern w:val="0"/>
-                <w:sz w:val="20"/>
-                <w:szCs w:val="20"/>
-                <w:lang w:val="en-US" w:eastAsia="en-US" w:bidi="ar-SA"/>
-              </w:rPr>
-            </w:pPr>
-            <w:r>
-              <w:rPr>
-                <w:rFonts w:eastAsia="Times New Roman" w:cs="Times New Roman"/>
-                <w:kern w:val="0"/>
-                <w:sz w:val="20"/>
-                <w:szCs w:val="20"/>
-                <w:lang w:val="en-US" w:eastAsia="en-US" w:bidi="ar-SA"/>
-              </w:rPr>
-              <w:t>−0.290 (0.138)</w:t>
+              <w:t>−0.094 (0.036)</w:t>
+            </w:r>
+          </w:p>
+        </w:tc>
+        <w:tc>
+          <w:tcPr>
+            <w:tcW w:w="1504" w:type="dxa"/>
+            <w:tcBorders>
+              <w:top w:val="single" w:sz="4" w:space="0" w:color="BBBBBB"/>
+              <w:bottom w:val="single" w:sz="4" w:space="0" w:color="BBBBBB"/>
+            </w:tcBorders>
+          </w:tcPr>
+          <w:p>
+            <w:pPr>
+              <w:pStyle w:val="Compact"/>
+              <w:widowControl/>
+              <w:spacing w:before="20" w:after="20"/>
+              <w:jc w:val="left"/>
+              <w:rPr>
+                <w:rFonts w:ascii="Times New Roman" w:hAnsi="Times New Roman" w:eastAsia="Times New Roman" w:cs="Times New Roman"/>
+                <w:kern w:val="0"/>
+                <w:sz w:val="20"/>
+                <w:szCs w:val="20"/>
+                <w:lang w:val="en-US" w:eastAsia="en-US" w:bidi="ar-SA"/>
+              </w:rPr>
+            </w:pPr>
+            <w:r>
+              <w:rPr>
+                <w:rFonts w:eastAsia="Times New Roman" w:cs="Times New Roman"/>
+                <w:kern w:val="0"/>
+                <w:sz w:val="20"/>
+                <w:szCs w:val="20"/>
+                <w:lang w:val="en-US" w:eastAsia="en-US" w:bidi="ar-SA"/>
+              </w:rPr>
+              <w:t>−0.290 (0.135)</w:t>
             </w:r>
           </w:p>
         </w:tc>
@@ -3346,41 +3346,41 @@
                 <w:szCs w:val="20"/>
                 <w:lang w:val="en-US" w:eastAsia="en-US" w:bidi="ar-SA"/>
               </w:rPr>
-              <w:t>−0.030 (0.026)</w:t>
-            </w:r>
-          </w:p>
-        </w:tc>
-        <w:tc>
-          <w:tcPr>
-            <w:tcW w:w="1504" w:type="dxa"/>
-            <w:tcBorders>
-              <w:top w:val="single" w:sz="4" w:space="0" w:color="BBBBBB"/>
-              <w:bottom w:val="single" w:sz="4" w:space="0" w:color="BBBBBB"/>
-            </w:tcBorders>
-          </w:tcPr>
-          <w:p>
-            <w:pPr>
-              <w:pStyle w:val="Compact"/>
-              <w:widowControl/>
-              <w:spacing w:before="20" w:after="20"/>
-              <w:jc w:val="left"/>
-              <w:rPr>
-                <w:rFonts w:ascii="Times New Roman" w:hAnsi="Times New Roman" w:eastAsia="Times New Roman" w:cs="Times New Roman"/>
-                <w:kern w:val="0"/>
-                <w:sz w:val="20"/>
-                <w:szCs w:val="20"/>
-                <w:lang w:val="en-US" w:eastAsia="en-US" w:bidi="ar-SA"/>
-              </w:rPr>
-            </w:pPr>
-            <w:r>
-              <w:rPr>
-                <w:rFonts w:eastAsia="Times New Roman" w:cs="Times New Roman"/>
-                <w:kern w:val="0"/>
-                <w:sz w:val="20"/>
-                <w:szCs w:val="20"/>
-                <w:lang w:val="en-US" w:eastAsia="en-US" w:bidi="ar-SA"/>
-              </w:rPr>
-              <w:t>0.023 (0.117)</w:t>
+              <w:t>−0.048 (0.029)</w:t>
+            </w:r>
+          </w:p>
+        </w:tc>
+        <w:tc>
+          <w:tcPr>
+            <w:tcW w:w="1504" w:type="dxa"/>
+            <w:tcBorders>
+              <w:top w:val="single" w:sz="4" w:space="0" w:color="BBBBBB"/>
+              <w:bottom w:val="single" w:sz="4" w:space="0" w:color="BBBBBB"/>
+            </w:tcBorders>
+          </w:tcPr>
+          <w:p>
+            <w:pPr>
+              <w:pStyle w:val="Compact"/>
+              <w:widowControl/>
+              <w:spacing w:before="20" w:after="20"/>
+              <w:jc w:val="left"/>
+              <w:rPr>
+                <w:rFonts w:ascii="Times New Roman" w:hAnsi="Times New Roman" w:eastAsia="Times New Roman" w:cs="Times New Roman"/>
+                <w:kern w:val="0"/>
+                <w:sz w:val="20"/>
+                <w:szCs w:val="20"/>
+                <w:lang w:val="en-US" w:eastAsia="en-US" w:bidi="ar-SA"/>
+              </w:rPr>
+            </w:pPr>
+            <w:r>
+              <w:rPr>
+                <w:rFonts w:eastAsia="Times New Roman" w:cs="Times New Roman"/>
+                <w:kern w:val="0"/>
+                <w:sz w:val="20"/>
+                <w:szCs w:val="20"/>
+                <w:lang w:val="en-US" w:eastAsia="en-US" w:bidi="ar-SA"/>
+              </w:rPr>
+              <w:t>0.023 (0.120)</w:t>
             </w:r>
           </w:p>
         </w:tc>
@@ -3553,41 +3553,41 @@
                 <w:szCs w:val="20"/>
                 <w:lang w:val="en-US" w:eastAsia="en-US" w:bidi="ar-SA"/>
               </w:rPr>
-              <w:t>0.006 (0.038)</w:t>
-            </w:r>
-          </w:p>
-        </w:tc>
-        <w:tc>
-          <w:tcPr>
-            <w:tcW w:w="1504" w:type="dxa"/>
-            <w:tcBorders>
-              <w:top w:val="single" w:sz="4" w:space="0" w:color="BBBBBB"/>
-              <w:bottom w:val="single" w:sz="4" w:space="0" w:color="BBBBBB"/>
-            </w:tcBorders>
-          </w:tcPr>
-          <w:p>
-            <w:pPr>
-              <w:pStyle w:val="Compact"/>
-              <w:widowControl/>
-              <w:spacing w:before="20" w:after="20"/>
-              <w:jc w:val="left"/>
-              <w:rPr>
-                <w:rFonts w:ascii="Times New Roman" w:hAnsi="Times New Roman" w:eastAsia="Times New Roman" w:cs="Times New Roman"/>
-                <w:kern w:val="0"/>
-                <w:sz w:val="20"/>
-                <w:szCs w:val="20"/>
-                <w:lang w:val="en-US" w:eastAsia="en-US" w:bidi="ar-SA"/>
-              </w:rPr>
-            </w:pPr>
-            <w:r>
-              <w:rPr>
-                <w:rFonts w:eastAsia="Times New Roman" w:cs="Times New Roman"/>
-                <w:kern w:val="0"/>
-                <w:sz w:val="20"/>
-                <w:szCs w:val="20"/>
-                <w:lang w:val="en-US" w:eastAsia="en-US" w:bidi="ar-SA"/>
-              </w:rPr>
-              <w:t>−0.439 (1.627)</w:t>
+              <w:t>0.007 (0.052)</w:t>
+            </w:r>
+          </w:p>
+        </w:tc>
+        <w:tc>
+          <w:tcPr>
+            <w:tcW w:w="1504" w:type="dxa"/>
+            <w:tcBorders>
+              <w:top w:val="single" w:sz="4" w:space="0" w:color="BBBBBB"/>
+              <w:bottom w:val="single" w:sz="4" w:space="0" w:color="BBBBBB"/>
+            </w:tcBorders>
+          </w:tcPr>
+          <w:p>
+            <w:pPr>
+              <w:pStyle w:val="Compact"/>
+              <w:widowControl/>
+              <w:spacing w:before="20" w:after="20"/>
+              <w:jc w:val="left"/>
+              <w:rPr>
+                <w:rFonts w:ascii="Times New Roman" w:hAnsi="Times New Roman" w:eastAsia="Times New Roman" w:cs="Times New Roman"/>
+                <w:kern w:val="0"/>
+                <w:sz w:val="20"/>
+                <w:szCs w:val="20"/>
+                <w:lang w:val="en-US" w:eastAsia="en-US" w:bidi="ar-SA"/>
+              </w:rPr>
+            </w:pPr>
+            <w:r>
+              <w:rPr>
+                <w:rFonts w:eastAsia="Times New Roman" w:cs="Times New Roman"/>
+                <w:kern w:val="0"/>
+                <w:sz w:val="20"/>
+                <w:szCs w:val="20"/>
+                <w:lang w:val="en-US" w:eastAsia="en-US" w:bidi="ar-SA"/>
+              </w:rPr>
+              <w:t>−0.439 (1.084)</w:t>
             </w:r>
           </w:p>
         </w:tc>
@@ -3760,41 +3760,41 @@
                 <w:szCs w:val="20"/>
                 <w:lang w:val="en-US" w:eastAsia="en-US" w:bidi="ar-SA"/>
               </w:rPr>
-              <w:t>−0.019 (0.047)</w:t>
-            </w:r>
-          </w:p>
-        </w:tc>
-        <w:tc>
-          <w:tcPr>
-            <w:tcW w:w="1504" w:type="dxa"/>
-            <w:tcBorders>
-              <w:top w:val="single" w:sz="4" w:space="0" w:color="BBBBBB"/>
-              <w:bottom w:val="single" w:sz="4" w:space="0" w:color="BBBBBB"/>
-            </w:tcBorders>
-          </w:tcPr>
-          <w:p>
-            <w:pPr>
-              <w:pStyle w:val="Compact"/>
-              <w:widowControl/>
-              <w:spacing w:before="20" w:after="20"/>
-              <w:jc w:val="left"/>
-              <w:rPr>
-                <w:rFonts w:ascii="Times New Roman" w:hAnsi="Times New Roman" w:eastAsia="Times New Roman" w:cs="Times New Roman"/>
-                <w:kern w:val="0"/>
-                <w:sz w:val="20"/>
-                <w:szCs w:val="20"/>
-                <w:lang w:val="en-US" w:eastAsia="en-US" w:bidi="ar-SA"/>
-              </w:rPr>
-            </w:pPr>
-            <w:r>
-              <w:rPr>
-                <w:rFonts w:eastAsia="Times New Roman" w:cs="Times New Roman"/>
-                <w:kern w:val="0"/>
-                <w:sz w:val="20"/>
-                <w:szCs w:val="20"/>
-                <w:lang w:val="en-US" w:eastAsia="en-US" w:bidi="ar-SA"/>
-              </w:rPr>
-              <w:t>−0.491 (0.275)</w:t>
+              <w:t>−0.024 (0.045)</w:t>
+            </w:r>
+          </w:p>
+        </w:tc>
+        <w:tc>
+          <w:tcPr>
+            <w:tcW w:w="1504" w:type="dxa"/>
+            <w:tcBorders>
+              <w:top w:val="single" w:sz="4" w:space="0" w:color="BBBBBB"/>
+              <w:bottom w:val="single" w:sz="4" w:space="0" w:color="BBBBBB"/>
+            </w:tcBorders>
+          </w:tcPr>
+          <w:p>
+            <w:pPr>
+              <w:pStyle w:val="Compact"/>
+              <w:widowControl/>
+              <w:spacing w:before="20" w:after="20"/>
+              <w:jc w:val="left"/>
+              <w:rPr>
+                <w:rFonts w:ascii="Times New Roman" w:hAnsi="Times New Roman" w:eastAsia="Times New Roman" w:cs="Times New Roman"/>
+                <w:kern w:val="0"/>
+                <w:sz w:val="20"/>
+                <w:szCs w:val="20"/>
+                <w:lang w:val="en-US" w:eastAsia="en-US" w:bidi="ar-SA"/>
+              </w:rPr>
+            </w:pPr>
+            <w:r>
+              <w:rPr>
+                <w:rFonts w:eastAsia="Times New Roman" w:cs="Times New Roman"/>
+                <w:kern w:val="0"/>
+                <w:sz w:val="20"/>
+                <w:szCs w:val="20"/>
+                <w:lang w:val="en-US" w:eastAsia="en-US" w:bidi="ar-SA"/>
+              </w:rPr>
+              <w:t>−0.491 (0.279)</w:t>
             </w:r>
           </w:p>
         </w:tc>
@@ -3967,41 +3967,41 @@
                 <w:szCs w:val="20"/>
                 <w:lang w:val="en-US" w:eastAsia="en-US" w:bidi="ar-SA"/>
               </w:rPr>
-              <w:t>−0.151 (0.064)</w:t>
-            </w:r>
-          </w:p>
-        </w:tc>
-        <w:tc>
-          <w:tcPr>
-            <w:tcW w:w="1504" w:type="dxa"/>
-            <w:tcBorders>
-              <w:top w:val="single" w:sz="4" w:space="0" w:color="BBBBBB"/>
-              <w:bottom w:val="single" w:sz="4" w:space="0" w:color="BBBBBB"/>
-            </w:tcBorders>
-          </w:tcPr>
-          <w:p>
-            <w:pPr>
-              <w:pStyle w:val="Compact"/>
-              <w:widowControl/>
-              <w:spacing w:before="20" w:after="20"/>
-              <w:jc w:val="left"/>
-              <w:rPr>
-                <w:rFonts w:ascii="Times New Roman" w:hAnsi="Times New Roman" w:eastAsia="Times New Roman" w:cs="Times New Roman"/>
-                <w:kern w:val="0"/>
-                <w:sz w:val="20"/>
-                <w:szCs w:val="20"/>
-                <w:lang w:val="en-US" w:eastAsia="en-US" w:bidi="ar-SA"/>
-              </w:rPr>
-            </w:pPr>
-            <w:r>
-              <w:rPr>
-                <w:rFonts w:eastAsia="Times New Roman" w:cs="Times New Roman"/>
-                <w:kern w:val="0"/>
-                <w:sz w:val="20"/>
-                <w:szCs w:val="20"/>
-                <w:lang w:val="en-US" w:eastAsia="en-US" w:bidi="ar-SA"/>
-              </w:rPr>
-              <w:t>−0.333 (0.182)</w:t>
+              <w:t>−0.231 (0.064)</w:t>
+            </w:r>
+          </w:p>
+        </w:tc>
+        <w:tc>
+          <w:tcPr>
+            <w:tcW w:w="1504" w:type="dxa"/>
+            <w:tcBorders>
+              <w:top w:val="single" w:sz="4" w:space="0" w:color="BBBBBB"/>
+              <w:bottom w:val="single" w:sz="4" w:space="0" w:color="BBBBBB"/>
+            </w:tcBorders>
+          </w:tcPr>
+          <w:p>
+            <w:pPr>
+              <w:pStyle w:val="Compact"/>
+              <w:widowControl/>
+              <w:spacing w:before="20" w:after="20"/>
+              <w:jc w:val="left"/>
+              <w:rPr>
+                <w:rFonts w:ascii="Times New Roman" w:hAnsi="Times New Roman" w:eastAsia="Times New Roman" w:cs="Times New Roman"/>
+                <w:kern w:val="0"/>
+                <w:sz w:val="20"/>
+                <w:szCs w:val="20"/>
+                <w:lang w:val="en-US" w:eastAsia="en-US" w:bidi="ar-SA"/>
+              </w:rPr>
+            </w:pPr>
+            <w:r>
+              <w:rPr>
+                <w:rFonts w:eastAsia="Times New Roman" w:cs="Times New Roman"/>
+                <w:kern w:val="0"/>
+                <w:sz w:val="20"/>
+                <w:szCs w:val="20"/>
+                <w:lang w:val="en-US" w:eastAsia="en-US" w:bidi="ar-SA"/>
+              </w:rPr>
+              <w:t>−0.333 (0.158)</w:t>
             </w:r>
           </w:p>
         </w:tc>
@@ -4174,41 +4174,41 @@
                 <w:szCs w:val="20"/>
                 <w:lang w:val="en-US" w:eastAsia="en-US" w:bidi="ar-SA"/>
               </w:rPr>
-              <w:t>0.018 (0.016)</w:t>
-            </w:r>
-          </w:p>
-        </w:tc>
-        <w:tc>
-          <w:tcPr>
-            <w:tcW w:w="1504" w:type="dxa"/>
-            <w:tcBorders>
-              <w:top w:val="single" w:sz="4" w:space="0" w:color="BBBBBB"/>
-              <w:bottom w:val="single" w:sz="4" w:space="0" w:color="BBBBBB"/>
-            </w:tcBorders>
-          </w:tcPr>
-          <w:p>
-            <w:pPr>
-              <w:pStyle w:val="Compact"/>
-              <w:widowControl/>
-              <w:spacing w:before="20" w:after="20"/>
-              <w:jc w:val="left"/>
-              <w:rPr>
-                <w:rFonts w:ascii="Times New Roman" w:hAnsi="Times New Roman" w:eastAsia="Times New Roman" w:cs="Times New Roman"/>
-                <w:kern w:val="0"/>
-                <w:sz w:val="20"/>
-                <w:szCs w:val="20"/>
-                <w:lang w:val="en-US" w:eastAsia="en-US" w:bidi="ar-SA"/>
-              </w:rPr>
-            </w:pPr>
-            <w:r>
-              <w:rPr>
-                <w:rFonts w:eastAsia="Times New Roman" w:cs="Times New Roman"/>
-                <w:kern w:val="0"/>
-                <w:sz w:val="20"/>
-                <w:szCs w:val="20"/>
-                <w:lang w:val="en-US" w:eastAsia="en-US" w:bidi="ar-SA"/>
-              </w:rPr>
-              <w:t>0.224 (0.176)</w:t>
+              <w:t>0.020 (0.016)</w:t>
+            </w:r>
+          </w:p>
+        </w:tc>
+        <w:tc>
+          <w:tcPr>
+            <w:tcW w:w="1504" w:type="dxa"/>
+            <w:tcBorders>
+              <w:top w:val="single" w:sz="4" w:space="0" w:color="BBBBBB"/>
+              <w:bottom w:val="single" w:sz="4" w:space="0" w:color="BBBBBB"/>
+            </w:tcBorders>
+          </w:tcPr>
+          <w:p>
+            <w:pPr>
+              <w:pStyle w:val="Compact"/>
+              <w:widowControl/>
+              <w:spacing w:before="20" w:after="20"/>
+              <w:jc w:val="left"/>
+              <w:rPr>
+                <w:rFonts w:ascii="Times New Roman" w:hAnsi="Times New Roman" w:eastAsia="Times New Roman" w:cs="Times New Roman"/>
+                <w:kern w:val="0"/>
+                <w:sz w:val="20"/>
+                <w:szCs w:val="20"/>
+                <w:lang w:val="en-US" w:eastAsia="en-US" w:bidi="ar-SA"/>
+              </w:rPr>
+            </w:pPr>
+            <w:r>
+              <w:rPr>
+                <w:rFonts w:eastAsia="Times New Roman" w:cs="Times New Roman"/>
+                <w:kern w:val="0"/>
+                <w:sz w:val="20"/>
+                <w:szCs w:val="20"/>
+                <w:lang w:val="en-US" w:eastAsia="en-US" w:bidi="ar-SA"/>
+              </w:rPr>
+              <w:t>0.224 (0.152)</w:t>
             </w:r>
           </w:p>
         </w:tc>
@@ -4381,41 +4381,41 @@
                 <w:szCs w:val="20"/>
                 <w:lang w:val="en-US" w:eastAsia="en-US" w:bidi="ar-SA"/>
               </w:rPr>
-              <w:t>0.014 (0.033)</w:t>
-            </w:r>
-          </w:p>
-        </w:tc>
-        <w:tc>
-          <w:tcPr>
-            <w:tcW w:w="1504" w:type="dxa"/>
-            <w:tcBorders>
-              <w:top w:val="single" w:sz="4" w:space="0" w:color="BBBBBB"/>
-              <w:bottom w:val="single" w:sz="4" w:space="0" w:color="BBBBBB"/>
-            </w:tcBorders>
-          </w:tcPr>
-          <w:p>
-            <w:pPr>
-              <w:pStyle w:val="Compact"/>
-              <w:widowControl/>
-              <w:spacing w:before="20" w:after="20"/>
-              <w:jc w:val="left"/>
-              <w:rPr>
-                <w:rFonts w:ascii="Times New Roman" w:hAnsi="Times New Roman" w:eastAsia="Times New Roman" w:cs="Times New Roman"/>
-                <w:kern w:val="0"/>
-                <w:sz w:val="20"/>
-                <w:szCs w:val="20"/>
-                <w:lang w:val="en-US" w:eastAsia="en-US" w:bidi="ar-SA"/>
-              </w:rPr>
-            </w:pPr>
-            <w:r>
-              <w:rPr>
-                <w:rFonts w:eastAsia="Times New Roman" w:cs="Times New Roman"/>
-                <w:kern w:val="0"/>
-                <w:sz w:val="20"/>
-                <w:szCs w:val="20"/>
-                <w:lang w:val="en-US" w:eastAsia="en-US" w:bidi="ar-SA"/>
-              </w:rPr>
-              <w:t>−0.128 (1.615)</w:t>
+              <w:t>0.067 (0.028)</w:t>
+            </w:r>
+          </w:p>
+        </w:tc>
+        <w:tc>
+          <w:tcPr>
+            <w:tcW w:w="1504" w:type="dxa"/>
+            <w:tcBorders>
+              <w:top w:val="single" w:sz="4" w:space="0" w:color="BBBBBB"/>
+              <w:bottom w:val="single" w:sz="4" w:space="0" w:color="BBBBBB"/>
+            </w:tcBorders>
+          </w:tcPr>
+          <w:p>
+            <w:pPr>
+              <w:pStyle w:val="Compact"/>
+              <w:widowControl/>
+              <w:spacing w:before="20" w:after="20"/>
+              <w:jc w:val="left"/>
+              <w:rPr>
+                <w:rFonts w:ascii="Times New Roman" w:hAnsi="Times New Roman" w:eastAsia="Times New Roman" w:cs="Times New Roman"/>
+                <w:kern w:val="0"/>
+                <w:sz w:val="20"/>
+                <w:szCs w:val="20"/>
+                <w:lang w:val="en-US" w:eastAsia="en-US" w:bidi="ar-SA"/>
+              </w:rPr>
+            </w:pPr>
+            <w:r>
+              <w:rPr>
+                <w:rFonts w:eastAsia="Times New Roman" w:cs="Times New Roman"/>
+                <w:kern w:val="0"/>
+                <w:sz w:val="20"/>
+                <w:szCs w:val="20"/>
+                <w:lang w:val="en-US" w:eastAsia="en-US" w:bidi="ar-SA"/>
+              </w:rPr>
+              <w:t>−0.128 (0.300)</w:t>
             </w:r>
           </w:p>
         </w:tc>
@@ -4588,41 +4588,41 @@
                 <w:szCs w:val="20"/>
                 <w:lang w:val="en-US" w:eastAsia="en-US" w:bidi="ar-SA"/>
               </w:rPr>
-              <w:t>0.021 (0.028)</w:t>
-            </w:r>
-          </w:p>
-        </w:tc>
-        <w:tc>
-          <w:tcPr>
-            <w:tcW w:w="1504" w:type="dxa"/>
-            <w:tcBorders>
-              <w:top w:val="single" w:sz="4" w:space="0" w:color="BBBBBB"/>
-              <w:bottom w:val="single" w:sz="4" w:space="0" w:color="BBBBBB"/>
-            </w:tcBorders>
-          </w:tcPr>
-          <w:p>
-            <w:pPr>
-              <w:pStyle w:val="Compact"/>
-              <w:widowControl/>
-              <w:spacing w:before="20" w:after="20"/>
-              <w:jc w:val="left"/>
-              <w:rPr>
-                <w:rFonts w:ascii="Times New Roman" w:hAnsi="Times New Roman" w:eastAsia="Times New Roman" w:cs="Times New Roman"/>
-                <w:kern w:val="0"/>
-                <w:sz w:val="20"/>
-                <w:szCs w:val="20"/>
-                <w:lang w:val="en-US" w:eastAsia="en-US" w:bidi="ar-SA"/>
-              </w:rPr>
-            </w:pPr>
-            <w:r>
-              <w:rPr>
-                <w:rFonts w:eastAsia="Times New Roman" w:cs="Times New Roman"/>
-                <w:kern w:val="0"/>
-                <w:sz w:val="20"/>
-                <w:szCs w:val="20"/>
-                <w:lang w:val="en-US" w:eastAsia="en-US" w:bidi="ar-SA"/>
-              </w:rPr>
-              <w:t>−0.535 (0.110)</w:t>
+              <w:t>−0.039 (0.059)</w:t>
+            </w:r>
+          </w:p>
+        </w:tc>
+        <w:tc>
+          <w:tcPr>
+            <w:tcW w:w="1504" w:type="dxa"/>
+            <w:tcBorders>
+              <w:top w:val="single" w:sz="4" w:space="0" w:color="BBBBBB"/>
+              <w:bottom w:val="single" w:sz="4" w:space="0" w:color="BBBBBB"/>
+            </w:tcBorders>
+          </w:tcPr>
+          <w:p>
+            <w:pPr>
+              <w:pStyle w:val="Compact"/>
+              <w:widowControl/>
+              <w:spacing w:before="20" w:after="20"/>
+              <w:jc w:val="left"/>
+              <w:rPr>
+                <w:rFonts w:ascii="Times New Roman" w:hAnsi="Times New Roman" w:eastAsia="Times New Roman" w:cs="Times New Roman"/>
+                <w:kern w:val="0"/>
+                <w:sz w:val="20"/>
+                <w:szCs w:val="20"/>
+                <w:lang w:val="en-US" w:eastAsia="en-US" w:bidi="ar-SA"/>
+              </w:rPr>
+            </w:pPr>
+            <w:r>
+              <w:rPr>
+                <w:rFonts w:eastAsia="Times New Roman" w:cs="Times New Roman"/>
+                <w:kern w:val="0"/>
+                <w:sz w:val="20"/>
+                <w:szCs w:val="20"/>
+                <w:lang w:val="en-US" w:eastAsia="en-US" w:bidi="ar-SA"/>
+              </w:rPr>
+              <w:t>−0.535 (0.122)</w:t>
             </w:r>
           </w:p>
         </w:tc>
@@ -4795,41 +4795,41 @@
                 <w:szCs w:val="20"/>
                 <w:lang w:val="en-US" w:eastAsia="en-US" w:bidi="ar-SA"/>
               </w:rPr>
-              <w:t>−0.012 (0.034)</w:t>
-            </w:r>
-          </w:p>
-        </w:tc>
-        <w:tc>
-          <w:tcPr>
-            <w:tcW w:w="1504" w:type="dxa"/>
-            <w:tcBorders>
-              <w:top w:val="single" w:sz="4" w:space="0" w:color="BBBBBB"/>
-              <w:bottom w:val="single" w:sz="4" w:space="0" w:color="BBBBBB"/>
-            </w:tcBorders>
-          </w:tcPr>
-          <w:p>
-            <w:pPr>
-              <w:pStyle w:val="Compact"/>
-              <w:widowControl/>
-              <w:spacing w:before="20" w:after="20"/>
-              <w:jc w:val="left"/>
-              <w:rPr>
-                <w:rFonts w:ascii="Times New Roman" w:hAnsi="Times New Roman" w:eastAsia="Times New Roman" w:cs="Times New Roman"/>
-                <w:kern w:val="0"/>
-                <w:sz w:val="20"/>
-                <w:szCs w:val="20"/>
-                <w:lang w:val="en-US" w:eastAsia="en-US" w:bidi="ar-SA"/>
-              </w:rPr>
-            </w:pPr>
-            <w:r>
-              <w:rPr>
-                <w:rFonts w:eastAsia="Times New Roman" w:cs="Times New Roman"/>
-                <w:kern w:val="0"/>
-                <w:sz w:val="20"/>
-                <w:szCs w:val="20"/>
-                <w:lang w:val="en-US" w:eastAsia="en-US" w:bidi="ar-SA"/>
-              </w:rPr>
-              <w:t>−0.615 (0.107)</w:t>
+              <w:t>−0.016 (0.033)</w:t>
+            </w:r>
+          </w:p>
+        </w:tc>
+        <w:tc>
+          <w:tcPr>
+            <w:tcW w:w="1504" w:type="dxa"/>
+            <w:tcBorders>
+              <w:top w:val="single" w:sz="4" w:space="0" w:color="BBBBBB"/>
+              <w:bottom w:val="single" w:sz="4" w:space="0" w:color="BBBBBB"/>
+            </w:tcBorders>
+          </w:tcPr>
+          <w:p>
+            <w:pPr>
+              <w:pStyle w:val="Compact"/>
+              <w:widowControl/>
+              <w:spacing w:before="20" w:after="20"/>
+              <w:jc w:val="left"/>
+              <w:rPr>
+                <w:rFonts w:ascii="Times New Roman" w:hAnsi="Times New Roman" w:eastAsia="Times New Roman" w:cs="Times New Roman"/>
+                <w:kern w:val="0"/>
+                <w:sz w:val="20"/>
+                <w:szCs w:val="20"/>
+                <w:lang w:val="en-US" w:eastAsia="en-US" w:bidi="ar-SA"/>
+              </w:rPr>
+            </w:pPr>
+            <w:r>
+              <w:rPr>
+                <w:rFonts w:eastAsia="Times New Roman" w:cs="Times New Roman"/>
+                <w:kern w:val="0"/>
+                <w:sz w:val="20"/>
+                <w:szCs w:val="20"/>
+                <w:lang w:val="en-US" w:eastAsia="en-US" w:bidi="ar-SA"/>
+              </w:rPr>
+              <w:t>−0.615 (0.105)</w:t>
             </w:r>
           </w:p>
         </w:tc>
@@ -5002,41 +5002,41 @@
                 <w:szCs w:val="20"/>
                 <w:lang w:val="en-US" w:eastAsia="en-US" w:bidi="ar-SA"/>
               </w:rPr>
-              <w:t>0.005 (0.011)</w:t>
-            </w:r>
-          </w:p>
-        </w:tc>
-        <w:tc>
-          <w:tcPr>
-            <w:tcW w:w="1504" w:type="dxa"/>
-            <w:tcBorders>
-              <w:top w:val="single" w:sz="4" w:space="0" w:color="BBBBBB"/>
-              <w:bottom w:val="single" w:sz="4" w:space="0" w:color="BBBBBB"/>
-            </w:tcBorders>
-          </w:tcPr>
-          <w:p>
-            <w:pPr>
-              <w:pStyle w:val="Compact"/>
-              <w:widowControl/>
-              <w:spacing w:before="20" w:after="20"/>
-              <w:jc w:val="left"/>
-              <w:rPr>
-                <w:rFonts w:ascii="Times New Roman" w:hAnsi="Times New Roman" w:eastAsia="Times New Roman" w:cs="Times New Roman"/>
-                <w:kern w:val="0"/>
-                <w:sz w:val="20"/>
-                <w:szCs w:val="20"/>
-                <w:lang w:val="en-US" w:eastAsia="en-US" w:bidi="ar-SA"/>
-              </w:rPr>
-            </w:pPr>
-            <w:r>
-              <w:rPr>
-                <w:rFonts w:eastAsia="Times New Roman" w:cs="Times New Roman"/>
-                <w:kern w:val="0"/>
-                <w:sz w:val="20"/>
-                <w:szCs w:val="20"/>
-                <w:lang w:val="en-US" w:eastAsia="en-US" w:bidi="ar-SA"/>
-              </w:rPr>
-              <w:t>0.175 (0.117)</w:t>
+              <w:t>−0.002 (0.013)</w:t>
+            </w:r>
+          </w:p>
+        </w:tc>
+        <w:tc>
+          <w:tcPr>
+            <w:tcW w:w="1504" w:type="dxa"/>
+            <w:tcBorders>
+              <w:top w:val="single" w:sz="4" w:space="0" w:color="BBBBBB"/>
+              <w:bottom w:val="single" w:sz="4" w:space="0" w:color="BBBBBB"/>
+            </w:tcBorders>
+          </w:tcPr>
+          <w:p>
+            <w:pPr>
+              <w:pStyle w:val="Compact"/>
+              <w:widowControl/>
+              <w:spacing w:before="20" w:after="20"/>
+              <w:jc w:val="left"/>
+              <w:rPr>
+                <w:rFonts w:ascii="Times New Roman" w:hAnsi="Times New Roman" w:eastAsia="Times New Roman" w:cs="Times New Roman"/>
+                <w:kern w:val="0"/>
+                <w:sz w:val="20"/>
+                <w:szCs w:val="20"/>
+                <w:lang w:val="en-US" w:eastAsia="en-US" w:bidi="ar-SA"/>
+              </w:rPr>
+            </w:pPr>
+            <w:r>
+              <w:rPr>
+                <w:rFonts w:eastAsia="Times New Roman" w:cs="Times New Roman"/>
+                <w:kern w:val="0"/>
+                <w:sz w:val="20"/>
+                <w:szCs w:val="20"/>
+                <w:lang w:val="en-US" w:eastAsia="en-US" w:bidi="ar-SA"/>
+              </w:rPr>
+              <w:t>0.175 (0.103)</w:t>
             </w:r>
           </w:p>
         </w:tc>
@@ -5204,40 +5204,40 @@
                 <w:szCs w:val="20"/>
                 <w:lang w:val="en-US" w:eastAsia="en-US" w:bidi="ar-SA"/>
               </w:rPr>
-              <w:t>−0.012 (0.010)</w:t>
-            </w:r>
-          </w:p>
-        </w:tc>
-        <w:tc>
-          <w:tcPr>
-            <w:tcW w:w="1504" w:type="dxa"/>
-            <w:tcBorders>
-              <w:top w:val="single" w:sz="4" w:space="0" w:color="BBBBBB"/>
-            </w:tcBorders>
-          </w:tcPr>
-          <w:p>
-            <w:pPr>
-              <w:pStyle w:val="Compact"/>
-              <w:widowControl/>
-              <w:spacing w:before="20" w:after="20"/>
-              <w:jc w:val="left"/>
-              <w:rPr>
-                <w:rFonts w:ascii="Times New Roman" w:hAnsi="Times New Roman" w:eastAsia="Times New Roman" w:cs="Times New Roman"/>
-                <w:kern w:val="0"/>
-                <w:sz w:val="20"/>
-                <w:szCs w:val="20"/>
-                <w:lang w:val="en-US" w:eastAsia="en-US" w:bidi="ar-SA"/>
-              </w:rPr>
-            </w:pPr>
-            <w:r>
-              <w:rPr>
-                <w:rFonts w:eastAsia="Times New Roman" w:cs="Times New Roman"/>
-                <w:kern w:val="0"/>
-                <w:sz w:val="20"/>
-                <w:szCs w:val="20"/>
-                <w:lang w:val="en-US" w:eastAsia="en-US" w:bidi="ar-SA"/>
-              </w:rPr>
-              <w:t>0.473 (0.210)</w:t>
+              <w:t>0.003 (0.008)</w:t>
+            </w:r>
+          </w:p>
+        </w:tc>
+        <w:tc>
+          <w:tcPr>
+            <w:tcW w:w="1504" w:type="dxa"/>
+            <w:tcBorders>
+              <w:top w:val="single" w:sz="4" w:space="0" w:color="BBBBBB"/>
+            </w:tcBorders>
+          </w:tcPr>
+          <w:p>
+            <w:pPr>
+              <w:pStyle w:val="Compact"/>
+              <w:widowControl/>
+              <w:spacing w:before="20" w:after="20"/>
+              <w:jc w:val="left"/>
+              <w:rPr>
+                <w:rFonts w:ascii="Times New Roman" w:hAnsi="Times New Roman" w:eastAsia="Times New Roman" w:cs="Times New Roman"/>
+                <w:kern w:val="0"/>
+                <w:sz w:val="20"/>
+                <w:szCs w:val="20"/>
+                <w:lang w:val="en-US" w:eastAsia="en-US" w:bidi="ar-SA"/>
+              </w:rPr>
+            </w:pPr>
+            <w:r>
+              <w:rPr>
+                <w:rFonts w:eastAsia="Times New Roman" w:cs="Times New Roman"/>
+                <w:kern w:val="0"/>
+                <w:sz w:val="20"/>
+                <w:szCs w:val="20"/>
+                <w:lang w:val="en-US" w:eastAsia="en-US" w:bidi="ar-SA"/>
+              </w:rPr>
+              <w:t>0.473 (0.213)</w:t>
             </w:r>
             <w:bookmarkStart w:id="11" w:name="repository-data-rq1-rq2"/>
             <w:bookmarkEnd w:id="11"/>
@@ -5275,7 +5275,7 @@
         <w:t xml:space="preserve">γ</w:t>
       </w:r>
       <w:r>
-        <w:t>. We use a log link and treat the regression as Poisson quasi-maximum likelihood, which estimates the coefficients consistently as long as the conditional mean is correctly specified, even when the counts are overdispersed (Gourieroux et al. 1984). Pearson dispersion statistics (the Pearson chi-square divided by the residual degrees of freedom) are close to one in most repositories (median 0.94, range 0.48 to 1.94) and exceed 1.5 only in Transformers, autogen, semantic-kernel, Ollama, and vLLM. As a robustness check we also fit negative binomial models for specification (b) with the same offset and trend; the pooled age slope from these models is −0.0013 (95% CI −0.0092 to 0.0067). This is almost the same as the cycle-bootstrap Poisson estimate reported in Section 5.1 (−0.0013; −0.0091 to 0.0066), which is expected when dispersion is close to one; the two were computed separately. Poisson quasi-maximum likelihood with repository-clustered robust standard errors gives −0.0022 (−0.0102 to 0.0057).</w:t>
+        <w:t>. We use a log link and treat the regression as Poisson quasi-maximum likelihood, which estimates the coefficients consistently as long as the conditional mean is correctly specified, even when the counts are overdispersed (Gourieroux et al. 1984). Standard errors come from the cycle bootstrap described below, so inference does not rely on the Poisson variance.</w:t>
       </w:r>
     </w:p>
     <w:p>
@@ -5335,7 +5335,7 @@
         <w:t xml:space="preserve">Response to error signals (RQ3).</w:t>
       </w:r>
       <w:r>
-        <w:t xml:space="preserve"> For each repository-week we regress an indicator for a release on the within-repository standardized logarithm of one plus the number of bug reports in the previous week (and, in a second specification, in each of the previous three weeks), controlling for the standardized logarithm of total issues in the previous week (and, in a second specification, of non-bug issues in its place, since total issues contain the bug reports whose effect is being estimated), the age of the release capped at eight weeks, a linear time trend, and repository fixed effects, with standard errors clustered by repository. We also estimate the coefficient repository by repository and pool the estimates with the random-effects model above, and we compare release probabilities after a bug spike (a weekly bug count more than 1.5 standard deviations above the repository mean) with those in other weeks, controlling for total issues and repository fixed effects. Because there are only 19 clusters, we also report p-values from a wild cluster bootstrap with Webb weights (Cameron, Gelbach, and Miller 2008). Under H4 the coefficients are positive.</w:t>
+        <w:t xml:space="preserve"> For each repository-week we regress an indicator for a release on the within-repository standardized logarithm of one plus the number of bug reports in the previous week, on the same quantity in each of the previous three weeks entered jointly, and on the average of the three standardized lags. All regressions are logits that control for the standardized logarithm of issues in the previous week, the age of the release capped at eight weeks, a linear time trend, and repository fixed effects, with standard errors clustered by repository. The issue control is either total issues or non-bug issues, because the two answer different questions. With total issues held fixed, the bug coefficient measures a response to bug reports beyond overall volume. With non-bug issues held fixed, it measures a response to bug reports together with the overall activity that accompanies them, and the coefficient on non-bug issues then shows how large the response to other issues is. We also repeat the regressions on weeks at least two weeks after the previous release, because hot-fixes follow the burst of issues that a release itself provokes. Because there are only 19 clusters, we also report p-values from a wild cluster bootstrap with Webb weights (Cameron, Gelbach, and Miller 2008). Under H4 the coefficients are positive.</w:t>
       </w:r>
     </w:p>
     <w:p>
@@ -5426,7 +5426,7 @@
         <w:pStyle w:val="Heading3"/>
       </w:pPr>
       <w:r>
-        <w:t xml:space="preserve">5.1 RQ1: Bug reports do not rise with the age of a release</w:t>
+        <w:t xml:space="preserve">5.1 RQ1: Bug reports show no measurable rise with the age of a release</w:t>
       </w:r>
     </w:p>
     <w:p>
@@ -5434,7 +5434,50 @@
         <w:pStyle w:val="FirstParagraph"/>
       </w:pPr>
       <w:r>
-        <w:t xml:space="preserve">Under specification (b), pooling the 19 repository-level slopes with a random-effects model, the log-rate slope of bug reports on weeks since release is −0.0013 per week (95% CI −0.009 to 0.007), with no detectable heterogeneity across repositories (</w:t>
+        <w:t xml:space="preserve">Under specification (b), pooling the 19 repository-level slopes with a random-effects model gives a log-rate slope of bug reports on weeks since release of −0.0037 per week (95% CI −0.017 to 0.009; τ² = 0.0003). Eight of the 19 repository-level slopes are positive. One (Ollama) is significantly positive and two (semantic-kernel and text-generation-inference) are significantly negative, about what chance alone would produce among 19 tests. The interval rules out an increase in the bug rate of more than about 1 percent per week. Because bug reports enter the offset, this estimate is biased toward zero if errors rise, but in our synthetic checks (Section 4.3) the bias was not large enough to hide a planted rise. It is one of the two primary tests of H1.</w:t>
+      </w:r>
+    </w:p>
+    <w:p>
+      <w:pPr>
+        <w:pStyle w:val="BodyText"/>
+      </w:pPr>
+      <w:r>
+        <w:t xml:space="preserve">Under specification (a), raw bug counts do fall with age: the pooled slope is −0.024 (95% CI −0.046 to −0.002). Once we account for the total number of issues filed, as in (b), the decline disappears. The early surge appears to be a general burst of issue-filing right after a release, driven by attention, announcements, and defects together, and not a change in the share of reports that concern bugs. In the terms of Section 3, specification (a) is therefore uninformative about the error state because of this burst.</w:t>
+      </w:r>
+    </w:p>
+    <w:p>
+      <w:pPr>
+        <w:pStyle w:val="BodyText"/>
+      </w:pPr>
+      <w:r>
+        <w:t xml:space="preserve">Specification (c), which controls for the log of weekly non-bug issues, gives −0.020 (95% CI −0.042 to 0.002), and specification (d), which adds indicators for the first three weeks after a release, gives +0.016 (95% CI −0.003 to 0.035). Under (d), 11 of the 19 repository-level slopes are positive and two are significantly positive. The slope is not identified for the two weekly releasers with almost no observations beyond the third week (anthropic-sdk-python and autogen, with standard errors above 5), and the random-effects estimate gives them negligible weight. H1 is therefore not supported at conventional levels, but the upper limit of the (d) interval means that an accumulation of up to about 3.5 percent per week in the bug rate cannot be ruled out once the burst of attention is absorbed. The evidence against an accumulating error state is thus weaker than the estimate under (b) alone suggests.</w:t>
+      </w:r>
+    </w:p>
+    <w:p>
+      <w:pPr>
+        <w:pStyle w:val="BodyText"/>
+      </w:pPr>
+      <w:r>
+        <w:rPr>
+          <w:highlight w:val="yellow"/>
+        </w:rPr>
+        <w:t xml:space="preserve">[REFRESH AT B = 999 BEFORE SUBMISSION: the numbers in Sections 5.1 to 5.3 and in Table 1 come from runs with 200 bootstrap draws, and specifications (a) and (c) come from a separate run of spec_c.py.]</w:t>
+      </w:r>
+    </w:p>
+    <w:p>
+      <w:pPr>
+        <w:pStyle w:val="Heading3"/>
+      </w:pPr>
+      <w:r>
+        <w:t xml:space="preserve">5.2 RQ2: The release hazard does not rise with age</w:t>
+      </w:r>
+    </w:p>
+    <w:p>
+      <w:pPr>
+        <w:pStyle w:val="FirstParagraph"/>
+      </w:pPr>
+      <w:r>
+        <w:t xml:space="preserve">The pooled release-hazard logit slope is −0.089 per week of age (95% CI −0.209 to 0.031; </w:t>
       </w:r>
       <w:r>
         <w:rPr>
@@ -5444,7 +5487,7 @@
         <w:t xml:space="preserve">τ²</w:t>
       </w:r>
       <w:r>
-        <w:t xml:space="preserve"> = 0). The estimate is precise enough to rule out, for instance, a 1 percent weekly increase in the bug rate. Eight of the 19 repository-level slopes are positive and 11 are negative. None is significantly positive at the 5 percent level and one (semantic-kernel) is significantly negative, about what chance alone would produce among 19 tests. Negative binomial estimates give a pooled slope of −0.0013 (95% CI −0.0092 to 0.0067), nearly identical to the Poisson estimate because dispersion is close to one in most repositories, so the result does not depend on the Poisson variance assumption. Because bug reports enter the offset, this estimate is biased toward zero if errors rise, but in our synthetic checks (Section 4.3) the bias was not large enough to hide a planted rise. It is one of the two primary tests of H1.</w:t>
+        <w:t xml:space="preserve"> = 0.050), which is not distinguishable from zero. Eight of the 19 repository-level slopes are positive. One, for vLLM, is significantly positive at the 5 percent level (a ratio of slope to standard error of about 2.2), which is about what chance alone would produce among 19 tests and does not survive a correction for multiple testing; the next largest ratio, for lm-evaluation-harness, is about 1.8 (Table 1). H2a is not supported in 18 of the 19 repositories.</w:t>
       </w:r>
     </w:p>
     <w:p>
@@ -5452,7 +5495,7 @@
         <w:pStyle w:val="BodyText"/>
       </w:pPr>
       <w:r>
-        <w:t xml:space="preserve">Under specification (a), raw bug counts do fall with age. Without any adjustment for total issue volume the pooled slope is −0.032 (95% CI −0.054 to −0.010), and in Transformers, bug counts fell from 22.1 per week in the first week after a release to 11.5 after five weeks. Once we account for the total number of issues filed, however, the decline disappears. The early surge appears to be a general burst of issue-filing right after a release, driven by attention, announcements, and defects together, and not a change in the share of reports that concern bugs. In the terms of Section 3, specification (a) is uninformative about the error state because of this burst, and specification (b) shows no sign of an accumulating error state.</w:t>
+        <w:t xml:space="preserve">Six repositories have a significantly negative slope, and four of them (anthropic-sdk-python, semantic-kernel, openai-python, and llama_index) are among the seven repositories with a median release cycle of one week, which also publish hot-fixes soon after a release. Excluding the seven weekly releasers gives a pooled slope of 0.042 (95% CI −0.081 to 0.164), which is close to zero and consistent with H2b. Repository-level slopes that condition on surviving the first week after a release are unstable, because several repositories have too few releases at later ages, and we report the pooled estimate for that restriction below. In the language of the price literature, hot-fixes resemble temporary sales. They are frequent, short-lived adjustments that dominate the raw hazard and obscure a regular cadence underneath (Nakamura and Steinsson 2008).</w:t>
       </w:r>
     </w:p>
     <w:p>
@@ -5460,32 +5503,14 @@
         <w:pStyle w:val="BodyText"/>
       </w:pPr>
       <w:r>
-        <w:t xml:space="preserve">Specification (d), which adds indicators for the first three weeks after a release to the non-bug-issue control of specification (c), is the second primary test of H1, and (c) is reported for completeness. </w:t>
-      </w:r>
-      <w:r>
-        <w:rPr>
-          <w:highlight w:val="yellow"/>
-        </w:rPr>
-        <w:t xml:space="preserve">[TO BE REPORTED BEFORE SUBMISSION: pooled age slopes with 95% CIs under specifications (c) and (d), the number of positive and significantly positive repository-level slopes under (d), and the weekly increase in the bug rate that the (d) interval rules out.]</w:t>
-      </w:r>
-      <w:r>
-        <w:t xml:space="preserve"> H1 is supported only if the slope under (b) or (d) is positive. If (d) is flat or negative, as (b) is, the conclusion that there is no accumulating error state does not depend on how issue volume is handled.</w:t>
-      </w:r>
-    </w:p>
-    <w:p>
-      <w:pPr>
-        <w:pStyle w:val="Heading3"/>
-      </w:pPr>
-      <w:r>
-        <w:t xml:space="preserve">5.2 RQ2: The release hazard does not rise with age</w:t>
-      </w:r>
-    </w:p>
-    <w:p>
-      <w:pPr>
-        <w:pStyle w:val="FirstParagraph"/>
-      </w:pPr>
-      <w:r>
-        <w:t xml:space="preserve">The pooled release-hazard logit slope is −0.091 per week of age (95% CI −0.213 to 0.032; </w:t>
+        <w:rPr>
+          <w:b/>
+          <w:bCs/>
+        </w:rPr>
+        <w:t xml:space="preserve">Separating hot-fixes.</w:t>
+      </w:r>
+      <w:r>
+        <w:t xml:space="preserve"> Of the 2,659 releases in the collected histories (2,456 of them within the weekly panels; the others precede the first panel week), 45 percent are classified as hot-fixes, from none in lm-evaluation-harness and FastChat to about three quarters in Ollama and llama_index. The hot-fix hazard is concentrated in the first week after a release: 40 percent of repository-weeks at an age of one week contain a hot-fix, against 5 to 8 percent at ages of two to seven weeks. Because the seven-day condition places hot-fixes close to the previous release by construction, this concentration is not evidence in itself. Classifying by version number alone, without the seven-day condition, 58 percent of the 2,659 releases raise only the patch component of the previous version, and 77 percent of those appear within seven days of the previous release (median three days). The share of releases that are patch-only by the version rule alone is 64 percent when the previous release is one week old and between 40 and 56 percent when it is five weeks old or more. When age is measured from the last regular release, the repository-level slopes of the regular-release hazard (18 repositories; FastChat has too few regular releases) pool to 0.096 (95% CI −0.006 to 0.198; </w:t>
       </w:r>
       <w:r>
         <w:rPr>
@@ -5495,15 +5520,7 @@
         <w:t xml:space="preserve">τ²</w:t>
       </w:r>
       <w:r>
-        <w:t xml:space="preserve"> = 0.050), which is not distinguishable from zero. Eight of the 19 repository-level slopes are positive. One, for vLLM, is significantly positive at the 5 percent level (a ratio of slope to standard error of about 2.3), which is about what chance alone would produce among 19 tests and does not survive a correction for multiple testing; the next largest ratio, for lm-evaluation-harness, is about 1.8 (Table 1). H2a is not supported in 18 of the 19 repositories.</w:t>
-      </w:r>
-    </w:p>
-    <w:p>
-      <w:pPr>
-        <w:pStyle w:val="BodyText"/>
-      </w:pPr>
-      <w:r>
-        <w:t xml:space="preserve">Five repositories have a significantly negative slope, and three of them (anthropic-sdk-python, openai-python, and llama_index) are among the seven repositories with a median release cycle of one week, which also publish hot-fixes soon after a release. Excluding the seven weekly releasers gives a pooled slope of 0.038 (95% CI −0.084 to 0.159), which is close to zero and consistent with H2b. Repository-level slopes that condition on surviving the first week after a release are unstable, because several repositories have too few releases at later ages, and we report the pooled estimate for that restriction below. In the language of the price literature, hot-fixes resemble temporary sales. They are frequent, short-lived adjustments that dominate the raw hazard and obscure a regular cadence underneath (Nakamura and Steinsson 2008).</w:t>
+        <w:t xml:space="preserve"> = 0.030). Five are significantly positive (diffusers, peft, Transformers, Ollama, and vLLM) and one is significantly negative. In the pooled data, by contrast, the share of repository-weeks with a regular release falls from 0.37 at two weeks to 0.26 at seven weeks, because repositories that release often leave the sample at risk early. This is the dynamic selection described by Heckman and Singer (1984). Within repositories the regular hazard is flat to mildly rising, which is what a fixed cadence implies (Section 3.3).</w:t>
       </w:r>
     </w:p>
     <w:p>
@@ -5515,10 +5532,120 @@
           <w:b/>
           <w:bCs/>
         </w:rPr>
-        <w:t xml:space="preserve">Separating hot-fixes.</w:t>
-      </w:r>
-      <w:r>
-        <w:t xml:space="preserve"> Of the 2,659 releases in the collected histories (2,456 of them within the weekly panels; the others precede the first panel week), 45 percent are classified as hot-fixes, from none in lm-evaluation-harness and FastChat to about three quarters in Ollama and llama_index. The hot-fix hazard is concentrated in the first week after a release: 40 percent of repository-weeks at an age of one week contain a hot-fix, against 5 to 8 percent at ages of two to seven weeks. Because the seven-day condition places hot-fixes close to the previous release by construction, this concentration is not evidence in itself. Classifying by version number alone, without the seven-day condition, 58 percent of the 2,659 releases raise only the patch component of the previous version, and 77 percent of those appear within seven days of the previous release (median three days). The share of releases that are patch-only by the version rule alone is 64 percent when the previous release is one week old and between 40 and 56 percent when it is five weeks old or more. When age is measured from the last regular release, the repository-level slopes of the regular-release hazard (18 repositories; FastChat has too few regular releases) pool to 0.096 (95% CI −0.006 to 0.198; </w:t>
+        <w:t xml:space="preserve">Frailty model.</w:t>
+      </w:r>
+      <w:r>
+        <w:t xml:space="preserve"> In the pooled logit with a repository-level random intercept, the slope on age is −0.117 per week for all releases (standard error 0.027; standard deviation of the intercept 1.10). It is −0.045 (0.018) when the seven weekly releasers are excluded and −0.099 (0.017) when only ages of two weeks or more are used. For regular releases measured from the last regular release the slope is 0.017 (0.015), and 0.059 (0.024) without the weekly releasers. Differences in baseline release frequency are therefore large, and hot-fixes, which reset the age of a release, account for much of the decline in the hazard of releases of any kind. A small decline remains that we do not attribute to a single cause.</w:t>
+      </w:r>
+    </w:p>
+    <w:p>
+      <w:pPr>
+        <w:pStyle w:val="BodyText"/>
+      </w:pPr>
+      <w:r>
+        <w:rPr>
+          <w:b/>
+          <w:bCs/>
+        </w:rPr>
+        <w:t xml:space="preserve">Release intervals.</w:t>
+      </w:r>
+      <w:r>
+        <w:t xml:space="preserve"> The coefficient of variation of the intervals between releases of any kind has a median of 1.05 across the 19 repositories, and 11 of them exceed one, which indicates bursts and gaps. For regular releases only, the median is 0.77 (range 0.33 to 1.72) and 14 of the 19 repositories are below one, so regular releases are spaced more evenly than a constant-hazard process would space them. The pattern of a mildly rising regular hazard and a CV below one is that of a Taylor-type cadence. It would also be produced by a rule that responds to accumulating work (Section 5.5), but not by one that responds to errors, because, as in Section 5.1, the error rate is flat.</w:t>
+      </w:r>
+    </w:p>
+    <w:p>
+      <w:pPr>
+        <w:pStyle w:val="BodyText"/>
+      </w:pPr>
+      <w:r>
+        <w:rPr>
+          <w:b/>
+          <w:bCs/>
+        </w:rPr>
+        <w:t xml:space="preserve">Documented release policies.</w:t>
+      </w:r>
+      <w:r>
+        <w:t xml:space="preserve"> None of the contributing guides or release documents we collected states a release calendar. Those of anthropic-sdk-python and openai-python describe an automated release pull-request pipeline that publishes to PyPI, which fits their weekly cadence and frequent hot-fixes. autogen and TRL document manual, maintainer-triggered procedures (a version-bump pull request followed by a tag in autogen; a release branch and a separate branch for patch releases in TRL) without a cadence. The remaining repositories document contribution rules but not how releases are made. Documented policy therefore gives little independent evidence on cadence, and we rely on the release histories.</w:t>
+      </w:r>
+    </w:p>
+    <w:p>
+      <w:pPr>
+        <w:pStyle w:val="BodyText"/>
+      </w:pPr>
+      <w:r>
+        <w:t xml:space="preserve">Taken together with Section 5.1, the evidence favors the second explanation in Section 3.3: there is no accumulating error state in these data to which a state-dependent rule could have responded, and release timing follows accumulated work, and perhaps the calendar, but not errors (Sections 5.3 to 5.5). We cannot exclude that maintainers would also be inattentive if such a state existed.</w:t>
+      </w:r>
+    </w:p>
+    <w:p>
+      <w:pPr>
+        <w:pStyle w:val="Heading3"/>
+      </w:pPr>
+      <w:r>
+        <w:t xml:space="preserve">5.3 RQ3: Releases respond to user activity, with no distinguishable extra response to bug reports</w:t>
+      </w:r>
+    </w:p>
+    <w:p>
+      <w:pPr>
+        <w:pStyle w:val="FirstParagraph"/>
+      </w:pPr>
+      <w:r>
+        <w:t xml:space="preserve">Releases respond to the volume of user issues. With non-bug issues held fixed, one standard deviation more bug reports (in logs) in the previous week raises the log-odds of a release by 0.261 (clustered standard error 0.095; p = 0.01; wild cluster bootstrap p = 0.01). The coefficient on non-bug issues in the same model is 0.220, close to that on bug reports, so releases follow the overall flow of user reports at least as much as they follow defects. The three-week average of bug reports gives 0.332 (0.108; wild cluster bootstrap p = 0.01), and the three lags entered separately give 0.184, 0.096, and 0.055.</w:t>
+      </w:r>
+    </w:p>
+    <w:p>
+      <w:pPr>
+        <w:pStyle w:val="FirstParagraph"/>
+      </w:pPr>
+      <w:r>
+        <w:t xml:space="preserve">Holding total issues fixed instead, the coefficient on bug reports is 0.191 (0.123; p = 0.12; wild cluster bootstrap p = 0.20), and the three-week average gives 0.272 (0.123; p = 0.03; wild cluster bootstrap p = 0.10). The positive sign leaves room for some response to bug reports beyond overall volume, but it is not significant under the wild cluster bootstrap. An approximate 95 percent interval for the one-week coefficient runs from −0.05 to 0.43 in log-odds, which is compatible with no extra response and with an increase in the odds of a release of up to about 54 percent per standard deviation.</w:t>
+      </w:r>
+    </w:p>
+    <w:p>
+      <w:pPr>
+        <w:pStyle w:val="FirstParagraph"/>
+      </w:pPr>
+      <w:r>
+        <w:t xml:space="preserve">Hot-fixes do not appear to account for these patterns. Dropping the week right after a release, where hot-fixes follow the burst of issues that the release provokes, gives 0.251 (0.092; wild cluster bootstrap p = 0.03) for the one-week lag and 0.318 (0.098; wild cluster bootstrap p = 0.01) for the three-week average with non-bug issues held fixed, and 0.143 (0.129; wild cluster bootstrap p = 0.27) and 0.218 (0.120; wild cluster bootstrap p = 0.12) with total issues held fixed. H4 is therefore partly supported: release timing responds to user activity, of which bug reports are a component, but we cannot show that it responds to bug reports as such. The test is more demanding than the age profile, because it asks whether an observable state moves releases, which state dependence requires, and only part of that state is a sign of degradation.</w:t>
+      </w:r>
+    </w:p>
+    <w:p>
+      <w:pPr>
+        <w:pStyle w:val="Heading3"/>
+      </w:pPr>
+      <w:r>
+        <w:t xml:space="preserve">5.4 RQ3: No detectable release response to upstream model launches</w:t>
+      </w:r>
+    </w:p>
+    <w:p>
+      <w:pPr>
+        <w:pStyle w:val="FirstParagraph"/>
+      </w:pPr>
+      <w:r>
+        <w:t xml:space="preserve">Across all 38 launches, the probability that a repository exposed to a launch releases in weeks 0 to 4 differs from that of unexposed repositories by −0.002 (standard error 0.018; wild cluster bootstrap p = 0.93), against a pre-launch weekly release rate of 0.42 in treated blocks. The 95 percent interval of −0.037 to 0.033 rules out effects larger than about 3.5 percentage points. For open-weights launches the estimate is 0.009 (0.019; p = 0.63) and for API launches it is −0.027 (0.030; p = 0.36). The estimates for regular releases are similar (−0.017 for all launches; p = 0.49). In weeks 5 to 8 the estimates are −0.011 (0.024), 0.004 (0.025), and −0.050 (0.025) for all, open-weights, and API launches. The event-time coefficients show no spike after a launch: the coefficient in week 0 is 0.057 (0.045), and those in weeks 1 to 4 lie between −0.095 and 0.009. The pre-launch coefficients are not individually significant, but the joint Wald tests are 6.25 (p = 0.10) for all launches and 7.00 (p = 0.07) for open-weights launches, so we cannot rule out differing pre-trends and we do not interpret the later-week estimate for API launches.</w:t>
+      </w:r>
+    </w:p>
+    <w:p>
+      <w:pPr>
+        <w:pStyle w:val="FirstParagraph"/>
+      </w:pPr>
+      <w:r>
+        <w:t xml:space="preserve">Release notes do mention new models. In exposed repositories, 143 of 334 repository-launch pairs (42.8 percent) have at least one release within eight weeks after the launch that mentions the launched model; the median delay is 10 days (interquartile range 1 to 24); and 287 of 1,901 releases after launch mention it, against 26 of 1,871 releases before. The match is by keyword and we have not validated it by hand, so some matches may be false positives. If most are correct, the pattern is consistent with the content of releases responding to a launch while their timing does not: support for a new model is shipped in releases that would probably have appeared anyway. H4 is not supported by the upstream signal either.</w:t>
+      </w:r>
+    </w:p>
+    <w:p>
+      <w:pPr>
+        <w:pStyle w:val="Heading3"/>
+      </w:pPr>
+      <w:r>
+        <w:t xml:space="preserve">5.5 RQ4: The release hazard tends to rise with accumulated work</w:t>
+      </w:r>
+    </w:p>
+    <w:p>
+      <w:pPr>
+        <w:pStyle w:val="FirstParagraph"/>
+      </w:pPr>
+      <w:r>
+        <w:t xml:space="preserve">For the hazard of a regular release, the pooled coefficient on calendar age alone (weeks since the last regular release) is 0.173 (95% CI 0.079 to 0.267; </w:t>
       </w:r>
       <w:r>
         <w:rPr>
@@ -5528,7 +5655,53 @@
         <w:t xml:space="preserve">τ²</w:t>
       </w:r>
       <w:r>
-        <w:t xml:space="preserve"> = 0.030). Five are significantly positive (diffusers, peft, Transformers, Ollama, and vLLM) and one is significantly negative. In the pooled data, by contrast, the share of repository-weeks with a regular release falls from 0.37 at two weeks to 0.26 at seven weeks, because repositories that release often leave the sample at risk early. This is the dynamic selection described by Heckman and Singer (1984). Within repositories the regular hazard is flat to mildly rising, which is what a fixed cadence implies (Section 3.3).</w:t>
+        <w:t xml:space="preserve"> = 0.020), and on work age alone it is 0.223 (0.132 to 0.314; </w:t>
+      </w:r>
+      <w:r>
+        <w:rPr>
+          <w:i/>
+          <w:iCs/>
+        </w:rPr>
+        <w:t xml:space="preserve">τ²</w:t>
+      </w:r>
+      <w:r>
+        <w:t xml:space="preserve"> = 0.017). When both are included, work age has a pooled coefficient of 0.182 (0.029 to 0.335; </w:t>
+      </w:r>
+      <w:r>
+        <w:rPr>
+          <w:i/>
+          <w:iCs/>
+        </w:rPr>
+        <w:t xml:space="preserve">τ²</w:t>
+      </w:r>
+      <w:r>
+        <w:t xml:space="preserve"> = 0.040) and calendar age has 0.065 (−0.089 to 0.219; </w:t>
+      </w:r>
+      <w:r>
+        <w:rPr>
+          <w:i/>
+          <w:iCs/>
+        </w:rPr>
+        <w:t xml:space="preserve">τ²</w:t>
+      </w:r>
+      <w:r>
+        <w:t xml:space="preserve"> = 0.051). Three repositories have a significantly positive coefficient on work age and three on calendar age in the joint specification, and none is significantly negative. The median within-repository correlation between the two ages is 0.74, and the median coefficient of variation of weekly merged pull requests is 0.83, so the data separate the two only in part. In a linear probability model with repository fixed effects, the coefficient on work age is 0.029 (cluster standard error 0.013; wild cluster bootstrap p = 0.087) and on calendar age it is −0.018 (0.011; p = 0.18).</w:t>
+      </w:r>
+    </w:p>
+    <w:p>
+      <w:pPr>
+        <w:pStyle w:val="FirstParagraph"/>
+      </w:pPr>
+      <w:r>
+        <w:t xml:space="preserve">We read these results as suggesting that the release hazard follows accumulated work more than calendar time, but not as conclusive. The pooled random-effects estimate excludes zero for work age and not for calendar age, which is the pattern H5 predicts and a fixed cadence does not, while the wild cluster bootstrap p-value for work age does not reach 5 percent and the two ages move together. H5 is partly supported.</w:t>
+      </w:r>
+    </w:p>
+    <w:p>
+      <w:pPr>
+        <w:pStyle w:val="Heading3"/>
+      </w:pPr>
+      <w:r>
+        <w:t xml:space="preserve">5.6 Additional analyses: release content, equivalence, and heterogeneity</w:t>
       </w:r>
     </w:p>
     <w:p>
@@ -5540,10 +5713,16 @@
           <w:b/>
           <w:bCs/>
         </w:rPr>
-        <w:t xml:space="preserve">Frailty model.</w:t>
-      </w:r>
-      <w:r>
-        <w:t xml:space="preserve"> In the pooled logit with a repository-level random intercept, the slope on age is −0.117 per week for all releases (standard error 0.027; standard deviation of the intercept 1.10). It is −0.045 (0.018) when the seven weekly releasers are excluded and −0.099 (0.017) when only ages of two weeks or more are used. For regular releases measured from the last regular release the slope is 0.017 (0.015), and 0.059 (0.024) without the weekly releasers. Differences in baseline release frequency are therefore large, and hot-fixes, which reset the age of a release, account for much of the decline in the hazard of releases of any kind. A small decline remains that we do not attribute to a single cause.</w:t>
+        <w:t xml:space="preserve">Release content. </w:t>
+      </w:r>
+      <w:r>
+        <w:rPr>
+          <w:highlight w:val="yellow"/>
+        </w:rPr>
+        <w:t xml:space="preserve">[TO BE REPORTED BEFORE SUBMISSION: number of releases and repositories with itemised notes; coefficient of the fix share on bug reports in the preceding four weeks with standard error, cluster-robust p and wild cluster bootstrap p; result of the hand check of 12 randomly drawn items.]</w:t>
+      </w:r>
+      <w:r>
+        <w:t xml:space="preserve"> If the coefficient is positive, the content of releases responds to bug reports while their timing does not, which is the pattern of a maintainer who ships fixes when they are ready, rather than one who schedules releases around degradation. If it is zero, neither timing nor content responds.</w:t>
       </w:r>
     </w:p>
     <w:p>
@@ -5555,10 +5734,13 @@
           <w:b/>
           <w:bCs/>
         </w:rPr>
-        <w:t xml:space="preserve">Release intervals.</w:t>
-      </w:r>
-      <w:r>
-        <w:t xml:space="preserve"> The coefficient of variation of the intervals between releases of any kind has a median of 1.05 across the 19 repositories, and 11 of them exceed one, which indicates bursts and gaps. For regular releases only, the median is 0.77 (range 0.33 to 1.72) and 14 of the 19 repositories are below one, so regular releases are spaced more evenly than a constant-hazard process would space them. The pattern of a mildly rising regular hazard and a CV below one is that of a Taylor-type cadence. It would also be produced by a rule that responds to accumulating work (Section 5.5), but not by one that responds to errors, because, as in Section 5.1, the error rate is flat.</w:t>
+        <w:t xml:space="preserve">Equivalence. </w:t>
+      </w:r>
+      <w:r>
+        <w:rPr>
+          <w:highlight w:val="yellow"/>
+        </w:rPr>
+        <w:t xml:space="preserve">[TO BE REPORTED BEFORE SUBMISSION: table of TOST p-values, smallest bounds for equivalence, and minimum detectable effects for RQ1 (specifications b and d), RQ3 (both controls), and the launch event study.]</w:t>
       </w:r>
     </w:p>
     <w:p>
@@ -5570,18 +5752,21 @@
           <w:b/>
           <w:bCs/>
         </w:rPr>
-        <w:t xml:space="preserve">Documented release policies.</w:t>
-      </w:r>
-      <w:r>
-        <w:t xml:space="preserve"> None of the contributing guides or release documents we collected states a release calendar. Those of anthropic-sdk-python and openai-python describe an automated release pull-request pipeline that publishes to PyPI, which fits their weekly cadence and frequent hot-fixes. autogen and TRL document manual, maintainer-triggered procedures (a version-bump pull request followed by a tag in autogen; a release branch and a separate branch for patch releases in TRL) without a cadence. The remaining repositories document contribution rules but not how releases are made. Documented policy therefore gives little independent evidence on cadence, and we rely on the release histories.</w:t>
-      </w:r>
-    </w:p>
-    <w:p>
-      <w:pPr>
-        <w:pStyle w:val="BodyText"/>
-      </w:pPr>
-      <w:r>
-        <w:t xml:space="preserve">Taken together with Section 5.1, the evidence favors the second explanation in Section 3.3: there is no accumulating error state in these data to which a state-dependent rule could have responded, and release timing follows accumulated work, and perhaps the calendar, but not errors (Sections 5.3 to 5.5). We cannot exclude that maintainers would also be inattentive if such a state existed.</w:t>
+        <w:t xml:space="preserve">Heterogeneity. </w:t>
+      </w:r>
+      <w:r>
+        <w:rPr>
+          <w:highlight w:val="yellow"/>
+        </w:rPr>
+        <w:t xml:space="preserve">[TO BE REPORTED BEFORE SUBMISSION: pooled RQ1 slopes and the RQ3 coefficient by subgroup, and whether the conclusions change when the automated-release repositories are excluded.]</w:t>
+      </w:r>
+    </w:p>
+    <w:p>
+      <w:pPr>
+        <w:pStyle w:val="Heading2"/>
+      </w:pPr>
+      <w:r>
+        <w:t xml:space="preserve">6 Discussion</w:t>
       </w:r>
     </w:p>
     <w:p>
@@ -5589,7 +5774,7 @@
         <w:pStyle w:val="Heading3"/>
       </w:pPr>
       <w:r>
-        <w:t xml:space="preserve">5.3 RQ3: Releases show no significant response to recent bug surges</w:t>
+        <w:t xml:space="preserve">6.1 Interpretation</w:t>
       </w:r>
     </w:p>
     <w:p>
@@ -5597,149 +5782,30 @@
         <w:pStyle w:val="FirstParagraph"/>
       </w:pPr>
       <w:r>
-        <w:t xml:space="preserve">We find no significant response of the release probability to the error signal that a maintainer can observe, although the estimates are positive and the data cannot rule out a modest response. For each standard deviation of the previous week’s bug count, the log-odds of a release in a given week rise by 0.147 (clustered standard error 0.122; p = 0.23), controlling for total issues, age, a time trend, and repository fixed effects. An approximate 95 percent interval, computed from the clustered standard error, runs from −0.09 to 0.39 in log-odds, so the data are compatible with no response and also with an increase in the odds of a release of up to about 47 percent per standard deviation of bug reports. With three lags, the coefficients are 0.088, 0.068, and 0.074 (standard errors 0.109, 0.072, and 0.059), and none is significant; the average of the three lags gives 0.226 (0.132; p = 0.09), the largest of the estimates. With only 19 clusters, we also report p-values from a wild cluster bootstrap with Webb weights (9,999 draws; Cameron, Gelbach, and Miller 2008): 0.28 for the one-week lag, 0.15 for the three-week average, and 0.45 for the one-week lag when two further lags are included. The share of issues that are bug reports has a coefficient of 0.021 (0.083), and restricting the sample to weeks beyond the first week after a release gives 0.095 (0.141). Repository by repository, the pooled coefficient is −0.048 (95% CI −0.248 to 0.151); eight of the 19 estimates are positive, one (autogen) is significantly positive, and one (openai-python) is significantly negative.</w:t>
-      </w:r>
-    </w:p>
-    <w:p>
-      <w:pPr>
-        <w:pStyle w:val="BodyText"/>
-      </w:pPr>
-      <w:r>
-        <w:t xml:space="preserve"/>
-      </w:r>
-      <w:r>
-        <w:rPr>
-          <w:highlight w:val="yellow"/>
-        </w:rPr>
-        <w:t xml:space="preserve">[TO BE REPORTED BEFORE SUBMISSION: the same regressions with the log of non-bug issues replacing the log of total issues as the control, because total issues contain the bug reports whose effect is being estimated.]</w:t>
-      </w:r>
-      <w:r>
-        <w:t xml:space="preserve"/>
+        <w:t xml:space="preserve">Releases in these repositories respond to the volume of user activity and, more weakly, to accumulated work, but we find no clear relationship with an accumulating error state. Bug reports do not rise measurably with the age of a release relative to total issues, although a modest accumulation cannot be excluded once the post-release burst is absorbed. Release probabilities rise with the volume of user issues without a distinguishable extra response to bug reports, releases show no detectable response to upstream model launches, and the release hazard tends to rise with the stock of merged changes. These findings suggest that the observable timing of maintenance need not form a feedback loop with system deterioration, which qualifies models that treat maintenance as a responsive control process. The evidence is consistent with release activity in this ecosystem mainly reflecting user activity and the accumulation of development work. This distinction has implications for how information systems researchers conceptualize monitoring, feedback, and control in AI-enabled systems. The repositories therefore resemble firms whose adjustment responds to observable demand and to an accumulating stock of work, as in Sheshinski and Weiss (1977), but the state to which they respond is not clearly accumulated errors. A calendar cadence, as in Taylor (1980), cannot be excluded, because work and calendar time are correlated. Because bug reports build up at most modestly, these data cannot distinguish a maintainer who ignores an accumulating error state from one who has little to respond to. Both readings carry the same practical message. In this ecosystem, we find no evidence that release timing is a mechanism through which degradation, if it occurs, would be corrected, although releases do respond to the flow of user reports. In the language of signaling theory, release cadence shows no sign of being a valid signal of responsiveness to degradation: it covaries with user activity in general and not distinguishably with the defects that it is read as indicating.</w:t>
+      </w:r>
+    </w:p>
+    <w:p>
+      <w:pPr>
+        <w:pStyle w:val="Heading3"/>
+      </w:pPr>
+      <w:r>
+        <w:t xml:space="preserve">6.2 Implications for policy and practice</w:t>
       </w:r>
     </w:p>
     <w:p>
       <w:pPr>
         <w:pStyle w:val="FirstParagraph"/>
-      </w:pPr>
-      <w:r>
-        <w:t xml:space="preserve">The comparison around bug spikes gives the same answer. The release probability in the following week is 43 percent after a spike (175 spikes) and 40 percent in other weeks, and the difference is not significant after controls (log-odds −0.05; standard error 0.25). The coefficients at horizons of one to four weeks are −0.050, −0.140, −0.083, and 0.309, with standard errors of 0.251, 0.285, 0.189, and 0.230. Releases are instead associated with total issue volume: a standard deviation more issues in the previous week raises the log-odds of a release by 0.25 (0.11; p = 0.025; wild cluster bootstrap p = 0.010). This is what one would expect if maintainers respond to overall activity and attention and not to defects as such, although we do not test that interpretation. H4 is not supported by the bug-report signal. The test is more demanding than the age profile, because it asks whether the observable state moves releases, which state dependence requires.</w:t>
-      </w:r>
-    </w:p>
-    <w:p>
-      <w:pPr>
-        <w:pStyle w:val="Heading3"/>
-      </w:pPr>
-      <w:r>
-        <w:t xml:space="preserve">5.4 RQ3: No detectable release response to upstream model launches</w:t>
-      </w:r>
-    </w:p>
-    <w:p>
-      <w:pPr>
-        <w:pStyle w:val="FirstParagraph"/>
-      </w:pPr>
-      <w:r>
-        <w:t xml:space="preserve">Across all 38 launches, the probability that a repository exposed to a launch releases in weeks 0 to 4 differs from that of unexposed repositories by −0.002 (standard error 0.018; wild cluster bootstrap p = 0.93), against a pre-launch weekly release rate of 0.42 in treated blocks. The 95 percent interval of −0.037 to 0.033 rules out effects larger than about 3.5 percentage points. For open-weights launches the estimate is 0.009 (0.019; p = 0.63) and for API launches it is −0.027 (0.030; p = 0.36). The estimates for regular releases are similar (−0.017 for all launches; p = 0.49). In weeks 5 to 8 the estimates are −0.011 (0.024), 0.004 (0.025), and −0.050 (0.025) for all, open-weights, and API launches. The event-time coefficients show no spike after a launch: the coefficient in week 0 is 0.057 (0.045), and those in weeks 1 to 4 lie between −0.095 and 0.009. The pre-launch coefficients are not individually significant, but the joint Wald tests are 6.25 (p = 0.10) for all launches and 7.00 (p = 0.07) for open-weights launches, so we cannot rule out differing pre-trends and we do not interpret the later-week estimate for API launches.</w:t>
-      </w:r>
-    </w:p>
-    <w:p>
-      <w:pPr>
-        <w:pStyle w:val="FirstParagraph"/>
-      </w:pPr>
-      <w:r>
-        <w:t xml:space="preserve">Release notes do mention new models. In exposed repositories, 143 of 334 repository-launch pairs (42.8 percent) have at least one release within eight weeks after the launch that mentions the launched model; the median delay is 10 days (interquartile range 1 to 24); and 287 of 1,901 releases after launch mention it, against 26 of 1,871 releases before. The match is by keyword and we have not validated it by hand, so some matches may be false positives. If most are correct, the pattern is consistent with the content of releases responding to a launch while their timing does not: support for a new model is shipped in releases that would probably have appeared anyway. H4 is not supported by the upstream signal either.</w:t>
-      </w:r>
-    </w:p>
-    <w:p>
-      <w:pPr>
-        <w:pStyle w:val="Heading3"/>
-      </w:pPr>
-      <w:r>
-        <w:t xml:space="preserve">5.5 RQ4: The release hazard tends to rise with accumulated work</w:t>
-      </w:r>
-    </w:p>
-    <w:p>
-      <w:pPr>
-        <w:pStyle w:val="FirstParagraph"/>
-      </w:pPr>
-      <w:r>
-        <w:t xml:space="preserve">For the hazard of a regular release, the pooled coefficient on calendar age alone (weeks since the last regular release) is 0.173 (95% CI 0.079 to 0.267; </w:t>
-      </w:r>
-      <w:r>
-        <w:rPr>
-          <w:i/>
-          <w:iCs/>
-        </w:rPr>
-        <w:t xml:space="preserve">τ²</w:t>
-      </w:r>
-      <w:r>
-        <w:t xml:space="preserve"> = 0.020), and on work age alone it is 0.223 (0.132 to 0.314; </w:t>
-      </w:r>
-      <w:r>
-        <w:rPr>
-          <w:i/>
-          <w:iCs/>
-        </w:rPr>
-        <w:t xml:space="preserve">τ²</w:t>
-      </w:r>
-      <w:r>
-        <w:t xml:space="preserve"> = 0.017). When both are included, work age has a pooled coefficient of 0.182 (0.029 to 0.335; </w:t>
-      </w:r>
-      <w:r>
-        <w:rPr>
-          <w:i/>
-          <w:iCs/>
-        </w:rPr>
-        <w:t xml:space="preserve">τ²</w:t>
-      </w:r>
-      <w:r>
-        <w:t xml:space="preserve"> = 0.040) and calendar age has 0.065 (−0.089 to 0.219; </w:t>
-      </w:r>
-      <w:r>
-        <w:rPr>
-          <w:i/>
-          <w:iCs/>
-        </w:rPr>
-        <w:t xml:space="preserve">τ²</w:t>
-      </w:r>
-      <w:r>
-        <w:t xml:space="preserve"> = 0.051). Three repositories have a significantly positive coefficient on work age and three on calendar age in the joint specification, and none is significantly negative. The median within-repository correlation between the two ages is 0.74, and the median coefficient of variation of weekly merged pull requests is 0.83, so the data separate the two only in part. In a linear probability model with repository fixed effects, the coefficient on work age is 0.029 (cluster standard error 0.013; wild cluster bootstrap p = 0.087) and on calendar age it is −0.018 (0.011; p = 0.18).</w:t>
-      </w:r>
-    </w:p>
-    <w:p>
-      <w:pPr>
-        <w:pStyle w:val="FirstParagraph"/>
-      </w:pPr>
-      <w:r>
-        <w:t xml:space="preserve">We read these results as suggesting that the release hazard follows accumulated work more than calendar time, but not as conclusive. The pooled random-effects estimate excludes zero for work age and not for calendar age, which is the pattern H5 predicts and a fixed cadence does not, while the wild cluster bootstrap p-value for work age does not reach 5 percent and the two ages move together. H5 is partly supported.</w:t>
-      </w:r>
-    </w:p>
-    <w:p>
-      <w:pPr>
-        <w:pStyle w:val="Heading3"/>
-      </w:pPr>
-      <w:r>
-        <w:t xml:space="preserve">5.6 Additional analyses: release content, equivalence, and heterogeneity</w:t>
-      </w:r>
-    </w:p>
-    <w:p>
-      <w:pPr>
-        <w:pStyle w:val="BodyText"/>
       </w:pPr>
       <w:r>
         <w:rPr>
           <w:b/>
           <w:bCs/>
         </w:rPr>
-        <w:t xml:space="preserve">Release content. </w:t>
-      </w:r>
-      <w:r>
-        <w:rPr>
-          <w:highlight w:val="yellow"/>
-        </w:rPr>
-        <w:t xml:space="preserve">[TO BE REPORTED BEFORE SUBMISSION: number of releases and repositories with itemised notes; coefficient of the fix share on bug reports in the preceding four weeks with standard error, cluster-robust p and wild cluster bootstrap p; result of the hand check of 12 randomly drawn items.]</w:t>
-      </w:r>
-      <w:r>
-        <w:t xml:space="preserve"> If the coefficient is positive, the content of releases responds to bug reports while their timing does not, which is the pattern of a maintainer who ships fixes when they are ready, rather than one who schedules releases around degradation. If it is zero, neither timing nor content responds.</w:t>
+        <w:t xml:space="preserve">Release cadence should not be read as a signal of responsiveness.</w:t>
+      </w:r>
+      <w:r>
+        <w:t xml:space="preserve"> A project that releases every week looks actively maintained, but if release timing follows user activity, accumulated work, or the calendar, it need not respond to degradation. Buyers, auditors, and regulators that use update frequency as an indicator of maintenance quality should not read it as evidence that degradation is being corrected. These implications concern the open-source tooling layer that we study; whether operators of hosted models behave similarly is an empirical question that public repositories cannot answer.</w:t>
       </w:r>
     </w:p>
     <w:p>
@@ -5751,13 +5817,10 @@
           <w:b/>
           <w:bCs/>
         </w:rPr>
-        <w:t xml:space="preserve">Equivalence. </w:t>
-      </w:r>
-      <w:r>
-        <w:rPr>
-          <w:highlight w:val="yellow"/>
-        </w:rPr>
-        <w:t xml:space="preserve">[TO BE REPORTED BEFORE SUBMISSION: table of TOST p-values, smallest bounds for equivalence, and minimum detectable effects for RQ1 (specifications b and d), RQ3 (both controls), and the launch event study.]</w:t>
+        <w:t xml:space="preserve">Monitoring obligations may need state triggers.</w:t>
+      </w:r>
+      <w:r>
+        <w:t xml:space="preserve"> Recent AI regulation, such as the post-market monitoring provisions of the European Union’s AI Act, requires providers of high-risk systems to monitor performance after deployment. Our results suggest that, without explicit triggers tied to measured performance, maintenance tends to follow accumulated work or a calendar. Where degradation is a concern, obligations framed in terms of measured error rates, rather than update schedules, are more likely to produce state-dependent responses. This inference is indirect, because our repositories are tools rather than deployed models.</w:t>
       </w:r>
     </w:p>
     <w:p>
@@ -5769,75 +5832,48 @@
           <w:b/>
           <w:bCs/>
         </w:rPr>
-        <w:t xml:space="preserve">Heterogeneity. </w:t>
-      </w:r>
-      <w:r>
-        <w:rPr>
-          <w:highlight w:val="yellow"/>
-        </w:rPr>
-        <w:t xml:space="preserve">[TO BE REPORTED BEFORE SUBMISSION: pooled RQ1 slopes and the RQ3 coefficient by subgroup, and whether the conclusions change when the automated-release repositories are excluded.]</w:t>
-      </w:r>
-    </w:p>
-    <w:p>
-      <w:pPr>
-        <w:pStyle w:val="Heading2"/>
-      </w:pPr>
-      <w:r>
-        <w:t xml:space="preserve">6 Discussion</w:t>
-      </w:r>
-    </w:p>
-    <w:p>
-      <w:pPr>
-        <w:pStyle w:val="Heading3"/>
-      </w:pPr>
-      <w:r>
-        <w:t xml:space="preserve">6.1 Interpretation</w:t>
-      </w:r>
-    </w:p>
-    <w:p>
-      <w:pPr>
-        <w:pStyle w:val="FirstParagraph"/>
-      </w:pPr>
-      <w:r>
-        <w:t xml:space="preserve">Releases in these repositories show no detectable relationship to the observable error state. Bug reports do not accumulate with the age of a release, releases show no significant response to surges in bug reports or to upstream model launches, and the release hazard tends to rise with the stock of merged changes. These findings suggest that the observable timing of maintenance need not form a feedback loop with system deterioration, which qualifies models that treat maintenance as a responsive control process. The evidence is consistent with release activity in this ecosystem mainly reflecting the accumulation of development work, although our intervals do not exclude modest responses to bug surges. This distinction has implications for how information systems researchers conceptualize monitoring, feedback, and control in AI-enabled systems. The repositories therefore resemble firms whose adjustment depends on an accumulating state, as in Sheshinski and Weiss (1977), but the state is accumulated work and not accumulated errors. A calendar cadence, as in Taylor (1980), cannot be excluded, because work and calendar time are correlated. Because bug reports do not build up either, these data cannot distinguish a maintainer who ignores an accumulating error state from one who has none to respond to. Both readings carry the same practical message. In this ecosystem, we find no evidence that release timing is a mechanism through which degradation, if it occurs, would be corrected. In the language of signaling theory, release cadence in this ecosystem shows no sign of being a valid signal of responsiveness, because it does not covary with the condition it is read as indicating.</w:t>
-      </w:r>
-    </w:p>
-    <w:p>
-      <w:pPr>
-        <w:pStyle w:val="Heading3"/>
-      </w:pPr>
-      <w:r>
-        <w:t xml:space="preserve">6.2 Implications for policy and practice</w:t>
-      </w:r>
-    </w:p>
-    <w:p>
-      <w:pPr>
-        <w:pStyle w:val="FirstParagraph"/>
+        <w:t xml:space="preserve">Maintenance as feedback.</w:t>
+      </w:r>
+      <w:r>
+        <w:t xml:space="preserve"> For research on information systems, the results suggest that the maintenance of AI-enabled systems should not be assumed to be a feedback process. Treating release activity as a measure of how well a system is monitored and maintained would misread development activity as a control loop. Organizations that depend on third-party AI components should therefore ask whether maintainers respond to measured performance, not how often they release.</w:t>
+      </w:r>
+    </w:p>
+    <w:p>
+      <w:pPr>
+        <w:pStyle w:val="BodyText"/>
       </w:pPr>
       <w:r>
         <w:rPr>
           <w:b/>
           <w:bCs/>
         </w:rPr>
-        <w:t xml:space="preserve">Release cadence should not be read as a signal of responsiveness.</w:t>
-      </w:r>
-      <w:r>
-        <w:t xml:space="preserve"> A project that releases every week looks actively maintained, but if release timing follows accumulated work or the calendar, it need not respond to degradation. Buyers, auditors, and regulators that use update frequency as an indicator of maintenance quality should not read it as evidence that degradation is being corrected. These implications concern the open-source tooling layer that we study; whether operators of hosted models behave similarly is an empirical question that public repositories cannot answer.</w:t>
-      </w:r>
-    </w:p>
-    <w:p>
-      <w:pPr>
-        <w:pStyle w:val="BodyText"/>
+        <w:t xml:space="preserve">Observation is the binding constraint.</w:t>
+      </w:r>
+      <w:r>
+        <w:t xml:space="preserve"> If time dependence reflects the cost of observing drift, as in Reis (2006), then policies that lower that cost would make state-dependent maintenance feasible and its absence detectable. Shared evaluation benchmarks, standardized error reporting, and research access to operators’ error logs and refresh histories are examples. Public repositories do not contain the data needed to test for degradation directly.</w:t>
+      </w:r>
+    </w:p>
+    <w:p>
+      <w:pPr>
+        <w:pStyle w:val="Heading3"/>
+      </w:pPr>
+      <w:r>
+        <w:t xml:space="preserve">6.3 Limitations</w:t>
+      </w:r>
+    </w:p>
+    <w:p>
+      <w:pPr>
+        <w:pStyle w:val="FirstParagraph"/>
       </w:pPr>
       <w:r>
         <w:rPr>
           <w:b/>
           <w:bCs/>
         </w:rPr>
-        <w:t xml:space="preserve">Monitoring obligations may need state triggers.</w:t>
-      </w:r>
-      <w:r>
-        <w:t xml:space="preserve"> Recent AI regulation, such as the post-market monitoring provisions of the European Union’s AI Act, requires providers of high-risk systems to monitor performance after deployment. Our results suggest that, without explicit triggers tied to measured performance, maintenance tends to follow accumulated work or a calendar. Where degradation is a concern, obligations framed in terms of measured error rates, rather than update schedules, are more likely to produce state-dependent responses. This inference is indirect, because our repositories are tools rather than deployed models.</w:t>
+        <w:t xml:space="preserve">Measurement.</w:t>
+      </w:r>
+      <w:r>
+        <w:t xml:space="preserve"> A release is a proxy for a refresh, and the repositories are software and tooling rather than model-retraining pipelines, so the timing we observe is not the decision the model describes in its purest form. Bug reports measure what users choose to report, which depends on popularity and on attention around a release, and our offset and trend controls address this only in part. The bug definition combines labels and keywords and may misclassify issues. We did not validate the classification against a manually labeled sample, so misclassification remains a limitation. It would bias the slope on age only if the share of misclassified issues itself changed with the time since the last release. Because each slope is estimated within a repository, where labeling conventions and keyword usage are stable, such a drift is not obvious, but we cannot rule it out.</w:t>
       </w:r>
     </w:p>
     <w:p>
@@ -5849,10 +5885,10 @@
           <w:b/>
           <w:bCs/>
         </w:rPr>
-        <w:t xml:space="preserve">Maintenance as feedback.</w:t>
-      </w:r>
-      <w:r>
-        <w:t xml:space="preserve"> For research on information systems, the results suggest that the maintenance of AI-enabled systems should not be assumed to be a feedback process. Treating release activity as a measure of how well a system is monitored and maintained would misread development activity as a control loop. Organizations that depend on third-party AI components should therefore ask whether maintainers respond to measured performance, not how often they release.</w:t>
+        <w:t xml:space="preserve">Sample.</w:t>
+      </w:r>
+      <w:r>
+        <w:t xml:space="preserve"> Nineteen repositories chosen under explicit criteria are not a random sample of the ecosystem, and the results should not be generalized to commercial operators or to the maintenance of hosted models.</w:t>
       </w:r>
     </w:p>
     <w:p>
@@ -5864,33 +5900,25 @@
           <w:b/>
           <w:bCs/>
         </w:rPr>
-        <w:t xml:space="preserve">Observation is the binding constraint.</w:t>
-      </w:r>
-      <w:r>
-        <w:t xml:space="preserve"> If time dependence reflects the cost of observing drift, as in Reis (2006), then policies that lower that cost would make state-dependent maintenance feasible and its absence detectable. Shared evaluation benchmarks, standardized error reporting, and research access to operators’ error logs and refresh histories are examples. Public repositories do not contain the data needed to test for degradation directly.</w:t>
-      </w:r>
-    </w:p>
-    <w:p>
-      <w:pPr>
-        <w:pStyle w:val="Heading3"/>
-      </w:pPr>
-      <w:r>
-        <w:t xml:space="preserve">6.3 Limitations</w:t>
-      </w:r>
-    </w:p>
-    <w:p>
-      <w:pPr>
-        <w:pStyle w:val="FirstParagraph"/>
+        <w:t xml:space="preserve">Identification and power.</w:t>
+      </w:r>
+      <w:r>
+        <w:t xml:space="preserve"> Age, calendar time, and project growth move together, and we report results with and without a time trend. Controls for issue volume are also delicate, because total issues contain the outcome; this is why Section 4.3 reports four specifications, and the choice among them matters for what a null result means. Several repository-level intervals are wide, and the absence of a significant result is not evidence of absence. We therefore say that the evidence does not support the hypotheses, give interval estimates, and avoid claiming that the effects are zero.</w:t>
+      </w:r>
+    </w:p>
+    <w:p>
+      <w:pPr>
+        <w:pStyle w:val="BodyText"/>
       </w:pPr>
       <w:r>
         <w:rPr>
           <w:b/>
           <w:bCs/>
         </w:rPr>
-        <w:t xml:space="preserve">Measurement.</w:t>
-      </w:r>
-      <w:r>
-        <w:t xml:space="preserve"> A release is a proxy for a refresh, and the repositories are software and tooling rather than model-retraining pipelines, so the timing we observe is not the decision the model describes in its purest form. Bug reports measure what users choose to report, which depends on popularity and on attention around a release, and our offset and trend controls address this only in part. The bug definition combines labels and keywords and may misclassify issues. We did not validate the classification against a manually labeled sample, so misclassification remains a limitation. It would bias the slope on age only if the share of misclassified issues itself changed with the time since the last release. Because each slope is estimated within a repository, where labeling conventions and keyword usage are stable, such a drift is not obvious, but we cannot rule it out.</w:t>
+        <w:t xml:space="preserve">Causality and scope.</w:t>
+      </w:r>
+      <w:r>
+        <w:t xml:space="preserve"> The tests are not causal. Releases and issue filing are jointly determined, since a release provokes issues and issues provoke releases, and the lagged specifications address the timing only in part. We also lack data from commercial operators of hosted models. Both limits mean that the results describe how releases covary with observable signals and do not show that maintainers would ignore degradation if it were measured.</w:t>
       </w:r>
     </w:p>
     <w:p>
@@ -5902,10 +5930,10 @@
           <w:b/>
           <w:bCs/>
         </w:rPr>
-        <w:t xml:space="preserve">Sample.</w:t>
-      </w:r>
-      <w:r>
-        <w:t xml:space="preserve"> Nineteen repositories chosen under explicit criteria are not a random sample of the ecosystem, and the results should not be generalized to commercial operators or to the maintenance of hosted models.</w:t>
+        <w:t xml:space="preserve">Work age, calendar age, and exposure coding.</w:t>
+      </w:r>
+      <w:r>
+        <w:t xml:space="preserve"> Work age and calendar age are correlated (median 0.74), so the separation of the two rules rests on limited variation in the pace of merging, and the wild cluster bootstrap does not reject at 5 percent. The coding of which repositories are exposed to which launches is a judgment, the event study shows some evidence of differing pre-trends for open-weights launches, and the release-note matches are by keyword and have not been validated by hand. Merged pull requests are an imperfect measure of work because they differ in size.</w:t>
       </w:r>
     </w:p>
     <w:p>
@@ -5917,51 +5945,6 @@
           <w:b/>
           <w:bCs/>
         </w:rPr>
-        <w:t xml:space="preserve">Identification and power.</w:t>
-      </w:r>
-      <w:r>
-        <w:t xml:space="preserve"> Age, calendar time, and project growth move together, and we report results with and without a time trend. Controls for issue volume are also delicate, because total issues contain the outcome; this is why Section 4.3 reports four specifications, and the choice among them matters for what a null result means. Several repository-level intervals are wide, and the absence of a significant result is not evidence of absence. We therefore say that the evidence does not support the hypotheses, give interval estimates, and avoid claiming that the effects are zero.</w:t>
-      </w:r>
-    </w:p>
-    <w:p>
-      <w:pPr>
-        <w:pStyle w:val="BodyText"/>
-      </w:pPr>
-      <w:r>
-        <w:rPr>
-          <w:b/>
-          <w:bCs/>
-        </w:rPr>
-        <w:t xml:space="preserve">Causality and scope.</w:t>
-      </w:r>
-      <w:r>
-        <w:t xml:space="preserve"> The tests are not causal. Releases and issue filing are jointly determined, since a release provokes issues and issues provoke releases, and the lagged specifications address the timing only in part. We also lack data from commercial operators of hosted models. Both limits mean that the results describe how releases covary with observable signals and do not show that maintainers would ignore degradation if it were measured.</w:t>
-      </w:r>
-    </w:p>
-    <w:p>
-      <w:pPr>
-        <w:pStyle w:val="BodyText"/>
-      </w:pPr>
-      <w:r>
-        <w:rPr>
-          <w:b/>
-          <w:bCs/>
-        </w:rPr>
-        <w:t xml:space="preserve">Work age, calendar age, and exposure coding.</w:t>
-      </w:r>
-      <w:r>
-        <w:t xml:space="preserve"> Work age and calendar age are correlated (median 0.74), so the separation of the two rules rests on limited variation in the pace of merging, and the wild cluster bootstrap does not reject at 5 percent. The coding of which repositories are exposed to which launches is a judgment, the event study shows some evidence of differing pre-trends for open-weights launches, and the release-note matches are by keyword and have not been validated by hand. Merged pull requests are an imperfect measure of work because they differ in size.</w:t>
-      </w:r>
-    </w:p>
-    <w:p>
-      <w:pPr>
-        <w:pStyle w:val="BodyText"/>
-      </w:pPr>
-      <w:r>
-        <w:rPr>
-          <w:b/>
-          <w:bCs/>
-        </w:rPr>
         <w:t xml:space="preserve">Reproducibility.</w:t>
       </w:r>
       <w:r>
@@ -5981,7 +5964,7 @@
         <w:pStyle w:val="FirstParagraph"/>
       </w:pPr>
       <w:r>
-        <w:t xml:space="preserve">We asked whether release timing in the open-source LLM ecosystem follows a state-dependent rule, in which accumulating degradation triggers a refresh, or a time-dependent rule, in which it does not. In 19 repositories, bug reports do not rise with the age of a release, in raw counts or relative to total issue volume, releases show no significant response to surges in bug reports or to upstream model launches, and the release hazard rises significantly with age in only one repository. The hazard does tend to rise with the stock of merged changes, although the data cannot cleanly separate that stock from calendar time. Release timing in this ecosystem therefore appears to follow accumulating work and not accumulating errors. The findings suggest that release cadence should not be read as evidence that degradation is managed, and that detecting and correcting degradation requires performance data that public repositories do not contain.</w:t>
+        <w:t xml:space="preserve">We asked whether release timing in the open-source LLM ecosystem follows a state-dependent rule, in which accumulating degradation triggers a refresh, or a time-dependent rule, in which it does not. In 19 repositories, bug reports do not rise measurably with the age of a release relative to total issues, although a modest accumulation cannot be excluded once the post-release burst is absorbed. Release probabilities rise with the volume of user issues without a distinguishable extra response to bug reports, releases show no detectable response to upstream model launches, and the release hazard rises significantly with age in only one repository. The hazard does tend to rise with the stock of merged changes, although the data cannot cleanly separate that stock from calendar time. Release timing in this ecosystem therefore appears to follow user activity and accumulating work, and we find no clear sign that it follows accumulating errors. The findings suggest that release cadence should not be read as evidence that degradation is managed, and that detecting and correcting degradation requires performance data that public repositories do not contain.</w:t>
       </w:r>
     </w:p>
     <w:p>

</xml_diff>

<commit_message>
Fill equivalence and heterogeneity results; add section52.py and run_all.bat (boot 999)
Co-Authored-By: Claude Sonnet 5.5 <noreply@anthropic.com>
Claude-Session: https://claude.ai/code/session_01TRgf3y9VxaCYQ3g7Rgi1uE
</commit_message>
<xml_diff>
--- a/revised/Manuscript_ISR_MISQ_Revised.docx
+++ b/revised/Manuscript_ISR_MISQ_Revised.docx
@@ -5410,7 +5410,7 @@
         <w:t xml:space="preserve">Heterogeneity (additional analysis).</w:t>
       </w:r>
       <w:r>
-        <w:t xml:space="preserve"> We repeat the RQ1 and RQ3 analyses (i) excluding the two repositories whose release pipelines are automated (anthropic-sdk-python and openai-python), (ii) separately for the seven repositories with a median release cycle of one week and for the others, and (iii) by repository category where at least three repositories share a category.</w:t>
+        <w:t xml:space="preserve"> We repeat the RQ1 and RQ3 analyses (i) excluding the two repositories whose release pipelines are automated (anthropic-sdk-python and openai-python), (ii) separately for the weekly releasers (a median gap of at most one week between release weeks) and for the others, and (iii) by repository category where at least three repositories share a category.</w:t>
       </w:r>
     </w:p>
     <w:p>
@@ -5461,7 +5461,7 @@
         <w:rPr>
           <w:highlight w:val="yellow"/>
         </w:rPr>
-        <w:t xml:space="preserve">[REFRESH AT B = 999 BEFORE SUBMISSION: the numbers in Sections 5.1 to 5.3 and in Table 1 come from runs with 200 bootstrap draws, and specifications (a) and (c) come from a separate run of spec_c.py.]</w:t>
+        <w:t xml:space="preserve">[REFRESH AT B = 999 BEFORE SUBMISSION: the numbers in Sections 5.1 to 5.3, in Section 5.6, and in Table 1 come from runs with 200 bootstrap draws, and specifications (a) and (c) and the equivalence tests come from a separate run of spec_c.py.]</w:t>
       </w:r>
     </w:p>
     <w:p>
@@ -5504,6 +5504,17 @@
       </w:pPr>
       <w:r>
         <w:rPr>
+          <w:highlight w:val="yellow"/>
+        </w:rPr>
+        <w:t xml:space="preserve">[REPLACE BEFORE SUBMISSION: the hot-fix shares, the regular-release hazard, the frailty model, and the coefficients of variation in the next three paragraphs come from code that is no longer available; regenerate them with section52.py and replace the numbers.]</w:t>
+      </w:r>
+    </w:p>
+    <w:p>
+      <w:pPr>
+        <w:pStyle w:val="BodyText"/>
+      </w:pPr>
+      <w:r>
+        <w:rPr>
           <w:b/>
           <w:bCs/>
         </w:rPr>
@@ -5737,10 +5748,7 @@
         <w:t xml:space="preserve">Equivalence. </w:t>
       </w:r>
       <w:r>
-        <w:rPr>
-          <w:highlight w:val="yellow"/>
-        </w:rPr>
-        <w:t xml:space="preserve">[TO BE REPORTED BEFORE SUBMISSION: table of TOST p-values, smallest bounds for equivalence, and minimum detectable effects for RQ1 (specifications b and d), RQ3 (both controls), and the launch event study.]</w:t>
+        <w:t xml:space="preserve">For the age slope of bug reports under specification (b), the estimate (−0.002, SE 0.006) is statistically equivalent to zero within ±0.02 log points per week (TOST p = 0.002). Equivalence would hold for any bound above 0.012, and the minimum effect detectable with 80 percent power is 0.017. Under specification (d) equivalence at that bound is not established (estimate 0.017, SE 0.010; TOST p = 0.39; equivalence for any bound above 0.033; minimum detectable effect 0.027). For the launch event study the estimate (−0.002, SE 0.018) is equivalent to zero within ±5 percentage points (TOST p = 0.004; smallest bound 0.032; minimum detectable effect 0.050). For the response to bug reports, equivalence within ±0.25 log-odds per standard deviation is not established, with non-bug issues held fixed (estimate 0.254, SE 0.096; TOST p = 0.52) or with total issues held fixed (0.189, SE 0.122; TOST p = 0.31), as expected when the estimates are themselves positive. The bounds are anchored to the data, which is why the smallest bound for equivalence is reported as well.</w:t>
       </w:r>
     </w:p>
     <w:p>
@@ -5755,10 +5763,10 @@
         <w:t xml:space="preserve">Heterogeneity. </w:t>
       </w:r>
       <w:r>
-        <w:rPr>
-          <w:highlight w:val="yellow"/>
-        </w:rPr>
-        <w:t xml:space="preserve">[TO BE REPORTED BEFORE SUBMISSION: pooled RQ1 slopes and the RQ3 coefficient by subgroup, and whether the conclusions change when the automated-release repositories are excluded.]</w:t>
+        <w:t xml:space="preserve">Excluding the two repositories with automated release pipelines (anthropic-sdk-python and openai-python) leaves the conclusions unchanged. The pooled age slope is −0.003 under specification (b) (95% CI −0.016 to 0.011) and +0.016 under (d) (−0.006 to 0.038), and the coefficient on bug reports with non-bug issues held fixed rises to 0.304 (SE 0.093). The thirteen slower releasers give −0.001 under (b) (−0.010 to 0.009), +0.014 under (d) (−0.003 to 0.031), and 0.211 (SE 0.082) for the response to bug reports. For the six weekly releasers the (b) estimate is imprecise (−0.033; −0.105 to 0.039), and the (d) estimate (0.255; 0.089 to 0.421) rests on few observations beyond the third week after a release and is not reliable. Within categories of three repositories the estimates are too imprecise to interpret; agent frameworks show a response to bug reports of 0.709 (SE 0.134) and inference engines an age slope under (d) of 0.044 (0.000 to 0.088), which we treat as exploratory.</w:t>
+      </w:r>
+      <w:r>
+        <w:t xml:space="preserve"/>
       </w:r>
     </w:p>
     <w:p>

</xml_diff>

<commit_message>
Update all RQ1-RQ3, Section 5.2 and 5.6 numbers with 999-draw results
Co-Authored-By: Claude Sonnet 5.5 <noreply@anthropic.com>
Claude-Session: https://claude.ai/code/session_01TRgf3y9VxaCYQ3g7Rgi1uE
</commit_message>
<xml_diff>
--- a/revised/Manuscript_ISR_MISQ_Revised.docx
+++ b/revised/Manuscript_ISR_MISQ_Revised.docx
@@ -23,7 +23,7 @@
         <w:pStyle w:val="FirstParagraph"/>
       </w:pPr>
       <w:r>
-        <w:t xml:space="preserve">Organizations increasingly deploy systems built on large language models and are expected to refresh them as the world drifts away from their training data, yet little is known about what triggers a refresh. Release frequency is widely read as a signal of project health and responsive maintenance. Drawing on signaling theory and on the distinction between state-dependent and time-dependent adjustment in the economics of price setting, we derive from a Poisson model of accumulating errors when cadence would be a valid signal of responsiveness, and we test the implications on weekly issue, release, pull-request, and commit histories for 19 widely used open-source repositories in the LLM tooling ecosystem (3,432 repository-weeks; 2,456 releases). Bug reports show no measurable rise with the time since the last release when they are measured relative to total issues, although a modest accumulation of up to about 3.5 percent per week cannot be excluded once the post-release burst of attention is absorbed. Release probabilities rise with the volume of user issues in the preceding weeks, but we find no significant additional response to bug reports at a given volume and no detectable response to 38 upstream model launches. The release hazard also tends to rise with the stock of merged changes since the last regular release, although the data cannot cleanly separate that stock from calendar time (median within-repository correlation 0.74). Release cadence therefore reflects user activity and accumulated work more clearly than responsiveness to degradation, and it should not be read as a validated signal of it. Detecting degradation requires performance data that public repositories do not contain.</w:t>
+        <w:t xml:space="preserve">Organizations increasingly deploy systems built on large language models and are expected to refresh them as the world drifts away from their training data, yet little is known about what triggers a refresh. Release frequency is widely read as a signal of project health and responsive maintenance. Drawing on signaling theory and on the distinction between state-dependent and time-dependent adjustment in the economics of price setting, we derive from a Poisson model of accumulating errors when cadence would be a valid signal of responsiveness, and we test the implications on weekly issue, release, pull-request, and commit histories for 19 widely used open-source repositories in the LLM tooling ecosystem (3,432 repository-weeks; 2,456 releases). Bug reports show no measurable rise with the time since the last release when they are measured relative to total issues, although a modest accumulation of up to about 3.9 percent per week cannot be excluded once the post-release burst of attention is absorbed. Release probabilities rise with the volume of user issues in the preceding weeks, but we find no significant additional response to bug reports at a given volume and no detectable response to 38 upstream model launches. The release hazard also tends to rise with the stock of merged changes since the last regular release, although the data cannot cleanly separate that stock from calendar time (median within-repository correlation 0.74). Release cadence therefore reflects user activity and accumulated work more clearly than responsiveness to degradation, and it should not be read as a validated signal of it. Detecting degradation requires performance data that public repositories do not contain.</w:t>
       </w:r>
     </w:p>
     <w:p>
@@ -146,7 +146,7 @@
         <w:pStyle w:val="BodyText"/>
       </w:pPr>
       <w:r>
-        <w:t xml:space="preserve">The answer to RQ1 is that bug reports do not rise measurably with the age of a release. The pooled slope is close to zero when bug reports are measured relative to total issues (−0.004 per week; 95% CI −0.017 to 0.009), but once the post-release burst of attention is absorbed the interval allows an accumulation of up to about 3.5 percent per week (+0.016; −0.003 to 0.035), so we read the result as weak evidence against an accumulating error state and not as proof of its absence. The answer to RQ3 is that release probabilities respond to the volume of user issues but not distinguishably to bug reports as such. With non-bug issues held fixed, one standard deviation more bug reports in the previous week raises the log-odds of a release by 0.26 (wild cluster bootstrap p = 0.01), a response of about the same size as that to non-bug issues (0.22), and the additional response to bug reports at a given total volume is positive but not significant (0.19; wild cluster bootstrap p = 0.20). Releases show no detectable response to 38 upstream model launches, although release notes often mention a new model after its launch, which suggests that the content of releases responds while their timing does not. The answer to RQ2 is that the age profile of the release hazard is not what a response to errors would produce. Only one repository (vLLM) has a hazard that rises significantly with age, the pooled slope is not distinguishable from zero (−0.09; 95% CI −0.21 to 0.03), and the raw hazard is highest in the week after a release, when hot-fixes are issued. The answer to RQ4 is that the release hazard tends to rise with the stock of merged changes. When work age and calendar age are entered together, the pooled coefficient on work age is positive and that on calendar age is not, but the two are correlated (0.74), and a linear model with repository fixed effects and a wild cluster bootstrap gives p = 0.09 for work age and p = 0.18 for calendar age, so we read the result as suggestive. Release timing in this ecosystem therefore looks driven by user activity and accumulating work, with no clear sign of accumulating errors and no clear role for the calendar. The price literature has met a similar pattern in raw hazards. Pooling units that adjust at different frequencies yields a declining hazard even when each one’s own hazard is flat (Heckman and Singer 1984), and temporary price changes such as sales dominate raw adjustment frequencies (Nakamura and Steinsson 2008). Hot-fixes play the role of sales in our data.</w:t>
+        <w:t xml:space="preserve">The answer to RQ1 is that bug reports do not rise measurably with the age of a release. The pooled slope is close to zero when bug reports are measured relative to total issues (−0.003 per week; 95% CI −0.015 to 0.010), but once the post-release burst of attention is absorbed the interval allows an accumulation of up to about 3.9 percent per week (+0.017; −0.003 to 0.038), so we read the result as weak evidence against an accumulating error state and not as proof of its absence. The answer to RQ3 is that release probabilities respond to the volume of user issues but not distinguishably to bug reports as such. With non-bug issues held fixed, one standard deviation more bug reports in the previous week raises the log-odds of a release by 0.26 (wild cluster bootstrap p = 0.01), a response of about the same size as that to non-bug issues (0.22), and the additional response to bug reports at a given total volume is positive but not significant (0.19; wild cluster bootstrap p = 0.18). Releases show no detectable response to 38 upstream model launches, although release notes often mention a new model after its launch, which suggests that the content of releases responds while their timing does not. The answer to RQ2 is that the age profile of the release hazard is not what a response to errors would produce. Only one repository (vLLM) has a hazard that rises significantly with age, the pooled slope is not distinguishable from zero (−0.09; 95% CI −0.21 to 0.03), and the raw hazard is highest in the week after a release, when hot-fixes are issued. The answer to RQ4 is that the release hazard tends to rise with the stock of merged changes. When work age and calendar age are entered together, the pooled coefficient on work age is positive and that on calendar age is not, but the two are correlated (0.74), and a linear model with repository fixed effects and a wild cluster bootstrap gives p = 0.09 for work age and p = 0.18 for calendar age, so we read the result as suggestive. Release timing in this ecosystem therefore looks driven by user activity and accumulating work, with no clear sign of accumulating errors and no clear role for the calendar. The price literature has met a similar pattern in raw hazards. Pooling units that adjust at different frequencies yields a declining hazard even when each one’s own hazard is flat (Heckman and Singer 1984), and temporary price changes such as sales dominate raw adjustment frequencies (Nakamura and Steinsson 2008). Hot-fixes play the role of sales in our data.</w:t>
       </w:r>
     </w:p>
     <w:p>
@@ -1483,41 +1483,41 @@
                 <w:szCs w:val="20"/>
                 <w:lang w:val="en-US" w:eastAsia="en-US" w:bidi="ar-SA"/>
               </w:rPr>
-              <w:t>−0.023 (0.080)</w:t>
-            </w:r>
-          </w:p>
-        </w:tc>
-        <w:tc>
-          <w:tcPr>
-            <w:tcW w:w="1504" w:type="dxa"/>
-            <w:tcBorders>
-              <w:top w:val="single" w:sz="4" w:space="0" w:color="BBBBBB"/>
-              <w:bottom w:val="single" w:sz="4" w:space="0" w:color="BBBBBB"/>
-            </w:tcBorders>
-          </w:tcPr>
-          <w:p>
-            <w:pPr>
-              <w:pStyle w:val="Compact"/>
-              <w:widowControl/>
-              <w:spacing w:before="20" w:after="20"/>
-              <w:jc w:val="left"/>
-              <w:rPr>
-                <w:rFonts w:ascii="Times New Roman" w:hAnsi="Times New Roman" w:eastAsia="Times New Roman" w:cs="Times New Roman"/>
-                <w:kern w:val="0"/>
-                <w:sz w:val="20"/>
-                <w:szCs w:val="20"/>
-                <w:lang w:val="en-US" w:eastAsia="en-US" w:bidi="ar-SA"/>
-              </w:rPr>
-            </w:pPr>
-            <w:r>
-              <w:rPr>
-                <w:rFonts w:eastAsia="Times New Roman" w:cs="Times New Roman"/>
-                <w:kern w:val="0"/>
-                <w:sz w:val="20"/>
-                <w:szCs w:val="20"/>
-                <w:lang w:val="en-US" w:eastAsia="en-US" w:bidi="ar-SA"/>
-              </w:rPr>
-              <w:t>−0.255 (0.094)</w:t>
+              <w:t>−0.023 (0.079)</w:t>
+            </w:r>
+          </w:p>
+        </w:tc>
+        <w:tc>
+          <w:tcPr>
+            <w:tcW w:w="1504" w:type="dxa"/>
+            <w:tcBorders>
+              <w:top w:val="single" w:sz="4" w:space="0" w:color="BBBBBB"/>
+              <w:bottom w:val="single" w:sz="4" w:space="0" w:color="BBBBBB"/>
+            </w:tcBorders>
+          </w:tcPr>
+          <w:p>
+            <w:pPr>
+              <w:pStyle w:val="Compact"/>
+              <w:widowControl/>
+              <w:spacing w:before="20" w:after="20"/>
+              <w:jc w:val="left"/>
+              <w:rPr>
+                <w:rFonts w:ascii="Times New Roman" w:hAnsi="Times New Roman" w:eastAsia="Times New Roman" w:cs="Times New Roman"/>
+                <w:kern w:val="0"/>
+                <w:sz w:val="20"/>
+                <w:szCs w:val="20"/>
+                <w:lang w:val="en-US" w:eastAsia="en-US" w:bidi="ar-SA"/>
+              </w:rPr>
+            </w:pPr>
+            <w:r>
+              <w:rPr>
+                <w:rFonts w:eastAsia="Times New Roman" w:cs="Times New Roman"/>
+                <w:kern w:val="0"/>
+                <w:sz w:val="20"/>
+                <w:szCs w:val="20"/>
+                <w:lang w:val="en-US" w:eastAsia="en-US" w:bidi="ar-SA"/>
+              </w:rPr>
+              <w:t>−0.255 (0.095)</w:t>
             </w:r>
           </w:p>
         </w:tc>
@@ -1690,41 +1690,41 @@
                 <w:szCs w:val="20"/>
                 <w:lang w:val="en-US" w:eastAsia="en-US" w:bidi="ar-SA"/>
               </w:rPr>
-              <w:t>−0.005 (0.013)</w:t>
-            </w:r>
-          </w:p>
-        </w:tc>
-        <w:tc>
-          <w:tcPr>
-            <w:tcW w:w="1504" w:type="dxa"/>
-            <w:tcBorders>
-              <w:top w:val="single" w:sz="4" w:space="0" w:color="BBBBBB"/>
-              <w:bottom w:val="single" w:sz="4" w:space="0" w:color="BBBBBB"/>
-            </w:tcBorders>
-          </w:tcPr>
-          <w:p>
-            <w:pPr>
-              <w:pStyle w:val="Compact"/>
-              <w:widowControl/>
-              <w:spacing w:before="20" w:after="20"/>
-              <w:jc w:val="left"/>
-              <w:rPr>
-                <w:rFonts w:ascii="Times New Roman" w:hAnsi="Times New Roman" w:eastAsia="Times New Roman" w:cs="Times New Roman"/>
-                <w:kern w:val="0"/>
-                <w:sz w:val="20"/>
-                <w:szCs w:val="20"/>
-                <w:lang w:val="en-US" w:eastAsia="en-US" w:bidi="ar-SA"/>
-              </w:rPr>
-            </w:pPr>
-            <w:r>
-              <w:rPr>
-                <w:rFonts w:eastAsia="Times New Roman" w:cs="Times New Roman"/>
-                <w:kern w:val="0"/>
-                <w:sz w:val="20"/>
-                <w:szCs w:val="20"/>
-                <w:lang w:val="en-US" w:eastAsia="en-US" w:bidi="ar-SA"/>
-              </w:rPr>
-              <w:t>−0.272 (0.064)</w:t>
+              <w:t>−0.005 (0.014)</w:t>
+            </w:r>
+          </w:p>
+        </w:tc>
+        <w:tc>
+          <w:tcPr>
+            <w:tcW w:w="1504" w:type="dxa"/>
+            <w:tcBorders>
+              <w:top w:val="single" w:sz="4" w:space="0" w:color="BBBBBB"/>
+              <w:bottom w:val="single" w:sz="4" w:space="0" w:color="BBBBBB"/>
+            </w:tcBorders>
+          </w:tcPr>
+          <w:p>
+            <w:pPr>
+              <w:pStyle w:val="Compact"/>
+              <w:widowControl/>
+              <w:spacing w:before="20" w:after="20"/>
+              <w:jc w:val="left"/>
+              <w:rPr>
+                <w:rFonts w:ascii="Times New Roman" w:hAnsi="Times New Roman" w:eastAsia="Times New Roman" w:cs="Times New Roman"/>
+                <w:kern w:val="0"/>
+                <w:sz w:val="20"/>
+                <w:szCs w:val="20"/>
+                <w:lang w:val="en-US" w:eastAsia="en-US" w:bidi="ar-SA"/>
+              </w:rPr>
+            </w:pPr>
+            <w:r>
+              <w:rPr>
+                <w:rFonts w:eastAsia="Times New Roman" w:cs="Times New Roman"/>
+                <w:kern w:val="0"/>
+                <w:sz w:val="20"/>
+                <w:szCs w:val="20"/>
+                <w:lang w:val="en-US" w:eastAsia="en-US" w:bidi="ar-SA"/>
+              </w:rPr>
+              <w:t>−0.272 (0.069)</w:t>
             </w:r>
           </w:p>
         </w:tc>
@@ -1897,41 +1897,41 @@
                 <w:szCs w:val="20"/>
                 <w:lang w:val="en-US" w:eastAsia="en-US" w:bidi="ar-SA"/>
               </w:rPr>
-              <w:t>0.013 (0.019)</w:t>
-            </w:r>
-          </w:p>
-        </w:tc>
-        <w:tc>
-          <w:tcPr>
-            <w:tcW w:w="1504" w:type="dxa"/>
-            <w:tcBorders>
-              <w:top w:val="single" w:sz="4" w:space="0" w:color="BBBBBB"/>
-              <w:bottom w:val="single" w:sz="4" w:space="0" w:color="BBBBBB"/>
-            </w:tcBorders>
-          </w:tcPr>
-          <w:p>
-            <w:pPr>
-              <w:pStyle w:val="Compact"/>
-              <w:widowControl/>
-              <w:spacing w:before="20" w:after="20"/>
-              <w:jc w:val="left"/>
-              <w:rPr>
-                <w:rFonts w:ascii="Times New Roman" w:hAnsi="Times New Roman" w:eastAsia="Times New Roman" w:cs="Times New Roman"/>
-                <w:kern w:val="0"/>
-                <w:sz w:val="20"/>
-                <w:szCs w:val="20"/>
-                <w:lang w:val="en-US" w:eastAsia="en-US" w:bidi="ar-SA"/>
-              </w:rPr>
-            </w:pPr>
-            <w:r>
-              <w:rPr>
-                <w:rFonts w:eastAsia="Times New Roman" w:cs="Times New Roman"/>
-                <w:kern w:val="0"/>
-                <w:sz w:val="20"/>
-                <w:szCs w:val="20"/>
-                <w:lang w:val="en-US" w:eastAsia="en-US" w:bidi="ar-SA"/>
-              </w:rPr>
-              <w:t>0.365 (0.203)</w:t>
+              <w:t>0.013 (0.018)</w:t>
+            </w:r>
+          </w:p>
+        </w:tc>
+        <w:tc>
+          <w:tcPr>
+            <w:tcW w:w="1504" w:type="dxa"/>
+            <w:tcBorders>
+              <w:top w:val="single" w:sz="4" w:space="0" w:color="BBBBBB"/>
+              <w:bottom w:val="single" w:sz="4" w:space="0" w:color="BBBBBB"/>
+            </w:tcBorders>
+          </w:tcPr>
+          <w:p>
+            <w:pPr>
+              <w:pStyle w:val="Compact"/>
+              <w:widowControl/>
+              <w:spacing w:before="20" w:after="20"/>
+              <w:jc w:val="left"/>
+              <w:rPr>
+                <w:rFonts w:ascii="Times New Roman" w:hAnsi="Times New Roman" w:eastAsia="Times New Roman" w:cs="Times New Roman"/>
+                <w:kern w:val="0"/>
+                <w:sz w:val="20"/>
+                <w:szCs w:val="20"/>
+                <w:lang w:val="en-US" w:eastAsia="en-US" w:bidi="ar-SA"/>
+              </w:rPr>
+            </w:pPr>
+            <w:r>
+              <w:rPr>
+                <w:rFonts w:eastAsia="Times New Roman" w:cs="Times New Roman"/>
+                <w:kern w:val="0"/>
+                <w:sz w:val="20"/>
+                <w:szCs w:val="20"/>
+                <w:lang w:val="en-US" w:eastAsia="en-US" w:bidi="ar-SA"/>
+              </w:rPr>
+              <w:t>0.365 (0.198)</w:t>
             </w:r>
           </w:p>
         </w:tc>
@@ -2104,41 +2104,41 @@
                 <w:szCs w:val="20"/>
                 <w:lang w:val="en-US" w:eastAsia="en-US" w:bidi="ar-SA"/>
               </w:rPr>
-              <w:t>0.008 (0.011)</w:t>
-            </w:r>
-          </w:p>
-        </w:tc>
-        <w:tc>
-          <w:tcPr>
-            <w:tcW w:w="1504" w:type="dxa"/>
-            <w:tcBorders>
-              <w:top w:val="single" w:sz="4" w:space="0" w:color="BBBBBB"/>
-              <w:bottom w:val="single" w:sz="4" w:space="0" w:color="BBBBBB"/>
-            </w:tcBorders>
-          </w:tcPr>
-          <w:p>
-            <w:pPr>
-              <w:pStyle w:val="Compact"/>
-              <w:widowControl/>
-              <w:spacing w:before="20" w:after="20"/>
-              <w:jc w:val="left"/>
-              <w:rPr>
-                <w:rFonts w:ascii="Times New Roman" w:hAnsi="Times New Roman" w:eastAsia="Times New Roman" w:cs="Times New Roman"/>
-                <w:kern w:val="0"/>
-                <w:sz w:val="20"/>
-                <w:szCs w:val="20"/>
-                <w:lang w:val="en-US" w:eastAsia="en-US" w:bidi="ar-SA"/>
-              </w:rPr>
-            </w:pPr>
-            <w:r>
-              <w:rPr>
-                <w:rFonts w:eastAsia="Times New Roman" w:cs="Times New Roman"/>
-                <w:kern w:val="0"/>
-                <w:sz w:val="20"/>
-                <w:szCs w:val="20"/>
-                <w:lang w:val="en-US" w:eastAsia="en-US" w:bidi="ar-SA"/>
-              </w:rPr>
-              <w:t>−0.103 (0.068)</w:t>
+              <w:t>0.008 (0.010)</w:t>
+            </w:r>
+          </w:p>
+        </w:tc>
+        <w:tc>
+          <w:tcPr>
+            <w:tcW w:w="1504" w:type="dxa"/>
+            <w:tcBorders>
+              <w:top w:val="single" w:sz="4" w:space="0" w:color="BBBBBB"/>
+              <w:bottom w:val="single" w:sz="4" w:space="0" w:color="BBBBBB"/>
+            </w:tcBorders>
+          </w:tcPr>
+          <w:p>
+            <w:pPr>
+              <w:pStyle w:val="Compact"/>
+              <w:widowControl/>
+              <w:spacing w:before="20" w:after="20"/>
+              <w:jc w:val="left"/>
+              <w:rPr>
+                <w:rFonts w:ascii="Times New Roman" w:hAnsi="Times New Roman" w:eastAsia="Times New Roman" w:cs="Times New Roman"/>
+                <w:kern w:val="0"/>
+                <w:sz w:val="20"/>
+                <w:szCs w:val="20"/>
+                <w:lang w:val="en-US" w:eastAsia="en-US" w:bidi="ar-SA"/>
+              </w:rPr>
+            </w:pPr>
+            <w:r>
+              <w:rPr>
+                <w:rFonts w:eastAsia="Times New Roman" w:cs="Times New Roman"/>
+                <w:kern w:val="0"/>
+                <w:sz w:val="20"/>
+                <w:szCs w:val="20"/>
+                <w:lang w:val="en-US" w:eastAsia="en-US" w:bidi="ar-SA"/>
+              </w:rPr>
+              <w:t>−0.103 (0.065)</w:t>
             </w:r>
           </w:p>
         </w:tc>
@@ -2311,41 +2311,41 @@
                 <w:szCs w:val="20"/>
                 <w:lang w:val="en-US" w:eastAsia="en-US" w:bidi="ar-SA"/>
               </w:rPr>
-              <w:t>0.000 (0.027)</w:t>
-            </w:r>
-          </w:p>
-        </w:tc>
-        <w:tc>
-          <w:tcPr>
-            <w:tcW w:w="1504" w:type="dxa"/>
-            <w:tcBorders>
-              <w:top w:val="single" w:sz="4" w:space="0" w:color="BBBBBB"/>
-              <w:bottom w:val="single" w:sz="4" w:space="0" w:color="BBBBBB"/>
-            </w:tcBorders>
-          </w:tcPr>
-          <w:p>
-            <w:pPr>
-              <w:pStyle w:val="Compact"/>
-              <w:widowControl/>
-              <w:spacing w:before="20" w:after="20"/>
-              <w:jc w:val="left"/>
-              <w:rPr>
-                <w:rFonts w:ascii="Times New Roman" w:hAnsi="Times New Roman" w:eastAsia="Times New Roman" w:cs="Times New Roman"/>
-                <w:kern w:val="0"/>
-                <w:sz w:val="20"/>
-                <w:szCs w:val="20"/>
-                <w:lang w:val="en-US" w:eastAsia="en-US" w:bidi="ar-SA"/>
-              </w:rPr>
-            </w:pPr>
-            <w:r>
-              <w:rPr>
-                <w:rFonts w:eastAsia="Times New Roman" w:cs="Times New Roman"/>
-                <w:kern w:val="0"/>
-                <w:sz w:val="20"/>
-                <w:szCs w:val="20"/>
-                <w:lang w:val="en-US" w:eastAsia="en-US" w:bidi="ar-SA"/>
-              </w:rPr>
-              <w:t>−0.031 (0.094)</w:t>
+              <w:t>0.000 (0.026)</w:t>
+            </w:r>
+          </w:p>
+        </w:tc>
+        <w:tc>
+          <w:tcPr>
+            <w:tcW w:w="1504" w:type="dxa"/>
+            <w:tcBorders>
+              <w:top w:val="single" w:sz="4" w:space="0" w:color="BBBBBB"/>
+              <w:bottom w:val="single" w:sz="4" w:space="0" w:color="BBBBBB"/>
+            </w:tcBorders>
+          </w:tcPr>
+          <w:p>
+            <w:pPr>
+              <w:pStyle w:val="Compact"/>
+              <w:widowControl/>
+              <w:spacing w:before="20" w:after="20"/>
+              <w:jc w:val="left"/>
+              <w:rPr>
+                <w:rFonts w:ascii="Times New Roman" w:hAnsi="Times New Roman" w:eastAsia="Times New Roman" w:cs="Times New Roman"/>
+                <w:kern w:val="0"/>
+                <w:sz w:val="20"/>
+                <w:szCs w:val="20"/>
+                <w:lang w:val="en-US" w:eastAsia="en-US" w:bidi="ar-SA"/>
+              </w:rPr>
+            </w:pPr>
+            <w:r>
+              <w:rPr>
+                <w:rFonts w:eastAsia="Times New Roman" w:cs="Times New Roman"/>
+                <w:kern w:val="0"/>
+                <w:sz w:val="20"/>
+                <w:szCs w:val="20"/>
+                <w:lang w:val="en-US" w:eastAsia="en-US" w:bidi="ar-SA"/>
+              </w:rPr>
+              <w:t>−0.031 (0.098)</w:t>
             </w:r>
           </w:p>
         </w:tc>
@@ -2552,7 +2552,7 @@
                 <w:szCs w:val="20"/>
                 <w:lang w:val="en-US" w:eastAsia="en-US" w:bidi="ar-SA"/>
               </w:rPr>
-              <w:t>0.168 (0.105)</w:t>
+              <w:t>0.168 (0.133)</w:t>
             </w:r>
           </w:p>
         </w:tc>
@@ -2725,7 +2725,7 @@
                 <w:szCs w:val="20"/>
                 <w:lang w:val="en-US" w:eastAsia="en-US" w:bidi="ar-SA"/>
               </w:rPr>
-              <w:t>0.004 (0.011)</w:t>
+              <w:t>0.004 (0.012)</w:t>
             </w:r>
           </w:p>
         </w:tc>
@@ -2932,7 +2932,7 @@
                 <w:szCs w:val="20"/>
                 <w:lang w:val="en-US" w:eastAsia="en-US" w:bidi="ar-SA"/>
               </w:rPr>
-              <w:t>−0.016 (0.019)</w:t>
+              <w:t>−0.016 (0.018)</w:t>
             </w:r>
           </w:p>
         </w:tc>
@@ -3139,41 +3139,41 @@
                 <w:szCs w:val="20"/>
                 <w:lang w:val="en-US" w:eastAsia="en-US" w:bidi="ar-SA"/>
               </w:rPr>
-              <w:t>−0.094 (0.036)</w:t>
-            </w:r>
-          </w:p>
-        </w:tc>
-        <w:tc>
-          <w:tcPr>
-            <w:tcW w:w="1504" w:type="dxa"/>
-            <w:tcBorders>
-              <w:top w:val="single" w:sz="4" w:space="0" w:color="BBBBBB"/>
-              <w:bottom w:val="single" w:sz="4" w:space="0" w:color="BBBBBB"/>
-            </w:tcBorders>
-          </w:tcPr>
-          <w:p>
-            <w:pPr>
-              <w:pStyle w:val="Compact"/>
-              <w:widowControl/>
-              <w:spacing w:before="20" w:after="20"/>
-              <w:jc w:val="left"/>
-              <w:rPr>
-                <w:rFonts w:ascii="Times New Roman" w:hAnsi="Times New Roman" w:eastAsia="Times New Roman" w:cs="Times New Roman"/>
-                <w:kern w:val="0"/>
-                <w:sz w:val="20"/>
-                <w:szCs w:val="20"/>
-                <w:lang w:val="en-US" w:eastAsia="en-US" w:bidi="ar-SA"/>
-              </w:rPr>
-            </w:pPr>
-            <w:r>
-              <w:rPr>
-                <w:rFonts w:eastAsia="Times New Roman" w:cs="Times New Roman"/>
-                <w:kern w:val="0"/>
-                <w:sz w:val="20"/>
-                <w:szCs w:val="20"/>
-                <w:lang w:val="en-US" w:eastAsia="en-US" w:bidi="ar-SA"/>
-              </w:rPr>
-              <w:t>−0.290 (0.135)</w:t>
+              <w:t>−0.094 (0.038)</w:t>
+            </w:r>
+          </w:p>
+        </w:tc>
+        <w:tc>
+          <w:tcPr>
+            <w:tcW w:w="1504" w:type="dxa"/>
+            <w:tcBorders>
+              <w:top w:val="single" w:sz="4" w:space="0" w:color="BBBBBB"/>
+              <w:bottom w:val="single" w:sz="4" w:space="0" w:color="BBBBBB"/>
+            </w:tcBorders>
+          </w:tcPr>
+          <w:p>
+            <w:pPr>
+              <w:pStyle w:val="Compact"/>
+              <w:widowControl/>
+              <w:spacing w:before="20" w:after="20"/>
+              <w:jc w:val="left"/>
+              <w:rPr>
+                <w:rFonts w:ascii="Times New Roman" w:hAnsi="Times New Roman" w:eastAsia="Times New Roman" w:cs="Times New Roman"/>
+                <w:kern w:val="0"/>
+                <w:sz w:val="20"/>
+                <w:szCs w:val="20"/>
+                <w:lang w:val="en-US" w:eastAsia="en-US" w:bidi="ar-SA"/>
+              </w:rPr>
+            </w:pPr>
+            <w:r>
+              <w:rPr>
+                <w:rFonts w:eastAsia="Times New Roman" w:cs="Times New Roman"/>
+                <w:kern w:val="0"/>
+                <w:sz w:val="20"/>
+                <w:szCs w:val="20"/>
+                <w:lang w:val="en-US" w:eastAsia="en-US" w:bidi="ar-SA"/>
+              </w:rPr>
+              <w:t>−0.290 (0.139)</w:t>
             </w:r>
           </w:p>
         </w:tc>
@@ -3380,7 +3380,7 @@
                 <w:szCs w:val="20"/>
                 <w:lang w:val="en-US" w:eastAsia="en-US" w:bidi="ar-SA"/>
               </w:rPr>
-              <w:t>0.023 (0.120)</w:t>
+              <w:t>0.023 (0.123)</w:t>
             </w:r>
           </w:p>
         </w:tc>
@@ -3553,41 +3553,41 @@
                 <w:szCs w:val="20"/>
                 <w:lang w:val="en-US" w:eastAsia="en-US" w:bidi="ar-SA"/>
               </w:rPr>
-              <w:t>0.007 (0.052)</w:t>
-            </w:r>
-          </w:p>
-        </w:tc>
-        <w:tc>
-          <w:tcPr>
-            <w:tcW w:w="1504" w:type="dxa"/>
-            <w:tcBorders>
-              <w:top w:val="single" w:sz="4" w:space="0" w:color="BBBBBB"/>
-              <w:bottom w:val="single" w:sz="4" w:space="0" w:color="BBBBBB"/>
-            </w:tcBorders>
-          </w:tcPr>
-          <w:p>
-            <w:pPr>
-              <w:pStyle w:val="Compact"/>
-              <w:widowControl/>
-              <w:spacing w:before="20" w:after="20"/>
-              <w:jc w:val="left"/>
-              <w:rPr>
-                <w:rFonts w:ascii="Times New Roman" w:hAnsi="Times New Roman" w:eastAsia="Times New Roman" w:cs="Times New Roman"/>
-                <w:kern w:val="0"/>
-                <w:sz w:val="20"/>
-                <w:szCs w:val="20"/>
-                <w:lang w:val="en-US" w:eastAsia="en-US" w:bidi="ar-SA"/>
-              </w:rPr>
-            </w:pPr>
-            <w:r>
-              <w:rPr>
-                <w:rFonts w:eastAsia="Times New Roman" w:cs="Times New Roman"/>
-                <w:kern w:val="0"/>
-                <w:sz w:val="20"/>
-                <w:szCs w:val="20"/>
-                <w:lang w:val="en-US" w:eastAsia="en-US" w:bidi="ar-SA"/>
-              </w:rPr>
-              <w:t>−0.439 (1.084)</w:t>
+              <w:t>0.007 (0.055)</w:t>
+            </w:r>
+          </w:p>
+        </w:tc>
+        <w:tc>
+          <w:tcPr>
+            <w:tcW w:w="1504" w:type="dxa"/>
+            <w:tcBorders>
+              <w:top w:val="single" w:sz="4" w:space="0" w:color="BBBBBB"/>
+              <w:bottom w:val="single" w:sz="4" w:space="0" w:color="BBBBBB"/>
+            </w:tcBorders>
+          </w:tcPr>
+          <w:p>
+            <w:pPr>
+              <w:pStyle w:val="Compact"/>
+              <w:widowControl/>
+              <w:spacing w:before="20" w:after="20"/>
+              <w:jc w:val="left"/>
+              <w:rPr>
+                <w:rFonts w:ascii="Times New Roman" w:hAnsi="Times New Roman" w:eastAsia="Times New Roman" w:cs="Times New Roman"/>
+                <w:kern w:val="0"/>
+                <w:sz w:val="20"/>
+                <w:szCs w:val="20"/>
+                <w:lang w:val="en-US" w:eastAsia="en-US" w:bidi="ar-SA"/>
+              </w:rPr>
+            </w:pPr>
+            <w:r>
+              <w:rPr>
+                <w:rFonts w:eastAsia="Times New Roman" w:cs="Times New Roman"/>
+                <w:kern w:val="0"/>
+                <w:sz w:val="20"/>
+                <w:szCs w:val="20"/>
+                <w:lang w:val="en-US" w:eastAsia="en-US" w:bidi="ar-SA"/>
+              </w:rPr>
+              <w:t>−0.439 (1.096)</w:t>
             </w:r>
           </w:p>
         </w:tc>
@@ -3760,41 +3760,41 @@
                 <w:szCs w:val="20"/>
                 <w:lang w:val="en-US" w:eastAsia="en-US" w:bidi="ar-SA"/>
               </w:rPr>
-              <w:t>−0.024 (0.045)</w:t>
-            </w:r>
-          </w:p>
-        </w:tc>
-        <w:tc>
-          <w:tcPr>
-            <w:tcW w:w="1504" w:type="dxa"/>
-            <w:tcBorders>
-              <w:top w:val="single" w:sz="4" w:space="0" w:color="BBBBBB"/>
-              <w:bottom w:val="single" w:sz="4" w:space="0" w:color="BBBBBB"/>
-            </w:tcBorders>
-          </w:tcPr>
-          <w:p>
-            <w:pPr>
-              <w:pStyle w:val="Compact"/>
-              <w:widowControl/>
-              <w:spacing w:before="20" w:after="20"/>
-              <w:jc w:val="left"/>
-              <w:rPr>
-                <w:rFonts w:ascii="Times New Roman" w:hAnsi="Times New Roman" w:eastAsia="Times New Roman" w:cs="Times New Roman"/>
-                <w:kern w:val="0"/>
-                <w:sz w:val="20"/>
-                <w:szCs w:val="20"/>
-                <w:lang w:val="en-US" w:eastAsia="en-US" w:bidi="ar-SA"/>
-              </w:rPr>
-            </w:pPr>
-            <w:r>
-              <w:rPr>
-                <w:rFonts w:eastAsia="Times New Roman" w:cs="Times New Roman"/>
-                <w:kern w:val="0"/>
-                <w:sz w:val="20"/>
-                <w:szCs w:val="20"/>
-                <w:lang w:val="en-US" w:eastAsia="en-US" w:bidi="ar-SA"/>
-              </w:rPr>
-              <w:t>−0.491 (0.279)</w:t>
+              <w:t>−0.024 (0.046)</w:t>
+            </w:r>
+          </w:p>
+        </w:tc>
+        <w:tc>
+          <w:tcPr>
+            <w:tcW w:w="1504" w:type="dxa"/>
+            <w:tcBorders>
+              <w:top w:val="single" w:sz="4" w:space="0" w:color="BBBBBB"/>
+              <w:bottom w:val="single" w:sz="4" w:space="0" w:color="BBBBBB"/>
+            </w:tcBorders>
+          </w:tcPr>
+          <w:p>
+            <w:pPr>
+              <w:pStyle w:val="Compact"/>
+              <w:widowControl/>
+              <w:spacing w:before="20" w:after="20"/>
+              <w:jc w:val="left"/>
+              <w:rPr>
+                <w:rFonts w:ascii="Times New Roman" w:hAnsi="Times New Roman" w:eastAsia="Times New Roman" w:cs="Times New Roman"/>
+                <w:kern w:val="0"/>
+                <w:sz w:val="20"/>
+                <w:szCs w:val="20"/>
+                <w:lang w:val="en-US" w:eastAsia="en-US" w:bidi="ar-SA"/>
+              </w:rPr>
+            </w:pPr>
+            <w:r>
+              <w:rPr>
+                <w:rFonts w:eastAsia="Times New Roman" w:cs="Times New Roman"/>
+                <w:kern w:val="0"/>
+                <w:sz w:val="20"/>
+                <w:szCs w:val="20"/>
+                <w:lang w:val="en-US" w:eastAsia="en-US" w:bidi="ar-SA"/>
+              </w:rPr>
+              <w:t>−0.491 (0.280)</w:t>
             </w:r>
           </w:p>
         </w:tc>
@@ -3967,41 +3967,41 @@
                 <w:szCs w:val="20"/>
                 <w:lang w:val="en-US" w:eastAsia="en-US" w:bidi="ar-SA"/>
               </w:rPr>
-              <w:t>−0.231 (0.064)</w:t>
-            </w:r>
-          </w:p>
-        </w:tc>
-        <w:tc>
-          <w:tcPr>
-            <w:tcW w:w="1504" w:type="dxa"/>
-            <w:tcBorders>
-              <w:top w:val="single" w:sz="4" w:space="0" w:color="BBBBBB"/>
-              <w:bottom w:val="single" w:sz="4" w:space="0" w:color="BBBBBB"/>
-            </w:tcBorders>
-          </w:tcPr>
-          <w:p>
-            <w:pPr>
-              <w:pStyle w:val="Compact"/>
-              <w:widowControl/>
-              <w:spacing w:before="20" w:after="20"/>
-              <w:jc w:val="left"/>
-              <w:rPr>
-                <w:rFonts w:ascii="Times New Roman" w:hAnsi="Times New Roman" w:eastAsia="Times New Roman" w:cs="Times New Roman"/>
-                <w:kern w:val="0"/>
-                <w:sz w:val="20"/>
-                <w:szCs w:val="20"/>
-                <w:lang w:val="en-US" w:eastAsia="en-US" w:bidi="ar-SA"/>
-              </w:rPr>
-            </w:pPr>
-            <w:r>
-              <w:rPr>
-                <w:rFonts w:eastAsia="Times New Roman" w:cs="Times New Roman"/>
-                <w:kern w:val="0"/>
-                <w:sz w:val="20"/>
-                <w:szCs w:val="20"/>
-                <w:lang w:val="en-US" w:eastAsia="en-US" w:bidi="ar-SA"/>
-              </w:rPr>
-              <w:t>−0.333 (0.158)</w:t>
+              <w:t>−0.231 (0.066)</w:t>
+            </w:r>
+          </w:p>
+        </w:tc>
+        <w:tc>
+          <w:tcPr>
+            <w:tcW w:w="1504" w:type="dxa"/>
+            <w:tcBorders>
+              <w:top w:val="single" w:sz="4" w:space="0" w:color="BBBBBB"/>
+              <w:bottom w:val="single" w:sz="4" w:space="0" w:color="BBBBBB"/>
+            </w:tcBorders>
+          </w:tcPr>
+          <w:p>
+            <w:pPr>
+              <w:pStyle w:val="Compact"/>
+              <w:widowControl/>
+              <w:spacing w:before="20" w:after="20"/>
+              <w:jc w:val="left"/>
+              <w:rPr>
+                <w:rFonts w:ascii="Times New Roman" w:hAnsi="Times New Roman" w:eastAsia="Times New Roman" w:cs="Times New Roman"/>
+                <w:kern w:val="0"/>
+                <w:sz w:val="20"/>
+                <w:szCs w:val="20"/>
+                <w:lang w:val="en-US" w:eastAsia="en-US" w:bidi="ar-SA"/>
+              </w:rPr>
+            </w:pPr>
+            <w:r>
+              <w:rPr>
+                <w:rFonts w:eastAsia="Times New Roman" w:cs="Times New Roman"/>
+                <w:kern w:val="0"/>
+                <w:sz w:val="20"/>
+                <w:szCs w:val="20"/>
+                <w:lang w:val="en-US" w:eastAsia="en-US" w:bidi="ar-SA"/>
+              </w:rPr>
+              <w:t>−0.333 (0.153)</w:t>
             </w:r>
           </w:p>
         </w:tc>
@@ -4174,41 +4174,41 @@
                 <w:szCs w:val="20"/>
                 <w:lang w:val="en-US" w:eastAsia="en-US" w:bidi="ar-SA"/>
               </w:rPr>
-              <w:t>0.020 (0.016)</w:t>
-            </w:r>
-          </w:p>
-        </w:tc>
-        <w:tc>
-          <w:tcPr>
-            <w:tcW w:w="1504" w:type="dxa"/>
-            <w:tcBorders>
-              <w:top w:val="single" w:sz="4" w:space="0" w:color="BBBBBB"/>
-              <w:bottom w:val="single" w:sz="4" w:space="0" w:color="BBBBBB"/>
-            </w:tcBorders>
-          </w:tcPr>
-          <w:p>
-            <w:pPr>
-              <w:pStyle w:val="Compact"/>
-              <w:widowControl/>
-              <w:spacing w:before="20" w:after="20"/>
-              <w:jc w:val="left"/>
-              <w:rPr>
-                <w:rFonts w:ascii="Times New Roman" w:hAnsi="Times New Roman" w:eastAsia="Times New Roman" w:cs="Times New Roman"/>
-                <w:kern w:val="0"/>
-                <w:sz w:val="20"/>
-                <w:szCs w:val="20"/>
-                <w:lang w:val="en-US" w:eastAsia="en-US" w:bidi="ar-SA"/>
-              </w:rPr>
-            </w:pPr>
-            <w:r>
-              <w:rPr>
-                <w:rFonts w:eastAsia="Times New Roman" w:cs="Times New Roman"/>
-                <w:kern w:val="0"/>
-                <w:sz w:val="20"/>
-                <w:szCs w:val="20"/>
-                <w:lang w:val="en-US" w:eastAsia="en-US" w:bidi="ar-SA"/>
-              </w:rPr>
-              <w:t>0.224 (0.152)</w:t>
+              <w:t>0.020 (0.015)</w:t>
+            </w:r>
+          </w:p>
+        </w:tc>
+        <w:tc>
+          <w:tcPr>
+            <w:tcW w:w="1504" w:type="dxa"/>
+            <w:tcBorders>
+              <w:top w:val="single" w:sz="4" w:space="0" w:color="BBBBBB"/>
+              <w:bottom w:val="single" w:sz="4" w:space="0" w:color="BBBBBB"/>
+            </w:tcBorders>
+          </w:tcPr>
+          <w:p>
+            <w:pPr>
+              <w:pStyle w:val="Compact"/>
+              <w:widowControl/>
+              <w:spacing w:before="20" w:after="20"/>
+              <w:jc w:val="left"/>
+              <w:rPr>
+                <w:rFonts w:ascii="Times New Roman" w:hAnsi="Times New Roman" w:eastAsia="Times New Roman" w:cs="Times New Roman"/>
+                <w:kern w:val="0"/>
+                <w:sz w:val="20"/>
+                <w:szCs w:val="20"/>
+                <w:lang w:val="en-US" w:eastAsia="en-US" w:bidi="ar-SA"/>
+              </w:rPr>
+            </w:pPr>
+            <w:r>
+              <w:rPr>
+                <w:rFonts w:eastAsia="Times New Roman" w:cs="Times New Roman"/>
+                <w:kern w:val="0"/>
+                <w:sz w:val="20"/>
+                <w:szCs w:val="20"/>
+                <w:lang w:val="en-US" w:eastAsia="en-US" w:bidi="ar-SA"/>
+              </w:rPr>
+              <w:t>0.224 (0.166)</w:t>
             </w:r>
           </w:p>
         </w:tc>
@@ -4381,41 +4381,41 @@
                 <w:szCs w:val="20"/>
                 <w:lang w:val="en-US" w:eastAsia="en-US" w:bidi="ar-SA"/>
               </w:rPr>
-              <w:t>0.067 (0.028)</w:t>
-            </w:r>
-          </w:p>
-        </w:tc>
-        <w:tc>
-          <w:tcPr>
-            <w:tcW w:w="1504" w:type="dxa"/>
-            <w:tcBorders>
-              <w:top w:val="single" w:sz="4" w:space="0" w:color="BBBBBB"/>
-              <w:bottom w:val="single" w:sz="4" w:space="0" w:color="BBBBBB"/>
-            </w:tcBorders>
-          </w:tcPr>
-          <w:p>
-            <w:pPr>
-              <w:pStyle w:val="Compact"/>
-              <w:widowControl/>
-              <w:spacing w:before="20" w:after="20"/>
-              <w:jc w:val="left"/>
-              <w:rPr>
-                <w:rFonts w:ascii="Times New Roman" w:hAnsi="Times New Roman" w:eastAsia="Times New Roman" w:cs="Times New Roman"/>
-                <w:kern w:val="0"/>
-                <w:sz w:val="20"/>
-                <w:szCs w:val="20"/>
-                <w:lang w:val="en-US" w:eastAsia="en-US" w:bidi="ar-SA"/>
-              </w:rPr>
-            </w:pPr>
-            <w:r>
-              <w:rPr>
-                <w:rFonts w:eastAsia="Times New Roman" w:cs="Times New Roman"/>
-                <w:kern w:val="0"/>
-                <w:sz w:val="20"/>
-                <w:szCs w:val="20"/>
-                <w:lang w:val="en-US" w:eastAsia="en-US" w:bidi="ar-SA"/>
-              </w:rPr>
-              <w:t>−0.128 (0.300)</w:t>
+              <w:t>0.067 (0.027)</w:t>
+            </w:r>
+          </w:p>
+        </w:tc>
+        <w:tc>
+          <w:tcPr>
+            <w:tcW w:w="1504" w:type="dxa"/>
+            <w:tcBorders>
+              <w:top w:val="single" w:sz="4" w:space="0" w:color="BBBBBB"/>
+              <w:bottom w:val="single" w:sz="4" w:space="0" w:color="BBBBBB"/>
+            </w:tcBorders>
+          </w:tcPr>
+          <w:p>
+            <w:pPr>
+              <w:pStyle w:val="Compact"/>
+              <w:widowControl/>
+              <w:spacing w:before="20" w:after="20"/>
+              <w:jc w:val="left"/>
+              <w:rPr>
+                <w:rFonts w:ascii="Times New Roman" w:hAnsi="Times New Roman" w:eastAsia="Times New Roman" w:cs="Times New Roman"/>
+                <w:kern w:val="0"/>
+                <w:sz w:val="20"/>
+                <w:szCs w:val="20"/>
+                <w:lang w:val="en-US" w:eastAsia="en-US" w:bidi="ar-SA"/>
+              </w:rPr>
+            </w:pPr>
+            <w:r>
+              <w:rPr>
+                <w:rFonts w:eastAsia="Times New Roman" w:cs="Times New Roman"/>
+                <w:kern w:val="0"/>
+                <w:sz w:val="20"/>
+                <w:szCs w:val="20"/>
+                <w:lang w:val="en-US" w:eastAsia="en-US" w:bidi="ar-SA"/>
+              </w:rPr>
+              <w:t>−0.128 (0.327)</w:t>
             </w:r>
           </w:p>
         </w:tc>
@@ -4588,41 +4588,41 @@
                 <w:szCs w:val="20"/>
                 <w:lang w:val="en-US" w:eastAsia="en-US" w:bidi="ar-SA"/>
               </w:rPr>
-              <w:t>−0.039 (0.059)</w:t>
-            </w:r>
-          </w:p>
-        </w:tc>
-        <w:tc>
-          <w:tcPr>
-            <w:tcW w:w="1504" w:type="dxa"/>
-            <w:tcBorders>
-              <w:top w:val="single" w:sz="4" w:space="0" w:color="BBBBBB"/>
-              <w:bottom w:val="single" w:sz="4" w:space="0" w:color="BBBBBB"/>
-            </w:tcBorders>
-          </w:tcPr>
-          <w:p>
-            <w:pPr>
-              <w:pStyle w:val="Compact"/>
-              <w:widowControl/>
-              <w:spacing w:before="20" w:after="20"/>
-              <w:jc w:val="left"/>
-              <w:rPr>
-                <w:rFonts w:ascii="Times New Roman" w:hAnsi="Times New Roman" w:eastAsia="Times New Roman" w:cs="Times New Roman"/>
-                <w:kern w:val="0"/>
-                <w:sz w:val="20"/>
-                <w:szCs w:val="20"/>
-                <w:lang w:val="en-US" w:eastAsia="en-US" w:bidi="ar-SA"/>
-              </w:rPr>
-            </w:pPr>
-            <w:r>
-              <w:rPr>
-                <w:rFonts w:eastAsia="Times New Roman" w:cs="Times New Roman"/>
-                <w:kern w:val="0"/>
-                <w:sz w:val="20"/>
-                <w:szCs w:val="20"/>
-                <w:lang w:val="en-US" w:eastAsia="en-US" w:bidi="ar-SA"/>
-              </w:rPr>
-              <w:t>−0.535 (0.122)</w:t>
+              <w:t>−0.039 (0.054)</w:t>
+            </w:r>
+          </w:p>
+        </w:tc>
+        <w:tc>
+          <w:tcPr>
+            <w:tcW w:w="1504" w:type="dxa"/>
+            <w:tcBorders>
+              <w:top w:val="single" w:sz="4" w:space="0" w:color="BBBBBB"/>
+              <w:bottom w:val="single" w:sz="4" w:space="0" w:color="BBBBBB"/>
+            </w:tcBorders>
+          </w:tcPr>
+          <w:p>
+            <w:pPr>
+              <w:pStyle w:val="Compact"/>
+              <w:widowControl/>
+              <w:spacing w:before="20" w:after="20"/>
+              <w:jc w:val="left"/>
+              <w:rPr>
+                <w:rFonts w:ascii="Times New Roman" w:hAnsi="Times New Roman" w:eastAsia="Times New Roman" w:cs="Times New Roman"/>
+                <w:kern w:val="0"/>
+                <w:sz w:val="20"/>
+                <w:szCs w:val="20"/>
+                <w:lang w:val="en-US" w:eastAsia="en-US" w:bidi="ar-SA"/>
+              </w:rPr>
+            </w:pPr>
+            <w:r>
+              <w:rPr>
+                <w:rFonts w:eastAsia="Times New Roman" w:cs="Times New Roman"/>
+                <w:kern w:val="0"/>
+                <w:sz w:val="20"/>
+                <w:szCs w:val="20"/>
+                <w:lang w:val="en-US" w:eastAsia="en-US" w:bidi="ar-SA"/>
+              </w:rPr>
+              <w:t>−0.535 (0.120)</w:t>
             </w:r>
           </w:p>
         </w:tc>
@@ -4795,41 +4795,41 @@
                 <w:szCs w:val="20"/>
                 <w:lang w:val="en-US" w:eastAsia="en-US" w:bidi="ar-SA"/>
               </w:rPr>
-              <w:t>−0.016 (0.033)</w:t>
-            </w:r>
-          </w:p>
-        </w:tc>
-        <w:tc>
-          <w:tcPr>
-            <w:tcW w:w="1504" w:type="dxa"/>
-            <w:tcBorders>
-              <w:top w:val="single" w:sz="4" w:space="0" w:color="BBBBBB"/>
-              <w:bottom w:val="single" w:sz="4" w:space="0" w:color="BBBBBB"/>
-            </w:tcBorders>
-          </w:tcPr>
-          <w:p>
-            <w:pPr>
-              <w:pStyle w:val="Compact"/>
-              <w:widowControl/>
-              <w:spacing w:before="20" w:after="20"/>
-              <w:jc w:val="left"/>
-              <w:rPr>
-                <w:rFonts w:ascii="Times New Roman" w:hAnsi="Times New Roman" w:eastAsia="Times New Roman" w:cs="Times New Roman"/>
-                <w:kern w:val="0"/>
-                <w:sz w:val="20"/>
-                <w:szCs w:val="20"/>
-                <w:lang w:val="en-US" w:eastAsia="en-US" w:bidi="ar-SA"/>
-              </w:rPr>
-            </w:pPr>
-            <w:r>
-              <w:rPr>
-                <w:rFonts w:eastAsia="Times New Roman" w:cs="Times New Roman"/>
-                <w:kern w:val="0"/>
-                <w:sz w:val="20"/>
-                <w:szCs w:val="20"/>
-                <w:lang w:val="en-US" w:eastAsia="en-US" w:bidi="ar-SA"/>
-              </w:rPr>
-              <w:t>−0.615 (0.105)</w:t>
+              <w:t>−0.016 (0.032)</w:t>
+            </w:r>
+          </w:p>
+        </w:tc>
+        <w:tc>
+          <w:tcPr>
+            <w:tcW w:w="1504" w:type="dxa"/>
+            <w:tcBorders>
+              <w:top w:val="single" w:sz="4" w:space="0" w:color="BBBBBB"/>
+              <w:bottom w:val="single" w:sz="4" w:space="0" w:color="BBBBBB"/>
+            </w:tcBorders>
+          </w:tcPr>
+          <w:p>
+            <w:pPr>
+              <w:pStyle w:val="Compact"/>
+              <w:widowControl/>
+              <w:spacing w:before="20" w:after="20"/>
+              <w:jc w:val="left"/>
+              <w:rPr>
+                <w:rFonts w:ascii="Times New Roman" w:hAnsi="Times New Roman" w:eastAsia="Times New Roman" w:cs="Times New Roman"/>
+                <w:kern w:val="0"/>
+                <w:sz w:val="20"/>
+                <w:szCs w:val="20"/>
+                <w:lang w:val="en-US" w:eastAsia="en-US" w:bidi="ar-SA"/>
+              </w:rPr>
+            </w:pPr>
+            <w:r>
+              <w:rPr>
+                <w:rFonts w:eastAsia="Times New Roman" w:cs="Times New Roman"/>
+                <w:kern w:val="0"/>
+                <w:sz w:val="20"/>
+                <w:szCs w:val="20"/>
+                <w:lang w:val="en-US" w:eastAsia="en-US" w:bidi="ar-SA"/>
+              </w:rPr>
+              <w:t>−0.615 (0.107)</w:t>
             </w:r>
           </w:p>
         </w:tc>
@@ -5002,41 +5002,41 @@
                 <w:szCs w:val="20"/>
                 <w:lang w:val="en-US" w:eastAsia="en-US" w:bidi="ar-SA"/>
               </w:rPr>
-              <w:t>−0.002 (0.013)</w:t>
-            </w:r>
-          </w:p>
-        </w:tc>
-        <w:tc>
-          <w:tcPr>
-            <w:tcW w:w="1504" w:type="dxa"/>
-            <w:tcBorders>
-              <w:top w:val="single" w:sz="4" w:space="0" w:color="BBBBBB"/>
-              <w:bottom w:val="single" w:sz="4" w:space="0" w:color="BBBBBB"/>
-            </w:tcBorders>
-          </w:tcPr>
-          <w:p>
-            <w:pPr>
-              <w:pStyle w:val="Compact"/>
-              <w:widowControl/>
-              <w:spacing w:before="20" w:after="20"/>
-              <w:jc w:val="left"/>
-              <w:rPr>
-                <w:rFonts w:ascii="Times New Roman" w:hAnsi="Times New Roman" w:eastAsia="Times New Roman" w:cs="Times New Roman"/>
-                <w:kern w:val="0"/>
-                <w:sz w:val="20"/>
-                <w:szCs w:val="20"/>
-                <w:lang w:val="en-US" w:eastAsia="en-US" w:bidi="ar-SA"/>
-              </w:rPr>
-            </w:pPr>
-            <w:r>
-              <w:rPr>
-                <w:rFonts w:eastAsia="Times New Roman" w:cs="Times New Roman"/>
-                <w:kern w:val="0"/>
-                <w:sz w:val="20"/>
-                <w:szCs w:val="20"/>
-                <w:lang w:val="en-US" w:eastAsia="en-US" w:bidi="ar-SA"/>
-              </w:rPr>
-              <w:t>0.175 (0.103)</w:t>
+              <w:t>−0.002 (0.012)</w:t>
+            </w:r>
+          </w:p>
+        </w:tc>
+        <w:tc>
+          <w:tcPr>
+            <w:tcW w:w="1504" w:type="dxa"/>
+            <w:tcBorders>
+              <w:top w:val="single" w:sz="4" w:space="0" w:color="BBBBBB"/>
+              <w:bottom w:val="single" w:sz="4" w:space="0" w:color="BBBBBB"/>
+            </w:tcBorders>
+          </w:tcPr>
+          <w:p>
+            <w:pPr>
+              <w:pStyle w:val="Compact"/>
+              <w:widowControl/>
+              <w:spacing w:before="20" w:after="20"/>
+              <w:jc w:val="left"/>
+              <w:rPr>
+                <w:rFonts w:ascii="Times New Roman" w:hAnsi="Times New Roman" w:eastAsia="Times New Roman" w:cs="Times New Roman"/>
+                <w:kern w:val="0"/>
+                <w:sz w:val="20"/>
+                <w:szCs w:val="20"/>
+                <w:lang w:val="en-US" w:eastAsia="en-US" w:bidi="ar-SA"/>
+              </w:rPr>
+            </w:pPr>
+            <w:r>
+              <w:rPr>
+                <w:rFonts w:eastAsia="Times New Roman" w:cs="Times New Roman"/>
+                <w:kern w:val="0"/>
+                <w:sz w:val="20"/>
+                <w:szCs w:val="20"/>
+                <w:lang w:val="en-US" w:eastAsia="en-US" w:bidi="ar-SA"/>
+              </w:rPr>
+              <w:t>0.175 (0.117)</w:t>
             </w:r>
           </w:p>
         </w:tc>
@@ -5204,40 +5204,40 @@
                 <w:szCs w:val="20"/>
                 <w:lang w:val="en-US" w:eastAsia="en-US" w:bidi="ar-SA"/>
               </w:rPr>
-              <w:t>0.003 (0.008)</w:t>
-            </w:r>
-          </w:p>
-        </w:tc>
-        <w:tc>
-          <w:tcPr>
-            <w:tcW w:w="1504" w:type="dxa"/>
-            <w:tcBorders>
-              <w:top w:val="single" w:sz="4" w:space="0" w:color="BBBBBB"/>
-            </w:tcBorders>
-          </w:tcPr>
-          <w:p>
-            <w:pPr>
-              <w:pStyle w:val="Compact"/>
-              <w:widowControl/>
-              <w:spacing w:before="20" w:after="20"/>
-              <w:jc w:val="left"/>
-              <w:rPr>
-                <w:rFonts w:ascii="Times New Roman" w:hAnsi="Times New Roman" w:eastAsia="Times New Roman" w:cs="Times New Roman"/>
-                <w:kern w:val="0"/>
-                <w:sz w:val="20"/>
-                <w:szCs w:val="20"/>
-                <w:lang w:val="en-US" w:eastAsia="en-US" w:bidi="ar-SA"/>
-              </w:rPr>
-            </w:pPr>
-            <w:r>
-              <w:rPr>
-                <w:rFonts w:eastAsia="Times New Roman" w:cs="Times New Roman"/>
-                <w:kern w:val="0"/>
-                <w:sz w:val="20"/>
-                <w:szCs w:val="20"/>
-                <w:lang w:val="en-US" w:eastAsia="en-US" w:bidi="ar-SA"/>
-              </w:rPr>
-              <w:t>0.473 (0.213)</w:t>
+              <w:t>0.003 (0.009)</w:t>
+            </w:r>
+          </w:p>
+        </w:tc>
+        <w:tc>
+          <w:tcPr>
+            <w:tcW w:w="1504" w:type="dxa"/>
+            <w:tcBorders>
+              <w:top w:val="single" w:sz="4" w:space="0" w:color="BBBBBB"/>
+            </w:tcBorders>
+          </w:tcPr>
+          <w:p>
+            <w:pPr>
+              <w:pStyle w:val="Compact"/>
+              <w:widowControl/>
+              <w:spacing w:before="20" w:after="20"/>
+              <w:jc w:val="left"/>
+              <w:rPr>
+                <w:rFonts w:ascii="Times New Roman" w:hAnsi="Times New Roman" w:eastAsia="Times New Roman" w:cs="Times New Roman"/>
+                <w:kern w:val="0"/>
+                <w:sz w:val="20"/>
+                <w:szCs w:val="20"/>
+                <w:lang w:val="en-US" w:eastAsia="en-US" w:bidi="ar-SA"/>
+              </w:rPr>
+            </w:pPr>
+            <w:r>
+              <w:rPr>
+                <w:rFonts w:eastAsia="Times New Roman" w:cs="Times New Roman"/>
+                <w:kern w:val="0"/>
+                <w:sz w:val="20"/>
+                <w:szCs w:val="20"/>
+                <w:lang w:val="en-US" w:eastAsia="en-US" w:bidi="ar-SA"/>
+              </w:rPr>
+              <w:t>0.473 (0.201)</w:t>
             </w:r>
             <w:bookmarkStart w:id="11" w:name="repository-data-rq1-rq2"/>
             <w:bookmarkEnd w:id="11"/>
@@ -5434,7 +5434,7 @@
         <w:pStyle w:val="FirstParagraph"/>
       </w:pPr>
       <w:r>
-        <w:t xml:space="preserve">Under specification (b), pooling the 19 repository-level slopes with a random-effects model gives a log-rate slope of bug reports on weeks since release of −0.0037 per week (95% CI −0.017 to 0.009; τ² = 0.0003). Eight of the 19 repository-level slopes are positive. One (Ollama) is significantly positive and two (semantic-kernel and text-generation-inference) are significantly negative, about what chance alone would produce among 19 tests. The interval rules out an increase in the bug rate of more than about 1 percent per week. Because bug reports enter the offset, this estimate is biased toward zero if errors rise, but in our synthetic checks (Section 4.3) the bias was not large enough to hide a planted rise. It is one of the two primary tests of H1.</w:t>
+        <w:t xml:space="preserve">Under specification (b), pooling the 19 repository-level slopes with a random-effects model gives a log-rate slope of bug reports on weeks since release of −0.0029 per week (95% CI −0.015 to 0.010; τ² = 0.0003). Eight of the 19 repository-level slopes are positive. One (Ollama) is significantly positive and two (semantic-kernel and text-generation-inference) are significantly negative, about what chance alone would produce among 19 tests. The interval rules out an increase in the bug rate of more than about 1 percent per week. Because bug reports enter the offset, this estimate is biased toward zero if errors rise, but in our synthetic checks (Section 4.3) the bias was not large enough to hide a planted rise. It is one of the two primary tests of H1.</w:t>
       </w:r>
     </w:p>
     <w:p>
@@ -5442,7 +5442,7 @@
         <w:pStyle w:val="BodyText"/>
       </w:pPr>
       <w:r>
-        <w:t xml:space="preserve">Under specification (a), raw bug counts do fall with age: the pooled slope is −0.024 (95% CI −0.046 to −0.002). Once we account for the total number of issues filed, as in (b), the decline disappears. The early surge appears to be a general burst of issue-filing right after a release, driven by attention, announcements, and defects together, and not a change in the share of reports that concern bugs. In the terms of Section 3, specification (a) is therefore uninformative about the error state because of this burst.</w:t>
+        <w:t xml:space="preserve">Under specification (a), raw bug counts do fall with age: the pooled slope is −0.026 (95% CI −0.050 to −0.002). Once we account for the total number of issues filed, as in (b), the decline disappears. The early surge appears to be a general burst of issue-filing right after a release, driven by attention, announcements, and defects together, and not a change in the share of reports that concern bugs. In the terms of Section 3, specification (a) is therefore uninformative about the error state because of this burst.</w:t>
       </w:r>
     </w:p>
     <w:p>
@@ -5450,18 +5450,7 @@
         <w:pStyle w:val="BodyText"/>
       </w:pPr>
       <w:r>
-        <w:t xml:space="preserve">Specification (c), which controls for the log of weekly non-bug issues, gives −0.020 (95% CI −0.042 to 0.002), and specification (d), which adds indicators for the first three weeks after a release, gives +0.016 (95% CI −0.003 to 0.035). Under (d), 11 of the 19 repository-level slopes are positive and two are significantly positive. The slope is not identified for the two weekly releasers with almost no observations beyond the third week (anthropic-sdk-python and autogen, with standard errors above 5), and the random-effects estimate gives them negligible weight. H1 is therefore not supported at conventional levels, but the upper limit of the (d) interval means that an accumulation of up to about 3.5 percent per week in the bug rate cannot be ruled out once the burst of attention is absorbed. The evidence against an accumulating error state is thus weaker than the estimate under (b) alone suggests.</w:t>
-      </w:r>
-    </w:p>
-    <w:p>
-      <w:pPr>
-        <w:pStyle w:val="BodyText"/>
-      </w:pPr>
-      <w:r>
-        <w:rPr>
-          <w:highlight w:val="yellow"/>
-        </w:rPr>
-        <w:t xml:space="preserve">[REFRESH AT B = 999 BEFORE SUBMISSION: the numbers in Sections 5.1 to 5.3, in Section 5.6, and in Table 1 come from runs with 200 bootstrap draws, and specifications (a) and (c) and the equivalence tests come from a separate run of spec_c.py.]</w:t>
+        <w:t xml:space="preserve">Specification (c), which controls for the log of weekly non-bug issues, gives −0.019 (95% CI −0.040 to 0.002), and specification (d), which adds indicators for the first three weeks after a release, gives +0.017 (95% CI −0.003 to 0.038). Under (d), 11 of the 19 repository-level slopes are positive and two are significantly positive. The slope is not identified for the two weekly releasers with almost no observations beyond the third week (anthropic-sdk-python and autogen, with standard errors above 4), and the random-effects estimate gives them negligible weight. H1 is therefore not supported at conventional levels, but the upper limit of the (d) interval means that an accumulation of up to about 3.9 percent per week in the bug rate cannot be ruled out once the burst of attention is absorbed. The evidence against an accumulating error state is thus weaker than the estimate under (b) alone suggests.</w:t>
       </w:r>
     </w:p>
     <w:p>
@@ -5477,7 +5466,7 @@
         <w:pStyle w:val="FirstParagraph"/>
       </w:pPr>
       <w:r>
-        <w:t xml:space="preserve">The pooled release-hazard logit slope is −0.089 per week of age (95% CI −0.209 to 0.031; </w:t>
+        <w:t xml:space="preserve">The pooled release-hazard logit slope is −0.090 per week of age (95% CI −0.211 to 0.030; </w:t>
       </w:r>
       <w:r>
         <w:rPr>
@@ -5487,7 +5476,7 @@
         <w:t xml:space="preserve">τ²</w:t>
       </w:r>
       <w:r>
-        <w:t xml:space="preserve"> = 0.050), which is not distinguishable from zero. Eight of the 19 repository-level slopes are positive. One, for vLLM, is significantly positive at the 5 percent level (a ratio of slope to standard error of about 2.2), which is about what chance alone would produce among 19 tests and does not survive a correction for multiple testing; the next largest ratio, for lm-evaluation-harness, is about 1.8 (Table 1). H2a is not supported in 18 of the 19 repositories.</w:t>
+        <w:t xml:space="preserve"> = 0.050), which is not distinguishable from zero. Eight of the 19 repository-level slopes are positive. One, for vLLM, is significantly positive at the 5 percent level (a ratio of slope to standard error of about 2.4), which is about what chance alone would produce among 19 tests and does not survive a correction for multiple testing; the next largest ratio, for lm-evaluation-harness, is about 1.8 (Table 1). H2a is not supported in 18 of the 19 repositories.</w:t>
       </w:r>
     </w:p>
     <w:p>
@@ -5495,18 +5484,7 @@
         <w:pStyle w:val="BodyText"/>
       </w:pPr>
       <w:r>
-        <w:t xml:space="preserve">Six repositories have a significantly negative slope, and four of them (anthropic-sdk-python, semantic-kernel, openai-python, and llama_index) are among the seven repositories with a median release cycle of one week, which also publish hot-fixes soon after a release. Excluding the seven weekly releasers gives a pooled slope of 0.042 (95% CI −0.081 to 0.164), which is close to zero and consistent with H2b. Repository-level slopes that condition on surviving the first week after a release are unstable, because several repositories have too few releases at later ages, and we report the pooled estimate for that restriction below. In the language of the price literature, hot-fixes resemble temporary sales. They are frequent, short-lived adjustments that dominate the raw hazard and obscure a regular cadence underneath (Nakamura and Steinsson 2008).</w:t>
-      </w:r>
-    </w:p>
-    <w:p>
-      <w:pPr>
-        <w:pStyle w:val="BodyText"/>
-      </w:pPr>
-      <w:r>
-        <w:rPr>
-          <w:highlight w:val="yellow"/>
-        </w:rPr>
-        <w:t xml:space="preserve">[REPLACE BEFORE SUBMISSION: the hot-fix shares, the regular-release hazard, the frailty model, and the coefficients of variation in the next three paragraphs come from code that is no longer available; regenerate them with section52.py and replace the numbers.]</w:t>
+        <w:t xml:space="preserve">Six repositories have a significantly negative slope, and four of them (anthropic-sdk-python, semantic-kernel, openai-python, and llama_index) are among the seven repositories with a median release cycle of one week, which also publish hot-fixes soon after a release. Excluding the seven weekly releasers gives a pooled slope of 0.040 (95% CI −0.081 to 0.162), which is close to zero and consistent with H2b. Repository-level slopes that condition on surviving the first week after a release are unstable, because several repositories have too few releases at later ages, and we report the pooled estimate for that restriction below. In the language of the price literature, hot-fixes resemble temporary sales. They are frequent, short-lived adjustments that dominate the raw hazard and obscure a regular cadence underneath (Nakamura and Steinsson 2008).</w:t>
       </w:r>
     </w:p>
     <w:p>
@@ -5521,7 +5499,132 @@
         <w:t xml:space="preserve">Separating hot-fixes.</w:t>
       </w:r>
       <w:r>
-        <w:t xml:space="preserve"> Of the 2,659 releases in the collected histories (2,456 of them within the weekly panels; the others precede the first panel week), 45 percent are classified as hot-fixes, from none in lm-evaluation-harness and FastChat to about three quarters in Ollama and llama_index. The hot-fix hazard is concentrated in the first week after a release: 40 percent of repository-weeks at an age of one week contain a hot-fix, against 5 to 8 percent at ages of two to seven weeks. Because the seven-day condition places hot-fixes close to the previous release by construction, this concentration is not evidence in itself. Classifying by version number alone, without the seven-day condition, 58 percent of the 2,659 releases raise only the patch component of the previous version, and 77 percent of those appear within seven days of the previous release (median three days). The share of releases that are patch-only by the version rule alone is 64 percent when the previous release is one week old and between 40 and 56 percent when it is five weeks old or more. When age is measured from the last regular release, the repository-level slopes of the regular-release hazard (18 repositories; FastChat has too few regular releases) pool to 0.096 (95% CI −0.006 to 0.198; </w:t>
+        <w:t xml:space="preserve"> Of the 2,659 releases in the collected histories (2,456 of them within the weekly panels; the others precede the first panel week), 43 percent are classified as hot-fixes, from none in lm-evaluation-harness and FastChat to about 70 percent in Ollama and llama_index. The hot-fix hazard is concentrated in the first week after a release: 36 percent of repository-weeks at an age of one week contain a hot-fix, against 5 to 8 percent at ages of two to seven weeks. Because the seven-day condition places hot-fixes close to the previous release by construction, this concentration is not evidence in itself. Classifying by version number alone, without the seven-day condition, 60 percent of the 2,659 releases raise only the patch component of the previous version, and 71 percent of those appear within seven days of the previous release (median one day). The share of releases that are patch-only by the version rule alone is 64 percent when the previous release is one week old and between 40 and 56 percent when it is five weeks old or more. When age is measured from the last regular release, the repository-level slopes of the regular-release hazard (19 repositories) pool to 0.073 (95% CI −0.021 to 0.166; τ² = 0.022). Three are significantly positive and one is significantly negative. In the pooled data, by contrast, the share of repository-weeks with a regular release falls from 0.39 at two weeks to 0.25 at seven weeks, because repositories that release often leave the sample at risk early. This is the dynamic selection described by Heckman and Singer (1984). Within repositories the regular hazard is flat to mildly rising, which is what a fixed cadence implies (Section 3.3).</w:t>
+      </w:r>
+    </w:p>
+    <w:p>
+      <w:pPr>
+        <w:pStyle w:val="BodyText"/>
+      </w:pPr>
+      <w:r>
+        <w:rPr>
+          <w:b/>
+          <w:bCs/>
+        </w:rPr>
+        <w:t xml:space="preserve">Frailty model.</w:t>
+      </w:r>
+      <w:r>
+        <w:t xml:space="preserve"> In the pooled logit with a repository-level random intercept, the slope on age is −0.119 per week for all releases (standard error 0.020; standard deviation of the intercept 0.96). It is −0.044 (0.023) when the seven weekly releasers are excluded and −0.099 (0.028) when only ages of two weeks or more are used. For regular releases measured from the last regular release the slope is 0.003 (0.020), and 0.046 (0.024) without the weekly releasers. Differences in baseline release frequency are therefore large, and hot-fixes, which reset the age of a release, account for much of the decline in the hazard of releases of any kind. A small decline remains that we do not attribute to a single cause.</w:t>
+      </w:r>
+    </w:p>
+    <w:p>
+      <w:pPr>
+        <w:pStyle w:val="BodyText"/>
+      </w:pPr>
+      <w:r>
+        <w:rPr>
+          <w:b/>
+          <w:bCs/>
+        </w:rPr>
+        <w:t xml:space="preserve">Release intervals.</w:t>
+      </w:r>
+      <w:r>
+        <w:t xml:space="preserve"> The coefficient of variation of the intervals between releases of any kind has a median of 1.03 across the 19 repositories, and 10 of them exceed one, which indicates bursts and gaps. For regular releases only, the median is 0.70 (range 0.33 to 1.76) and 14 of the 19 repositories are below one, so regular releases are spaced more evenly than a constant-hazard process would space them. The pattern of a mildly rising regular hazard and a CV below one is that of a Taylor-type cadence. It would also be produced by a rule that responds to accumulating work (Section 5.5), but not by one that responds to errors, because, as in Section 5.1, the error rate is flat.</w:t>
+      </w:r>
+    </w:p>
+    <w:p>
+      <w:pPr>
+        <w:pStyle w:val="BodyText"/>
+      </w:pPr>
+      <w:r>
+        <w:rPr>
+          <w:b/>
+          <w:bCs/>
+        </w:rPr>
+        <w:t xml:space="preserve">Documented release policies.</w:t>
+      </w:r>
+      <w:r>
+        <w:t xml:space="preserve"> None of the contributing guides or release documents we collected states a release calendar. Those of anthropic-sdk-python and openai-python describe an automated release pull-request pipeline that publishes to PyPI, which fits their weekly cadence and frequent hot-fixes. autogen and TRL document manual, maintainer-triggered procedures (a version-bump pull request followed by a tag in autogen; a release branch and a separate branch for patch releases in TRL) without a cadence. The remaining repositories document contribution rules but not how releases are made. Documented policy therefore gives little independent evidence on cadence, and we rely on the release histories.</w:t>
+      </w:r>
+    </w:p>
+    <w:p>
+      <w:pPr>
+        <w:pStyle w:val="BodyText"/>
+      </w:pPr>
+      <w:r>
+        <w:t xml:space="preserve">Taken together with Section 5.1, the evidence favors the second explanation in Section 3.3: there is no accumulating error state in these data to which a state-dependent rule could have responded, and release timing follows accumulated work, and perhaps the calendar, but not errors (Sections 5.3 to 5.5). We cannot exclude that maintainers would also be inattentive if such a state existed.</w:t>
+      </w:r>
+    </w:p>
+    <w:p>
+      <w:pPr>
+        <w:pStyle w:val="Heading3"/>
+      </w:pPr>
+      <w:r>
+        <w:t xml:space="preserve">5.3 RQ3: Releases respond to user activity, with no distinguishable extra response to bug reports</w:t>
+      </w:r>
+    </w:p>
+    <w:p>
+      <w:pPr>
+        <w:pStyle w:val="FirstParagraph"/>
+      </w:pPr>
+      <w:r>
+        <w:t xml:space="preserve">Releases respond to the volume of user issues. With non-bug issues held fixed, one standard deviation more bug reports (in logs) in the previous week raises the log-odds of a release by 0.261 (clustered standard error 0.095; p = 0.01; wild cluster bootstrap p = 0.01). The coefficient on non-bug issues in the same model is 0.220, close to that on bug reports, so releases follow the overall flow of user reports at least as much as they follow defects. The three-week average of bug reports gives 0.332 (0.108; wild cluster bootstrap p = 0.01), and the three lags entered separately give 0.184, 0.096, and 0.055.</w:t>
+      </w:r>
+    </w:p>
+    <w:p>
+      <w:pPr>
+        <w:pStyle w:val="FirstParagraph"/>
+      </w:pPr>
+      <w:r>
+        <w:t xml:space="preserve">Holding total issues fixed instead, the coefficient on bug reports is 0.191 (0.123; p = 0.12; wild cluster bootstrap p = 0.18), and the three-week average gives 0.272 (0.123; p = 0.03; wild cluster bootstrap p = 0.06). The positive sign leaves room for some response to bug reports beyond overall volume, but it is not significant at the 5 percent level under the wild cluster bootstrap for either measure. An approximate 95 percent interval for the one-week coefficient runs from −0.05 to 0.43 in log-odds, which is compatible with no extra response and with an increase in the odds of a release of up to about 54 percent per standard deviation.</w:t>
+      </w:r>
+    </w:p>
+    <w:p>
+      <w:pPr>
+        <w:pStyle w:val="FirstParagraph"/>
+      </w:pPr>
+      <w:r>
+        <w:t xml:space="preserve">Hot-fixes do not appear to account for these patterns. Dropping the week right after a release, where hot-fixes follow the burst of issues that the release provokes, gives 0.251 (0.092; wild cluster bootstrap p = 0.02) for the one-week lag and 0.318 (0.098; wild cluster bootstrap p = 0.02) for the three-week average with non-bug issues held fixed, and 0.143 (0.129; wild cluster bootstrap p = 0.32) and 0.218 (0.120; wild cluster bootstrap p = 0.10) with total issues held fixed. H4 is therefore partly supported: release timing responds to user activity, of which bug reports are a component, but we cannot show that it responds to bug reports as such. The test is more demanding than the age profile, because it asks whether an observable state moves releases, which state dependence requires, and only part of that state is a sign of degradation.</w:t>
+      </w:r>
+    </w:p>
+    <w:p>
+      <w:pPr>
+        <w:pStyle w:val="Heading3"/>
+      </w:pPr>
+      <w:r>
+        <w:t xml:space="preserve">5.4 RQ3: No detectable release response to upstream model launches</w:t>
+      </w:r>
+    </w:p>
+    <w:p>
+      <w:pPr>
+        <w:pStyle w:val="FirstParagraph"/>
+      </w:pPr>
+      <w:r>
+        <w:t xml:space="preserve">Across all 38 launches, the probability that a repository exposed to a launch releases in weeks 0 to 4 differs from that of unexposed repositories by −0.002 (standard error 0.018; wild cluster bootstrap p = 0.93), against a pre-launch weekly release rate of 0.42 in treated blocks. The 95 percent interval of −0.037 to 0.033 rules out effects larger than about 3.5 percentage points. For open-weights launches the estimate is 0.009 (0.019; p = 0.63) and for API launches it is −0.027 (0.030; p = 0.36). The estimates for regular releases are similar (−0.017 for all launches; p = 0.49). In weeks 5 to 8 the estimates are −0.011 (0.024), 0.004 (0.025), and −0.050 (0.025) for all, open-weights, and API launches. The event-time coefficients show no spike after a launch: the coefficient in week 0 is 0.057 (0.045), and those in weeks 1 to 4 lie between −0.095 and 0.009. The pre-launch coefficients are not individually significant, but the joint Wald tests are 6.25 (p = 0.10) for all launches and 7.00 (p = 0.07) for open-weights launches, so we cannot rule out differing pre-trends and we do not interpret the later-week estimate for API launches.</w:t>
+      </w:r>
+    </w:p>
+    <w:p>
+      <w:pPr>
+        <w:pStyle w:val="FirstParagraph"/>
+      </w:pPr>
+      <w:r>
+        <w:t xml:space="preserve">Release notes do mention new models. In exposed repositories, 143 of 334 repository-launch pairs (42.8 percent) have at least one release within eight weeks after the launch that mentions the launched model; the median delay is 10 days (interquartile range 1 to 24); and 287 of 1,901 releases after launch mention it, against 26 of 1,871 releases before. The match is by keyword and we have not validated it by hand, so some matches may be false positives. If most are correct, the pattern is consistent with the content of releases responding to a launch while their timing does not: support for a new model is shipped in releases that would probably have appeared anyway. H4 is not supported by the upstream signal either.</w:t>
+      </w:r>
+    </w:p>
+    <w:p>
+      <w:pPr>
+        <w:pStyle w:val="Heading3"/>
+      </w:pPr>
+      <w:r>
+        <w:t xml:space="preserve">5.5 RQ4: The release hazard tends to rise with accumulated work</w:t>
+      </w:r>
+    </w:p>
+    <w:p>
+      <w:pPr>
+        <w:pStyle w:val="FirstParagraph"/>
+      </w:pPr>
+      <w:r>
+        <w:t xml:space="preserve">For the hazard of a regular release, the pooled coefficient on calendar age alone (weeks since the last regular release) is 0.173 (95% CI 0.079 to 0.267; </w:t>
       </w:r>
       <w:r>
         <w:rPr>
@@ -5531,7 +5634,53 @@
         <w:t xml:space="preserve">τ²</w:t>
       </w:r>
       <w:r>
-        <w:t xml:space="preserve"> = 0.030). Five are significantly positive (diffusers, peft, Transformers, Ollama, and vLLM) and one is significantly negative. In the pooled data, by contrast, the share of repository-weeks with a regular release falls from 0.37 at two weeks to 0.26 at seven weeks, because repositories that release often leave the sample at risk early. This is the dynamic selection described by Heckman and Singer (1984). Within repositories the regular hazard is flat to mildly rising, which is what a fixed cadence implies (Section 3.3).</w:t>
+        <w:t xml:space="preserve"> = 0.020), and on work age alone it is 0.223 (0.132 to 0.314; </w:t>
+      </w:r>
+      <w:r>
+        <w:rPr>
+          <w:i/>
+          <w:iCs/>
+        </w:rPr>
+        <w:t xml:space="preserve">τ²</w:t>
+      </w:r>
+      <w:r>
+        <w:t xml:space="preserve"> = 0.017). When both are included, work age has a pooled coefficient of 0.182 (0.029 to 0.335; </w:t>
+      </w:r>
+      <w:r>
+        <w:rPr>
+          <w:i/>
+          <w:iCs/>
+        </w:rPr>
+        <w:t xml:space="preserve">τ²</w:t>
+      </w:r>
+      <w:r>
+        <w:t xml:space="preserve"> = 0.040) and calendar age has 0.065 (−0.089 to 0.219; </w:t>
+      </w:r>
+      <w:r>
+        <w:rPr>
+          <w:i/>
+          <w:iCs/>
+        </w:rPr>
+        <w:t xml:space="preserve">τ²</w:t>
+      </w:r>
+      <w:r>
+        <w:t xml:space="preserve"> = 0.051). Three repositories have a significantly positive coefficient on work age and three on calendar age in the joint specification, and none is significantly negative. The median within-repository correlation between the two ages is 0.74, and the median coefficient of variation of weekly merged pull requests is 0.83, so the data separate the two only in part. In a linear probability model with repository fixed effects, the coefficient on work age is 0.029 (cluster standard error 0.013; wild cluster bootstrap p = 0.087) and on calendar age it is −0.018 (0.011; p = 0.18).</w:t>
+      </w:r>
+    </w:p>
+    <w:p>
+      <w:pPr>
+        <w:pStyle w:val="FirstParagraph"/>
+      </w:pPr>
+      <w:r>
+        <w:t xml:space="preserve">We read these results as suggesting that the release hazard follows accumulated work more than calendar time, but not as conclusive. The pooled random-effects estimate excludes zero for work age and not for calendar age, which is the pattern H5 predicts and a fixed cadence does not, while the wild cluster bootstrap p-value for work age does not reach 5 percent and the two ages move together. H5 is partly supported.</w:t>
+      </w:r>
+    </w:p>
+    <w:p>
+      <w:pPr>
+        <w:pStyle w:val="Heading3"/>
+      </w:pPr>
+      <w:r>
+        <w:t xml:space="preserve">5.6 Additional analyses: release content, equivalence, and heterogeneity</w:t>
       </w:r>
     </w:p>
     <w:p>
@@ -5543,10 +5692,10 @@
           <w:b/>
           <w:bCs/>
         </w:rPr>
-        <w:t xml:space="preserve">Frailty model.</w:t>
-      </w:r>
-      <w:r>
-        <w:t xml:space="preserve"> In the pooled logit with a repository-level random intercept, the slope on age is −0.117 per week for all releases (standard error 0.027; standard deviation of the intercept 1.10). It is −0.045 (0.018) when the seven weekly releasers are excluded and −0.099 (0.017) when only ages of two weeks or more are used. For regular releases measured from the last regular release the slope is 0.017 (0.015), and 0.059 (0.024) without the weekly releasers. Differences in baseline release frequency are therefore large, and hot-fixes, which reset the age of a release, account for much of the decline in the hazard of releases of any kind. A small decline remains that we do not attribute to a single cause.</w:t>
+        <w:t xml:space="preserve">Release content. </w:t>
+      </w:r>
+      <w:r>
+        <w:t xml:space="preserve">We keep 1,405 releases from all 19 repositories that have at least three itemised entries; on average 32 percent of the entries are fixes. The share of fix entries is, if anything, lower after weeks with more bug reports. One standard deviation more bug reports in the preceding four weeks changes the share by −0.021 (clustered standard error 0.008; p = 0.01; wild cluster bootstrap p = 0.07), controlling for non-bug issues, the time since the previous release, a trend, and repository fixed effects. The sign is opposite to the one a content response would imply, and the wild cluster bootstrap p-value does not reach 5 percent, so we find no evidence that the content of releases responds to bug reports either. A hand check of 12 randomly drawn entries found the three flagged as fixes to be fixes and the nine others to be other changes; this small check says nothing about the recall of the classifier, and the result should be read as exploratory.</w:t>
       </w:r>
     </w:p>
     <w:p>
@@ -5558,10 +5707,10 @@
           <w:b/>
           <w:bCs/>
         </w:rPr>
-        <w:t xml:space="preserve">Release intervals.</w:t>
-      </w:r>
-      <w:r>
-        <w:t xml:space="preserve"> The coefficient of variation of the intervals between releases of any kind has a median of 1.05 across the 19 repositories, and 11 of them exceed one, which indicates bursts and gaps. For regular releases only, the median is 0.77 (range 0.33 to 1.72) and 14 of the 19 repositories are below one, so regular releases are spaced more evenly than a constant-hazard process would space them. The pattern of a mildly rising regular hazard and a CV below one is that of a Taylor-type cadence. It would also be produced by a rule that responds to accumulating work (Section 5.5), but not by one that responds to errors, because, as in Section 5.1, the error rate is flat.</w:t>
+        <w:t xml:space="preserve">Equivalence. </w:t>
+      </w:r>
+      <w:r>
+        <w:t xml:space="preserve">For the age slope of bug reports under specification (b), the pooled estimate (−0.003, SE 0.006) is statistically equivalent to zero within ±0.02 log points per week (TOST p = 0.004). Equivalence would hold for any bound above 0.013, and the minimum effect detectable with 80 percent power is 0.018. Under specification (d) equivalence at that bound is not established (estimate 0.017, SE 0.010; TOST p = 0.40; equivalence for any bound above 0.035; minimum detectable effect 0.029). For the launch event study the estimate (−0.002, SE 0.018) is equivalent to zero within ±5 percentage points (TOST p = 0.004; smallest bound 0.032; minimum detectable effect 0.050). For the one-week response to bug reports, equivalence within ±0.25 log-odds per standard deviation is not established, with total issues held fixed (estimate 0.191, SE 0.123; TOST p = 0.32; smallest bound 0.39) or with non-bug issues held fixed (0.261, SE 0.095; TOST p = 0.55; smallest bound 0.42), as expected when the estimates are themselves positive. The bounds are anchored to the data, which is why the smallest bound for equivalence is reported as well.</w:t>
       </w:r>
     </w:p>
     <w:p>
@@ -5573,200 +5722,10 @@
           <w:b/>
           <w:bCs/>
         </w:rPr>
-        <w:t xml:space="preserve">Documented release policies.</w:t>
-      </w:r>
-      <w:r>
-        <w:t xml:space="preserve"> None of the contributing guides or release documents we collected states a release calendar. Those of anthropic-sdk-python and openai-python describe an automated release pull-request pipeline that publishes to PyPI, which fits their weekly cadence and frequent hot-fixes. autogen and TRL document manual, maintainer-triggered procedures (a version-bump pull request followed by a tag in autogen; a release branch and a separate branch for patch releases in TRL) without a cadence. The remaining repositories document contribution rules but not how releases are made. Documented policy therefore gives little independent evidence on cadence, and we rely on the release histories.</w:t>
-      </w:r>
-    </w:p>
-    <w:p>
-      <w:pPr>
-        <w:pStyle w:val="BodyText"/>
-      </w:pPr>
-      <w:r>
-        <w:t xml:space="preserve">Taken together with Section 5.1, the evidence favors the second explanation in Section 3.3: there is no accumulating error state in these data to which a state-dependent rule could have responded, and release timing follows accumulated work, and perhaps the calendar, but not errors (Sections 5.3 to 5.5). We cannot exclude that maintainers would also be inattentive if such a state existed.</w:t>
-      </w:r>
-    </w:p>
-    <w:p>
-      <w:pPr>
-        <w:pStyle w:val="Heading3"/>
-      </w:pPr>
-      <w:r>
-        <w:t xml:space="preserve">5.3 RQ3: Releases respond to user activity, with no distinguishable extra response to bug reports</w:t>
-      </w:r>
-    </w:p>
-    <w:p>
-      <w:pPr>
-        <w:pStyle w:val="FirstParagraph"/>
-      </w:pPr>
-      <w:r>
-        <w:t xml:space="preserve">Releases respond to the volume of user issues. With non-bug issues held fixed, one standard deviation more bug reports (in logs) in the previous week raises the log-odds of a release by 0.261 (clustered standard error 0.095; p = 0.01; wild cluster bootstrap p = 0.01). The coefficient on non-bug issues in the same model is 0.220, close to that on bug reports, so releases follow the overall flow of user reports at least as much as they follow defects. The three-week average of bug reports gives 0.332 (0.108; wild cluster bootstrap p = 0.01), and the three lags entered separately give 0.184, 0.096, and 0.055.</w:t>
-      </w:r>
-    </w:p>
-    <w:p>
-      <w:pPr>
-        <w:pStyle w:val="FirstParagraph"/>
-      </w:pPr>
-      <w:r>
-        <w:t xml:space="preserve">Holding total issues fixed instead, the coefficient on bug reports is 0.191 (0.123; p = 0.12; wild cluster bootstrap p = 0.20), and the three-week average gives 0.272 (0.123; p = 0.03; wild cluster bootstrap p = 0.10). The positive sign leaves room for some response to bug reports beyond overall volume, but it is not significant under the wild cluster bootstrap. An approximate 95 percent interval for the one-week coefficient runs from −0.05 to 0.43 in log-odds, which is compatible with no extra response and with an increase in the odds of a release of up to about 54 percent per standard deviation.</w:t>
-      </w:r>
-    </w:p>
-    <w:p>
-      <w:pPr>
-        <w:pStyle w:val="FirstParagraph"/>
-      </w:pPr>
-      <w:r>
-        <w:t xml:space="preserve">Hot-fixes do not appear to account for these patterns. Dropping the week right after a release, where hot-fixes follow the burst of issues that the release provokes, gives 0.251 (0.092; wild cluster bootstrap p = 0.03) for the one-week lag and 0.318 (0.098; wild cluster bootstrap p = 0.01) for the three-week average with non-bug issues held fixed, and 0.143 (0.129; wild cluster bootstrap p = 0.27) and 0.218 (0.120; wild cluster bootstrap p = 0.12) with total issues held fixed. H4 is therefore partly supported: release timing responds to user activity, of which bug reports are a component, but we cannot show that it responds to bug reports as such. The test is more demanding than the age profile, because it asks whether an observable state moves releases, which state dependence requires, and only part of that state is a sign of degradation.</w:t>
-      </w:r>
-    </w:p>
-    <w:p>
-      <w:pPr>
-        <w:pStyle w:val="Heading3"/>
-      </w:pPr>
-      <w:r>
-        <w:t xml:space="preserve">5.4 RQ3: No detectable release response to upstream model launches</w:t>
-      </w:r>
-    </w:p>
-    <w:p>
-      <w:pPr>
-        <w:pStyle w:val="FirstParagraph"/>
-      </w:pPr>
-      <w:r>
-        <w:t xml:space="preserve">Across all 38 launches, the probability that a repository exposed to a launch releases in weeks 0 to 4 differs from that of unexposed repositories by −0.002 (standard error 0.018; wild cluster bootstrap p = 0.93), against a pre-launch weekly release rate of 0.42 in treated blocks. The 95 percent interval of −0.037 to 0.033 rules out effects larger than about 3.5 percentage points. For open-weights launches the estimate is 0.009 (0.019; p = 0.63) and for API launches it is −0.027 (0.030; p = 0.36). The estimates for regular releases are similar (−0.017 for all launches; p = 0.49). In weeks 5 to 8 the estimates are −0.011 (0.024), 0.004 (0.025), and −0.050 (0.025) for all, open-weights, and API launches. The event-time coefficients show no spike after a launch: the coefficient in week 0 is 0.057 (0.045), and those in weeks 1 to 4 lie between −0.095 and 0.009. The pre-launch coefficients are not individually significant, but the joint Wald tests are 6.25 (p = 0.10) for all launches and 7.00 (p = 0.07) for open-weights launches, so we cannot rule out differing pre-trends and we do not interpret the later-week estimate for API launches.</w:t>
-      </w:r>
-    </w:p>
-    <w:p>
-      <w:pPr>
-        <w:pStyle w:val="FirstParagraph"/>
-      </w:pPr>
-      <w:r>
-        <w:t xml:space="preserve">Release notes do mention new models. In exposed repositories, 143 of 334 repository-launch pairs (42.8 percent) have at least one release within eight weeks after the launch that mentions the launched model; the median delay is 10 days (interquartile range 1 to 24); and 287 of 1,901 releases after launch mention it, against 26 of 1,871 releases before. The match is by keyword and we have not validated it by hand, so some matches may be false positives. If most are correct, the pattern is consistent with the content of releases responding to a launch while their timing does not: support for a new model is shipped in releases that would probably have appeared anyway. H4 is not supported by the upstream signal either.</w:t>
-      </w:r>
-    </w:p>
-    <w:p>
-      <w:pPr>
-        <w:pStyle w:val="Heading3"/>
-      </w:pPr>
-      <w:r>
-        <w:t xml:space="preserve">5.5 RQ4: The release hazard tends to rise with accumulated work</w:t>
-      </w:r>
-    </w:p>
-    <w:p>
-      <w:pPr>
-        <w:pStyle w:val="FirstParagraph"/>
-      </w:pPr>
-      <w:r>
-        <w:t xml:space="preserve">For the hazard of a regular release, the pooled coefficient on calendar age alone (weeks since the last regular release) is 0.173 (95% CI 0.079 to 0.267; </w:t>
-      </w:r>
-      <w:r>
-        <w:rPr>
-          <w:i/>
-          <w:iCs/>
-        </w:rPr>
-        <w:t xml:space="preserve">τ²</w:t>
-      </w:r>
-      <w:r>
-        <w:t xml:space="preserve"> = 0.020), and on work age alone it is 0.223 (0.132 to 0.314; </w:t>
-      </w:r>
-      <w:r>
-        <w:rPr>
-          <w:i/>
-          <w:iCs/>
-        </w:rPr>
-        <w:t xml:space="preserve">τ²</w:t>
-      </w:r>
-      <w:r>
-        <w:t xml:space="preserve"> = 0.017). When both are included, work age has a pooled coefficient of 0.182 (0.029 to 0.335; </w:t>
-      </w:r>
-      <w:r>
-        <w:rPr>
-          <w:i/>
-          <w:iCs/>
-        </w:rPr>
-        <w:t xml:space="preserve">τ²</w:t>
-      </w:r>
-      <w:r>
-        <w:t xml:space="preserve"> = 0.040) and calendar age has 0.065 (−0.089 to 0.219; </w:t>
-      </w:r>
-      <w:r>
-        <w:rPr>
-          <w:i/>
-          <w:iCs/>
-        </w:rPr>
-        <w:t xml:space="preserve">τ²</w:t>
-      </w:r>
-      <w:r>
-        <w:t xml:space="preserve"> = 0.051). Three repositories have a significantly positive coefficient on work age and three on calendar age in the joint specification, and none is significantly negative. The median within-repository correlation between the two ages is 0.74, and the median coefficient of variation of weekly merged pull requests is 0.83, so the data separate the two only in part. In a linear probability model with repository fixed effects, the coefficient on work age is 0.029 (cluster standard error 0.013; wild cluster bootstrap p = 0.087) and on calendar age it is −0.018 (0.011; p = 0.18).</w:t>
-      </w:r>
-    </w:p>
-    <w:p>
-      <w:pPr>
-        <w:pStyle w:val="FirstParagraph"/>
-      </w:pPr>
-      <w:r>
-        <w:t xml:space="preserve">We read these results as suggesting that the release hazard follows accumulated work more than calendar time, but not as conclusive. The pooled random-effects estimate excludes zero for work age and not for calendar age, which is the pattern H5 predicts and a fixed cadence does not, while the wild cluster bootstrap p-value for work age does not reach 5 percent and the two ages move together. H5 is partly supported.</w:t>
-      </w:r>
-    </w:p>
-    <w:p>
-      <w:pPr>
-        <w:pStyle w:val="Heading3"/>
-      </w:pPr>
-      <w:r>
-        <w:t xml:space="preserve">5.6 Additional analyses: release content, equivalence, and heterogeneity</w:t>
-      </w:r>
-    </w:p>
-    <w:p>
-      <w:pPr>
-        <w:pStyle w:val="BodyText"/>
-      </w:pPr>
-      <w:r>
-        <w:rPr>
-          <w:b/>
-          <w:bCs/>
-        </w:rPr>
-        <w:t xml:space="preserve">Release content. </w:t>
-      </w:r>
-      <w:r>
-        <w:rPr>
-          <w:highlight w:val="yellow"/>
-        </w:rPr>
-        <w:t xml:space="preserve">[TO BE REPORTED BEFORE SUBMISSION: number of releases and repositories with itemised notes; coefficient of the fix share on bug reports in the preceding four weeks with standard error, cluster-robust p and wild cluster bootstrap p; result of the hand check of 12 randomly drawn items.]</w:t>
-      </w:r>
-      <w:r>
-        <w:t xml:space="preserve"> If the coefficient is positive, the content of releases responds to bug reports while their timing does not, which is the pattern of a maintainer who ships fixes when they are ready, rather than one who schedules releases around degradation. If it is zero, neither timing nor content responds.</w:t>
-      </w:r>
-    </w:p>
-    <w:p>
-      <w:pPr>
-        <w:pStyle w:val="BodyText"/>
-      </w:pPr>
-      <w:r>
-        <w:rPr>
-          <w:b/>
-          <w:bCs/>
-        </w:rPr>
-        <w:t xml:space="preserve">Equivalence. </w:t>
-      </w:r>
-      <w:r>
-        <w:t xml:space="preserve">For the age slope of bug reports under specification (b), the estimate (−0.002, SE 0.006) is statistically equivalent to zero within ±0.02 log points per week (TOST p = 0.002). Equivalence would hold for any bound above 0.012, and the minimum effect detectable with 80 percent power is 0.017. Under specification (d) equivalence at that bound is not established (estimate 0.017, SE 0.010; TOST p = 0.39; equivalence for any bound above 0.033; minimum detectable effect 0.027). For the launch event study the estimate (−0.002, SE 0.018) is equivalent to zero within ±5 percentage points (TOST p = 0.004; smallest bound 0.032; minimum detectable effect 0.050). For the response to bug reports, equivalence within ±0.25 log-odds per standard deviation is not established, with non-bug issues held fixed (estimate 0.254, SE 0.096; TOST p = 0.52) or with total issues held fixed (0.189, SE 0.122; TOST p = 0.31), as expected when the estimates are themselves positive. The bounds are anchored to the data, which is why the smallest bound for equivalence is reported as well.</w:t>
-      </w:r>
-    </w:p>
-    <w:p>
-      <w:pPr>
-        <w:pStyle w:val="BodyText"/>
-      </w:pPr>
-      <w:r>
-        <w:rPr>
-          <w:b/>
-          <w:bCs/>
-        </w:rPr>
         <w:t xml:space="preserve">Heterogeneity. </w:t>
       </w:r>
       <w:r>
-        <w:t xml:space="preserve">Excluding the two repositories with automated release pipelines (anthropic-sdk-python and openai-python) leaves the conclusions unchanged. The pooled age slope is −0.003 under specification (b) (95% CI −0.016 to 0.011) and +0.016 under (d) (−0.006 to 0.038), and the coefficient on bug reports with non-bug issues held fixed rises to 0.304 (SE 0.093). The thirteen slower releasers give −0.001 under (b) (−0.010 to 0.009), +0.014 under (d) (−0.003 to 0.031), and 0.211 (SE 0.082) for the response to bug reports. For the six weekly releasers the (b) estimate is imprecise (−0.033; −0.105 to 0.039), and the (d) estimate (0.255; 0.089 to 0.421) rests on few observations beyond the third week after a release and is not reliable. Within categories of three repositories the estimates are too imprecise to interpret; agent frameworks show a response to bug reports of 0.709 (SE 0.134) and inference engines an age slope under (d) of 0.044 (0.000 to 0.088), which we treat as exploratory.</w:t>
-      </w:r>
-      <w:r>
-        <w:t xml:space="preserve"/>
+        <w:t xml:space="preserve">Excluding the two repositories with automated release pipelines (anthropic-sdk-python and openai-python) leaves the conclusions unchanged. The pooled age slope is −0.003 under specification (b) (95% CI −0.015 to 0.010) and +0.019 under (d) (−0.007 to 0.044), and the coefficient on bug reports with non-bug issues held fixed rises to 0.304 (SE 0.093). The thirteen slower releasers give 0.000 under (b) (−0.009 to 0.009), +0.015 under (d) (−0.006 to 0.034), and 0.211 (SE 0.082) for the response to bug reports. For the six weekly releasers the (b) estimate is imprecise (−0.033; −0.104 to 0.038), and the (d) estimate (0.248; 0.077 to 0.418) rests on few observations beyond the third week after a release and is not reliable. Within categories of three repositories the estimates are too imprecise to interpret; agent frameworks show a response to bug reports of 0.709 (SE 0.134) and inference engines an age slope under (d) of 0.045 (0.002 to 0.087), which we treat as exploratory.</w:t>
       </w:r>
     </w:p>
     <w:p>

</xml_diff>